<commit_message>
Actualizar Especificacion Tecnica: antecedentes normativos y cimentacion
Agrega seccion 00 (antecedentes normativos y de emplazamiento: regimen
rural, exigencia termica/estructural/incendio, instalaciones,
impermeabilizacion) y seccion 06 (cimentacion: 16 zapatas aisladas HA).
Incluye tabla de transmitancia termica NCh1079 / Art. 4.1.10 OGUC con
zona termica D (comuna de Talca) destacada, encabezado con metadatos
del proyecto y bloque de firma final.

Co-Authored-By: Claude Sonnet 5 <noreply@anthropic.com>
</commit_message>
<xml_diff>
--- a/03_Documentos_Tecnicos/Especificacion_Tecnica_Pausa_Maule.docx
+++ b/03_Documentos_Tecnicos/Especificacion_Tecnica_Pausa_Maule.docx
@@ -1,5 +1,27 @@
 
-<file path=word/document.xml><?xml version="1.0" encoding="utf-8"?>
+<file path=docProps\app.xml><?xml version="1.0" encoding="utf-8"?>
+<Properties xmlns="http://schemas.openxmlformats.org/officeDocument/2006/extended-properties" xmlns:vt="http://schemas.openxmlformats.org/officeDocument/2006/docPropsVTypes"/>
+</file>
+
+<file path=docProps\core.xml><?xml version="1.0" encoding="utf-8"?>
+<cp:coreProperties xmlns:cp="http://schemas.openxmlformats.org/package/2006/metadata/core-properties" xmlns:dc="http://purl.org/dc/elements/1.1/" xmlns:dcterms="http://purl.org/dc/terms/" xmlns:dcmitype="http://purl.org/dc/dcmitype/" xmlns:xsi="http://www.w3.org/2001/XMLSchema-instance">
+  <dc:creator>Un-named</dc:creator>
+  <cp:lastModifiedBy>Un-named</cp:lastModifiedBy>
+  <cp:revision>1</cp:revision>
+  <dcterms:created xsi:type="dcterms:W3CDTF">2026-09-08T00:17:41.251Z</dcterms:created>
+  <dcterms:modified xsi:type="dcterms:W3CDTF">2026-09-08T00:17:41.257Z</dcterms:modified>
+</cp:coreProperties>
+</file>
+
+<file path=docProps\custom.xml><?xml version="1.0" encoding="utf-8"?>
+<Properties xmlns="http://schemas.openxmlformats.org/officeDocument/2006/custom-properties" xmlns:vt="http://schemas.openxmlformats.org/officeDocument/2006/docPropsVTypes"/>
+</file>
+
+<file path=word\comments.xml><?xml version="1.0" encoding="utf-8"?>
+<w:comments xmlns:cx="http://schemas.microsoft.com/office/drawing/2014/chartex" xmlns:cx1="http://schemas.microsoft.com/office/drawing/2015/9/8/chartex" xmlns:cx2="http://schemas.microsoft.com/office/drawing/2015/10/21/chartex" xmlns:cx3="http://schemas.microsoft.com/office/drawing/2016/5/9/chartex" xmlns:cx4="http://schemas.microsoft.com/office/drawing/2016/5/10/chartex" xmlns:cx5="http://schemas.microsoft.com/office/drawing/2016/5/11/chartex" xmlns:cx6="http://schemas.microsoft.com/office/drawing/2016/5/12/chartex" xmlns:cx7="http://schemas.microsoft.com/office/drawing/2016/5/13/chartex" xmlns:cx8="http://schemas.microsoft.com/office/drawing/2016/5/14/chartex" xmlns:mc="http://schemas.openxmlformats.org/markup-compatibility/2006" xmlns:aink="http://schemas.microsoft.com/office/drawing/2016/ink" xmlns:am3d="http://schemas.microsoft.com/office/drawing/2017/model3d" xmlns:o="urn:schemas-microsoft-com:office:office" xmlns:r="http://schemas.openxmlformats.org/officeDocument/2006/relationships" xmlns:m="http://schemas.openxmlformats.org/officeDocument/2006/math" xmlns:v="urn:schemas-microsoft-com:vml" xmlns:wp14="http://schemas.microsoft.com/office/word/2010/wordprocessingDrawing" xmlns:wp="http://schemas.openxmlformats.org/drawingml/2006/wordprocessingDrawing" xmlns:w10="urn:schemas-microsoft-com:office:word" xmlns:w="http://schemas.openxmlformats.org/wordprocessingml/2006/main" xmlns:w14="http://schemas.microsoft.com/office/word/2010/wordml" xmlns:w15="http://schemas.microsoft.com/office/word/2012/wordml" xmlns:w16cex="http://schemas.microsoft.com/office/word/2018/wordml/cex" xmlns:w16cid="http://schemas.microsoft.com/office/word/2016/wordml/cid" xmlns:w16="http://schemas.microsoft.com/office/word/2018/wordml" xmlns:w16sdtdh="http://schemas.microsoft.com/office/word/2020/wordml/sdtdatahash" xmlns:w16se="http://schemas.microsoft.com/office/word/2015/wordml/symex" xmlns:wpg="http://schemas.microsoft.com/office/word/2010/wordprocessingGroup" xmlns:wpi="http://schemas.microsoft.com/office/word/2010/wordprocessingInk" xmlns:wne="http://schemas.microsoft.com/office/word/2006/wordml" xmlns:wps="http://schemas.microsoft.com/office/word/2010/wordprocessingShape"/>
+</file>
+
+<file path=word\document.xml><?xml version="1.0" encoding="utf-8"?>
 <w:document xmlns:wpc="http://schemas.microsoft.com/office/word/2010/wordprocessingCanvas" xmlns:mc="http://schemas.openxmlformats.org/markup-compatibility/2006" xmlns:o="urn:schemas-microsoft-com:office:office" xmlns:r="http://schemas.openxmlformats.org/officeDocument/2006/relationships" xmlns:m="http://schemas.openxmlformats.org/officeDocument/2006/math" xmlns:v="urn:schemas-microsoft-com:vml" xmlns:wp14="http://schemas.microsoft.com/office/word/2010/wordprocessingDrawing" xmlns:wp="http://schemas.openxmlformats.org/drawingml/2006/wordprocessingDrawing" xmlns:w10="urn:schemas-microsoft-com:office:word" xmlns:w="http://schemas.openxmlformats.org/wordprocessingml/2006/main" xmlns:w14="http://schemas.microsoft.com/office/word/2010/wordml" xmlns:w15="http://schemas.microsoft.com/office/word/2012/wordml" xmlns:wpg="http://schemas.microsoft.com/office/word/2010/wordprocessingGroup" xmlns:wpi="http://schemas.microsoft.com/office/word/2010/wordprocessingInk" xmlns:wne="http://schemas.microsoft.com/office/word/2006/wordml" xmlns:wps="http://schemas.microsoft.com/office/word/2010/wordprocessingShape" xmlns:cx="http://schemas.microsoft.com/office/drawing/2014/chartex" xmlns:cx1="http://schemas.microsoft.com/office/drawing/2015/9/8/chartex" xmlns:cx2="http://schemas.microsoft.com/office/drawing/2015/10/21/chartex" xmlns:cx3="http://schemas.microsoft.com/office/drawing/2016/5/9/chartex" xmlns:cx4="http://schemas.microsoft.com/office/drawing/2016/5/10/chartex" xmlns:cx5="http://schemas.microsoft.com/office/drawing/2016/5/11/chartex" xmlns:cx6="http://schemas.microsoft.com/office/drawing/2016/5/12/chartex" xmlns:cx7="http://schemas.microsoft.com/office/drawing/2016/5/13/chartex" xmlns:cx8="http://schemas.microsoft.com/office/drawing/2016/5/14/chartex" xmlns:aink="http://schemas.microsoft.com/office/drawing/2016/ink" xmlns:am3d="http://schemas.microsoft.com/office/drawing/2017/model3d" xmlns:w16cex="http://schemas.microsoft.com/office/word/2018/wordml/cex" xmlns:w16cid="http://schemas.microsoft.com/office/word/2016/wordml/cid" xmlns:w16="http://schemas.microsoft.com/office/word/2018/wordml" xmlns:w16sdtdh="http://schemas.microsoft.com/office/word/2020/wordml/sdtdatahash" xmlns:w16se="http://schemas.microsoft.com/office/word/2015/wordml/symex" mc:Ignorable="w14 w15 wp14">
   <w:body>
     <w:p>
@@ -32,6 +54,30 @@
           <w:szCs w:val="22"/>
         </w:rPr>
         <w:t xml:space="preserve">PAUSA MAULE · Habitáculo ciclista · NDI 2 · Anteproyecto</w:t>
+      </w:r>
+    </w:p>
+    <w:p>
+      <w:pPr>
+        <w:spacing w:after="200"/>
+      </w:pPr>
+      <w:r>
+        <w:rPr>
+          <w:rFonts w:ascii="Arial" w:cs="Arial" w:eastAsia="Arial" w:hAnsi="Arial"/>
+          <w:b w:val="false"/>
+          <w:bCs w:val="false"/>
+          <w:i w:val="false"/>
+          <w:iCs w:val="false"/>
+          <w:color w:val="4A4A4A"/>
+          <w:sz w:val="16"/>
+          <w:szCs w:val="16"/>
+        </w:rPr>
+        <w:t xml:space="preserve">Proyecto: Pausa Maule — Habitáculo modular de descanso para ciclistas</w:t>
+        <w:br/>
+        <w:t xml:space="preserve">Ubicación: Corredor vitivinícola, Región del Maule (ref. comuna de Talca — coordenadas -35,44896 / -71,79322)</w:t>
+        <w:br/>
+        <w:t xml:space="preserve">Responsable BIM / elaboración: Matías Álvarez C.</w:t>
+        <w:br/>
+        <w:t xml:space="preserve">Contexto: Workshop BIM + IA, Método TBC — ejercicio académico de anteproyecto, no corresponde a un expediente de permiso de edificación tramitado.</w:t>
       </w:r>
     </w:p>
     <w:p>
@@ -85,6 +131,3250 @@
           <w:rFonts w:ascii="Arial" w:cs="Arial" w:eastAsia="Arial" w:hAnsi="Arial"/>
           <w:b/>
           <w:bCs/>
+          <w:i w:val="false"/>
+          <w:iCs w:val="false"/>
+          <w:color w:val="171717"/>
+          <w:sz w:val="24"/>
+          <w:szCs w:val="24"/>
+        </w:rPr>
+        <w:t xml:space="preserve">00 · Antecedentes normativos y de emplazamiento</w:t>
+      </w:r>
+    </w:p>
+    <w:p>
+      <w:pPr>
+        <w:spacing w:after="160"/>
+      </w:pPr>
+      <w:r>
+        <w:rPr>
+          <w:rFonts w:ascii="Arial" w:cs="Arial" w:eastAsia="Arial" w:hAnsi="Arial"/>
+          <w:b w:val="false"/>
+          <w:bCs w:val="false"/>
+          <w:i w:val="false"/>
+          <w:iCs w:val="false"/>
+          <w:color w:val="4A4A4A"/>
+          <w:sz w:val="17"/>
+          <w:szCs w:val="17"/>
+        </w:rPr>
+        <w:t xml:space="preserve">Autoevaluación de nivel anteproyecto (NDI2) frente a la Ordenanza General de Urbanismo y Construcciones (OGUC) y normativa asociada. Mismo criterio que el resto del documento: cada fila declara si el punto está definido, pendiente de un especialista, o pendiente de definición de proyecto — no se completan huecos con supuestos.</w:t>
+      </w:r>
+    </w:p>
+    <w:p>
+      <w:pPr>
+        <w:spacing w:after="160"/>
+      </w:pPr>
+      <w:r>
+        <w:rPr>
+          <w:rFonts w:ascii="Arial" w:cs="Arial" w:eastAsia="Arial" w:hAnsi="Arial"/>
+          <w:b w:val="false"/>
+          <w:bCs w:val="false"/>
+          <w:i w:val="false"/>
+          <w:iCs w:val="false"/>
+          <w:color w:val="4A4A4A"/>
+          <w:sz w:val="17"/>
+          <w:szCs w:val="17"/>
+        </w:rPr>
+        <w:t xml:space="preserve">Marco normativo de referencia: Ley y Ordenanza General de Urbanismo y Construcciones; Res. Exenta N°2070 de 2009 (V. y U.) — Itemizado Técnico de Construcción; RIDAA (Reglamento de Instalaciones Domiciliarias de Agua Potable y Alcantarillado); Reglamento de la SEC para instalaciones eléctricas; DS N°174/2005 (V. y U.); Normas NCh y MINVU aplicables.</w:t>
+      </w:r>
+    </w:p>
+    <w:tbl>
+      <w:tblPr>
+        <w:tblW w:type="dxa" w:w="8900"/>
+        <w:tblBorders>
+          <w:top w:val="single" w:color="auto" w:sz="4"/>
+          <w:left w:val="single" w:color="auto" w:sz="4"/>
+          <w:bottom w:val="single" w:color="auto" w:sz="4"/>
+          <w:right w:val="single" w:color="auto" w:sz="4"/>
+          <w:insideH w:val="single" w:color="auto" w:sz="4"/>
+          <w:insideV w:val="single" w:color="auto" w:sz="4"/>
+        </w:tblBorders>
+      </w:tblPr>
+      <w:tblGrid>
+        <w:gridCol w:w="1980"/>
+        <w:gridCol w:w="2160"/>
+        <w:gridCol w:w="4760"/>
+      </w:tblGrid>
+      <w:tr>
+        <w:trPr>
+          <w:tblHeader/>
+        </w:trPr>
+        <w:tc>
+          <w:tcPr>
+            <w:tcW w:type="dxa" w:w="1980"/>
+            <w:shd w:fill="171717" w:color="auto" w:val="clear"/>
+            <w:tcMar>
+              <w:top w:type="dxa" w:w="70"/>
+              <w:left w:type="dxa" w:w="90"/>
+              <w:bottom w:type="dxa" w:w="70"/>
+              <w:right w:type="dxa" w:w="90"/>
+            </w:tcMar>
+          </w:tcPr>
+          <w:p>
+            <w:r>
+              <w:rPr>
+                <w:rFonts w:ascii="Arial" w:cs="Arial" w:eastAsia="Arial" w:hAnsi="Arial"/>
+                <w:b/>
+                <w:bCs/>
+                <w:i w:val="false"/>
+                <w:iCs w:val="false"/>
+                <w:color w:val="FFFFFF"/>
+                <w:sz w:val="16"/>
+                <w:szCs w:val="16"/>
+              </w:rPr>
+              <w:t xml:space="preserve">Tema</w:t>
+            </w:r>
+          </w:p>
+        </w:tc>
+        <w:tc>
+          <w:tcPr>
+            <w:tcW w:type="dxa" w:w="2160"/>
+            <w:shd w:fill="171717" w:color="auto" w:val="clear"/>
+            <w:tcMar>
+              <w:top w:type="dxa" w:w="70"/>
+              <w:left w:type="dxa" w:w="90"/>
+              <w:bottom w:type="dxa" w:w="70"/>
+              <w:right w:type="dxa" w:w="90"/>
+            </w:tcMar>
+          </w:tcPr>
+          <w:p>
+            <w:r>
+              <w:rPr>
+                <w:rFonts w:ascii="Arial" w:cs="Arial" w:eastAsia="Arial" w:hAnsi="Arial"/>
+                <w:b/>
+                <w:bCs/>
+                <w:i w:val="false"/>
+                <w:iCs w:val="false"/>
+                <w:color w:val="FFFFFF"/>
+                <w:sz w:val="16"/>
+                <w:szCs w:val="16"/>
+              </w:rPr>
+              <w:t xml:space="preserve">Estado</w:t>
+            </w:r>
+          </w:p>
+        </w:tc>
+        <w:tc>
+          <w:tcPr>
+            <w:tcW w:type="dxa" w:w="4760"/>
+            <w:shd w:fill="171717" w:color="auto" w:val="clear"/>
+            <w:tcMar>
+              <w:top w:type="dxa" w:w="70"/>
+              <w:left w:type="dxa" w:w="90"/>
+              <w:bottom w:type="dxa" w:w="70"/>
+              <w:right w:type="dxa" w:w="90"/>
+            </w:tcMar>
+          </w:tcPr>
+          <w:p>
+            <w:r>
+              <w:rPr>
+                <w:rFonts w:ascii="Arial" w:cs="Arial" w:eastAsia="Arial" w:hAnsi="Arial"/>
+                <w:b/>
+                <w:bCs/>
+                <w:i w:val="false"/>
+                <w:iCs w:val="false"/>
+                <w:color w:val="FFFFFF"/>
+                <w:sz w:val="16"/>
+                <w:szCs w:val="16"/>
+              </w:rPr>
+              <w:t xml:space="preserve">Antecedente / referencia normativa</w:t>
+            </w:r>
+          </w:p>
+        </w:tc>
+      </w:tr>
+      <w:tr>
+        <w:tc>
+          <w:tcPr>
+            <w:tcW w:type="dxa" w:w="1980"/>
+            <w:shd w:fill="F5F2EC" w:color="auto" w:val="clear"/>
+            <w:tcMar>
+              <w:top w:type="dxa" w:w="70"/>
+              <w:left w:type="dxa" w:w="90"/>
+              <w:bottom w:type="dxa" w:w="70"/>
+              <w:right w:type="dxa" w:w="90"/>
+            </w:tcMar>
+          </w:tcPr>
+          <w:p>
+            <w:r>
+              <w:rPr>
+                <w:rFonts w:ascii="Arial" w:cs="Arial" w:eastAsia="Arial" w:hAnsi="Arial"/>
+                <w:b w:val="false"/>
+                <w:bCs w:val="false"/>
+                <w:i w:val="false"/>
+                <w:iCs w:val="false"/>
+                <w:color w:val="4A4A4A"/>
+                <w:sz w:val="17"/>
+                <w:szCs w:val="17"/>
+              </w:rPr>
+              <w:t xml:space="preserve">Régimen de permiso</w:t>
+            </w:r>
+          </w:p>
+        </w:tc>
+        <w:tc>
+          <w:tcPr>
+            <w:tcW w:type="dxa" w:w="2160"/>
+            <w:shd w:fill="F5F2EC" w:color="auto" w:val="clear"/>
+            <w:tcMar>
+              <w:top w:type="dxa" w:w="70"/>
+              <w:left w:type="dxa" w:w="90"/>
+              <w:bottom w:type="dxa" w:w="70"/>
+              <w:right w:type="dxa" w:w="90"/>
+            </w:tcMar>
+          </w:tcPr>
+          <w:p>
+            <w:r>
+              <w:rPr>
+                <w:rFonts w:ascii="Arial" w:cs="Arial" w:eastAsia="Arial" w:hAnsi="Arial"/>
+                <w:b w:val="false"/>
+                <w:bCs w:val="false"/>
+                <w:i w:val="false"/>
+                <w:iCs w:val="false"/>
+                <w:color w:val="4A4A4A"/>
+                <w:sz w:val="17"/>
+                <w:szCs w:val="17"/>
+              </w:rPr>
+              <w:t xml:space="preserve">Definido (supuesto de emplazamiento)</w:t>
+            </w:r>
+          </w:p>
+        </w:tc>
+        <w:tc>
+          <w:tcPr>
+            <w:tcW w:type="dxa" w:w="4760"/>
+            <w:shd w:fill="F5F2EC" w:color="auto" w:val="clear"/>
+            <w:tcMar>
+              <w:top w:type="dxa" w:w="70"/>
+              <w:left w:type="dxa" w:w="90"/>
+              <w:bottom w:type="dxa" w:w="70"/>
+              <w:right w:type="dxa" w:w="90"/>
+            </w:tcMar>
+          </w:tcPr>
+          <w:p>
+            <w:r>
+              <w:rPr>
+                <w:rFonts w:ascii="Arial" w:cs="Arial" w:eastAsia="Arial" w:hAnsi="Arial"/>
+                <w:b w:val="false"/>
+                <w:bCs w:val="false"/>
+                <w:i w:val="false"/>
+                <w:iCs w:val="false"/>
+                <w:color w:val="4A4A4A"/>
+                <w:sz w:val="17"/>
+                <w:szCs w:val="17"/>
+              </w:rPr>
+              <w:t xml:space="preserve">Terreno rural, fuera de límite urbano (corredor vitivinícola, Región del Maule) → Art. 55 LGUC, tramitación vía SAG/Seremi de Agricultura, no DOM municipal. Pendiente: confirmar con el título de dominio y el instrumento de planificación territorial vigente.</w:t>
+            </w:r>
+          </w:p>
+        </w:tc>
+      </w:tr>
+      <w:tr>
+        <w:tc>
+          <w:tcPr>
+            <w:tcW w:type="dxa" w:w="1980"/>
+            <w:shd w:fill="F5F2EC" w:color="auto" w:val="clear"/>
+            <w:tcMar>
+              <w:top w:type="dxa" w:w="70"/>
+              <w:left w:type="dxa" w:w="90"/>
+              <w:bottom w:type="dxa" w:w="70"/>
+              <w:right w:type="dxa" w:w="90"/>
+            </w:tcMar>
+          </w:tcPr>
+          <w:p>
+            <w:r>
+              <w:rPr>
+                <w:rFonts w:ascii="Arial" w:cs="Arial" w:eastAsia="Arial" w:hAnsi="Arial"/>
+                <w:b w:val="false"/>
+                <w:bCs w:val="false"/>
+                <w:i w:val="false"/>
+                <w:iCs w:val="false"/>
+                <w:color w:val="4A4A4A"/>
+                <w:sz w:val="17"/>
+                <w:szCs w:val="17"/>
+              </w:rPr>
+              <w:t xml:space="preserve">Exigencia térmica</w:t>
+            </w:r>
+          </w:p>
+        </w:tc>
+        <w:tc>
+          <w:tcPr>
+            <w:tcW w:type="dxa" w:w="2160"/>
+            <w:shd w:fill="F5F2EC" w:color="auto" w:val="clear"/>
+            <w:tcMar>
+              <w:top w:type="dxa" w:w="70"/>
+              <w:left w:type="dxa" w:w="90"/>
+              <w:bottom w:type="dxa" w:w="70"/>
+              <w:right w:type="dxa" w:w="90"/>
+            </w:tcMar>
+          </w:tcPr>
+          <w:p>
+            <w:r>
+              <w:rPr>
+                <w:rFonts w:ascii="Arial" w:cs="Arial" w:eastAsia="Arial" w:hAnsi="Arial"/>
+                <w:b w:val="false"/>
+                <w:bCs w:val="false"/>
+                <w:i w:val="false"/>
+                <w:iCs w:val="false"/>
+                <w:color w:val="4A4A4A"/>
+                <w:sz w:val="17"/>
+                <w:szCs w:val="17"/>
+              </w:rPr>
+              <w:t xml:space="preserve">Pendiente de especialista</w:t>
+            </w:r>
+          </w:p>
+        </w:tc>
+        <w:tc>
+          <w:tcPr>
+            <w:tcW w:type="dxa" w:w="4760"/>
+            <w:shd w:fill="F5F2EC" w:color="auto" w:val="clear"/>
+            <w:tcMar>
+              <w:top w:type="dxa" w:w="70"/>
+              <w:left w:type="dxa" w:w="90"/>
+              <w:bottom w:type="dxa" w:w="70"/>
+              <w:right w:type="dxa" w:w="90"/>
+            </w:tcMar>
+          </w:tcPr>
+          <w:p>
+            <w:r>
+              <w:rPr>
+                <w:rFonts w:ascii="Arial" w:cs="Arial" w:eastAsia="Arial" w:hAnsi="Arial"/>
+                <w:b w:val="false"/>
+                <w:bCs w:val="false"/>
+                <w:i w:val="false"/>
+                <w:iCs w:val="false"/>
+                <w:color w:val="4A4A4A"/>
+                <w:sz w:val="17"/>
+                <w:szCs w:val="17"/>
+              </w:rPr>
+              <w:t xml:space="preserve">OGUC Art. 4.1.10 + Reglamentación Térmica (NCh853). Comuna de Talca = Zona Térmica D (NCh1079, ver tabla de límites U/Rt más abajo). Falta calcular la transmitancia U real de muro quincha, cubierta zinc y radier para compararla contra el límite — ninguno declara aislante complementario hoy.</w:t>
+            </w:r>
+          </w:p>
+        </w:tc>
+      </w:tr>
+      <w:tr>
+        <w:tc>
+          <w:tcPr>
+            <w:tcW w:type="dxa" w:w="1980"/>
+            <w:shd w:fill="F5F2EC" w:color="auto" w:val="clear"/>
+            <w:tcMar>
+              <w:top w:type="dxa" w:w="70"/>
+              <w:left w:type="dxa" w:w="90"/>
+              <w:bottom w:type="dxa" w:w="70"/>
+              <w:right w:type="dxa" w:w="90"/>
+            </w:tcMar>
+          </w:tcPr>
+          <w:p>
+            <w:r>
+              <w:rPr>
+                <w:rFonts w:ascii="Arial" w:cs="Arial" w:eastAsia="Arial" w:hAnsi="Arial"/>
+                <w:b w:val="false"/>
+                <w:bCs w:val="false"/>
+                <w:i w:val="false"/>
+                <w:iCs w:val="false"/>
+                <w:color w:val="4A4A4A"/>
+                <w:sz w:val="17"/>
+                <w:szCs w:val="17"/>
+              </w:rPr>
+              <w:t xml:space="preserve">Exigencia estructural</w:t>
+            </w:r>
+          </w:p>
+        </w:tc>
+        <w:tc>
+          <w:tcPr>
+            <w:tcW w:type="dxa" w:w="2160"/>
+            <w:shd w:fill="F5F2EC" w:color="auto" w:val="clear"/>
+            <w:tcMar>
+              <w:top w:type="dxa" w:w="70"/>
+              <w:left w:type="dxa" w:w="90"/>
+              <w:bottom w:type="dxa" w:w="70"/>
+              <w:right w:type="dxa" w:w="90"/>
+            </w:tcMar>
+          </w:tcPr>
+          <w:p>
+            <w:r>
+              <w:rPr>
+                <w:rFonts w:ascii="Arial" w:cs="Arial" w:eastAsia="Arial" w:hAnsi="Arial"/>
+                <w:b w:val="false"/>
+                <w:bCs w:val="false"/>
+                <w:i w:val="false"/>
+                <w:iCs w:val="false"/>
+                <w:color w:val="4A4A4A"/>
+                <w:sz w:val="17"/>
+                <w:szCs w:val="17"/>
+              </w:rPr>
+              <w:t xml:space="preserve">Pendiente de especialista</w:t>
+            </w:r>
+          </w:p>
+        </w:tc>
+        <w:tc>
+          <w:tcPr>
+            <w:tcW w:type="dxa" w:w="4760"/>
+            <w:shd w:fill="F5F2EC" w:color="auto" w:val="clear"/>
+            <w:tcMar>
+              <w:top w:type="dxa" w:w="70"/>
+              <w:left w:type="dxa" w:w="90"/>
+              <w:bottom w:type="dxa" w:w="70"/>
+              <w:right w:type="dxa" w:w="90"/>
+            </w:tcMar>
+          </w:tcPr>
+          <w:p>
+            <w:r>
+              <w:rPr>
+                <w:rFonts w:ascii="Arial" w:cs="Arial" w:eastAsia="Arial" w:hAnsi="Arial"/>
+                <w:b w:val="false"/>
+                <w:bCs w:val="false"/>
+                <w:i w:val="false"/>
+                <w:iCs w:val="false"/>
+                <w:color w:val="4A4A4A"/>
+                <w:sz w:val="17"/>
+                <w:szCs w:val="17"/>
+              </w:rPr>
+              <w:t xml:space="preserve">NCh433 (diseño sísmico), NCh1198 (madera), NCh430 (hormigón armado). Sin memoria de cálculo; pilares glulam MLE, armazón 2x8/2x4, radier HA y las 16 zapatas aisladas (60x60x50cm, MT_HORMIGON ARMADO) requieren verificación de un calculista.</w:t>
+            </w:r>
+          </w:p>
+        </w:tc>
+      </w:tr>
+      <w:tr>
+        <w:tc>
+          <w:tcPr>
+            <w:tcW w:type="dxa" w:w="1980"/>
+            <w:shd w:fill="F5F2EC" w:color="auto" w:val="clear"/>
+            <w:tcMar>
+              <w:top w:type="dxa" w:w="70"/>
+              <w:left w:type="dxa" w:w="90"/>
+              <w:bottom w:type="dxa" w:w="70"/>
+              <w:right w:type="dxa" w:w="90"/>
+            </w:tcMar>
+          </w:tcPr>
+          <w:p>
+            <w:r>
+              <w:rPr>
+                <w:rFonts w:ascii="Arial" w:cs="Arial" w:eastAsia="Arial" w:hAnsi="Arial"/>
+                <w:b w:val="false"/>
+                <w:bCs w:val="false"/>
+                <w:i w:val="false"/>
+                <w:iCs w:val="false"/>
+                <w:color w:val="4A4A4A"/>
+                <w:sz w:val="17"/>
+                <w:szCs w:val="17"/>
+              </w:rPr>
+              <w:t xml:space="preserve">Protección contra incendio</w:t>
+            </w:r>
+          </w:p>
+        </w:tc>
+        <w:tc>
+          <w:tcPr>
+            <w:tcW w:type="dxa" w:w="2160"/>
+            <w:shd w:fill="F5F2EC" w:color="auto" w:val="clear"/>
+            <w:tcMar>
+              <w:top w:type="dxa" w:w="70"/>
+              <w:left w:type="dxa" w:w="90"/>
+              <w:bottom w:type="dxa" w:w="70"/>
+              <w:right w:type="dxa" w:w="90"/>
+            </w:tcMar>
+          </w:tcPr>
+          <w:p>
+            <w:r>
+              <w:rPr>
+                <w:rFonts w:ascii="Arial" w:cs="Arial" w:eastAsia="Arial" w:hAnsi="Arial"/>
+                <w:b w:val="false"/>
+                <w:bCs w:val="false"/>
+                <w:i w:val="false"/>
+                <w:iCs w:val="false"/>
+                <w:color w:val="4A4A4A"/>
+                <w:sz w:val="17"/>
+                <w:szCs w:val="17"/>
+              </w:rPr>
+              <w:t xml:space="preserve">Pendiente de especialista</w:t>
+            </w:r>
+          </w:p>
+        </w:tc>
+        <w:tc>
+          <w:tcPr>
+            <w:tcW w:type="dxa" w:w="4760"/>
+            <w:shd w:fill="F5F2EC" w:color="auto" w:val="clear"/>
+            <w:tcMar>
+              <w:top w:type="dxa" w:w="70"/>
+              <w:left w:type="dxa" w:w="90"/>
+              <w:bottom w:type="dxa" w:w="70"/>
+              <w:right w:type="dxa" w:w="90"/>
+            </w:tcMar>
+          </w:tcPr>
+          <w:p>
+            <w:r>
+              <w:rPr>
+                <w:rFonts w:ascii="Arial" w:cs="Arial" w:eastAsia="Arial" w:hAnsi="Arial"/>
+                <w:b w:val="false"/>
+                <w:bCs w:val="false"/>
+                <w:i w:val="false"/>
+                <w:iCs w:val="false"/>
+                <w:color w:val="4A4A4A"/>
+                <w:sz w:val="17"/>
+                <w:szCs w:val="17"/>
+              </w:rPr>
+              <w:t xml:space="preserve">OGUC Título 4, Cap. 3. Sin clasificación de resistencia al fuego (F) de elementos ni reacción al fuego de revestimientos — relevante por el relleno de paja de la quincha y la estructura de madera vista.</w:t>
+            </w:r>
+          </w:p>
+        </w:tc>
+      </w:tr>
+      <w:tr>
+        <w:tc>
+          <w:tcPr>
+            <w:tcW w:type="dxa" w:w="1980"/>
+            <w:shd w:fill="F5F2EC" w:color="auto" w:val="clear"/>
+            <w:tcMar>
+              <w:top w:type="dxa" w:w="70"/>
+              <w:left w:type="dxa" w:w="90"/>
+              <w:bottom w:type="dxa" w:w="70"/>
+              <w:right w:type="dxa" w:w="90"/>
+            </w:tcMar>
+          </w:tcPr>
+          <w:p>
+            <w:r>
+              <w:rPr>
+                <w:rFonts w:ascii="Arial" w:cs="Arial" w:eastAsia="Arial" w:hAnsi="Arial"/>
+                <w:b w:val="false"/>
+                <w:bCs w:val="false"/>
+                <w:i w:val="false"/>
+                <w:iCs w:val="false"/>
+                <w:color w:val="4A4A4A"/>
+                <w:sz w:val="17"/>
+                <w:szCs w:val="17"/>
+              </w:rPr>
+              <w:t xml:space="preserve">Instalación sanitaria</w:t>
+            </w:r>
+          </w:p>
+        </w:tc>
+        <w:tc>
+          <w:tcPr>
+            <w:tcW w:type="dxa" w:w="2160"/>
+            <w:shd w:fill="F5F2EC" w:color="auto" w:val="clear"/>
+            <w:tcMar>
+              <w:top w:type="dxa" w:w="70"/>
+              <w:left w:type="dxa" w:w="90"/>
+              <w:bottom w:type="dxa" w:w="70"/>
+              <w:right w:type="dxa" w:w="90"/>
+            </w:tcMar>
+          </w:tcPr>
+          <w:p>
+            <w:r>
+              <w:rPr>
+                <w:rFonts w:ascii="Arial" w:cs="Arial" w:eastAsia="Arial" w:hAnsi="Arial"/>
+                <w:b w:val="false"/>
+                <w:bCs w:val="false"/>
+                <w:i w:val="false"/>
+                <w:iCs w:val="false"/>
+                <w:color w:val="4A4A4A"/>
+                <w:sz w:val="17"/>
+                <w:szCs w:val="17"/>
+              </w:rPr>
+              <w:t xml:space="preserve">Pendiente de definición de proyecto</w:t>
+            </w:r>
+          </w:p>
+        </w:tc>
+        <w:tc>
+          <w:tcPr>
+            <w:tcW w:type="dxa" w:w="4760"/>
+            <w:shd w:fill="F5F2EC" w:color="auto" w:val="clear"/>
+            <w:tcMar>
+              <w:top w:type="dxa" w:w="70"/>
+              <w:left w:type="dxa" w:w="90"/>
+              <w:bottom w:type="dxa" w:w="70"/>
+              <w:right w:type="dxa" w:w="90"/>
+            </w:tcMar>
+          </w:tcPr>
+          <w:p>
+            <w:r>
+              <w:rPr>
+                <w:rFonts w:ascii="Arial" w:cs="Arial" w:eastAsia="Arial" w:hAnsi="Arial"/>
+                <w:b w:val="false"/>
+                <w:bCs w:val="false"/>
+                <w:i w:val="false"/>
+                <w:iCs w:val="false"/>
+                <w:color w:val="4A4A4A"/>
+                <w:sz w:val="17"/>
+                <w:szCs w:val="17"/>
+              </w:rPr>
+              <w:t xml:space="preserve">La condición rural probablemente exige solución autónoma (pozo + fosa séptica o sistema de tratamiento), a diferencia de una conexión a red pública. Siguiendo el estándar de un proyecto de agua potable/alcantarillado real: red interior en cañería PPR (agua fría/caliente, protegida térmicamente) y PVC rígido sanitario (alcantarillado), diseñada por un profesional competente y conectada al sistema de tratamiento aprobado. El modelo especifica artefactos (WC, lavamanos) pero no la red de alimentación ni de evacuación.</w:t>
+            </w:r>
+          </w:p>
+        </w:tc>
+      </w:tr>
+      <w:tr>
+        <w:tc>
+          <w:tcPr>
+            <w:tcW w:type="dxa" w:w="1980"/>
+            <w:shd w:fill="F5F2EC" w:color="auto" w:val="clear"/>
+            <w:tcMar>
+              <w:top w:type="dxa" w:w="70"/>
+              <w:left w:type="dxa" w:w="90"/>
+              <w:bottom w:type="dxa" w:w="70"/>
+              <w:right w:type="dxa" w:w="90"/>
+            </w:tcMar>
+          </w:tcPr>
+          <w:p>
+            <w:r>
+              <w:rPr>
+                <w:rFonts w:ascii="Arial" w:cs="Arial" w:eastAsia="Arial" w:hAnsi="Arial"/>
+                <w:b w:val="false"/>
+                <w:bCs w:val="false"/>
+                <w:i w:val="false"/>
+                <w:iCs w:val="false"/>
+                <w:color w:val="4A4A4A"/>
+                <w:sz w:val="17"/>
+                <w:szCs w:val="17"/>
+              </w:rPr>
+              <w:t xml:space="preserve">Instalación eléctrica</w:t>
+            </w:r>
+          </w:p>
+        </w:tc>
+        <w:tc>
+          <w:tcPr>
+            <w:tcW w:type="dxa" w:w="2160"/>
+            <w:shd w:fill="F5F2EC" w:color="auto" w:val="clear"/>
+            <w:tcMar>
+              <w:top w:type="dxa" w:w="70"/>
+              <w:left w:type="dxa" w:w="90"/>
+              <w:bottom w:type="dxa" w:w="70"/>
+              <w:right w:type="dxa" w:w="90"/>
+            </w:tcMar>
+          </w:tcPr>
+          <w:p>
+            <w:r>
+              <w:rPr>
+                <w:rFonts w:ascii="Arial" w:cs="Arial" w:eastAsia="Arial" w:hAnsi="Arial"/>
+                <w:b w:val="false"/>
+                <w:bCs w:val="false"/>
+                <w:i w:val="false"/>
+                <w:iCs w:val="false"/>
+                <w:color w:val="4A4A4A"/>
+                <w:sz w:val="17"/>
+                <w:szCs w:val="17"/>
+              </w:rPr>
+              <w:t xml:space="preserve">Pendiente de definición de proyecto</w:t>
+            </w:r>
+          </w:p>
+        </w:tc>
+        <w:tc>
+          <w:tcPr>
+            <w:tcW w:type="dxa" w:w="4760"/>
+            <w:shd w:fill="F5F2EC" w:color="auto" w:val="clear"/>
+            <w:tcMar>
+              <w:top w:type="dxa" w:w="70"/>
+              <w:left w:type="dxa" w:w="90"/>
+              <w:bottom w:type="dxa" w:w="70"/>
+              <w:right w:type="dxa" w:w="90"/>
+            </w:tcMar>
+          </w:tcPr>
+          <w:p>
+            <w:r>
+              <w:rPr>
+                <w:rFonts w:ascii="Arial" w:cs="Arial" w:eastAsia="Arial" w:hAnsi="Arial"/>
+                <w:b w:val="false"/>
+                <w:bCs w:val="false"/>
+                <w:i w:val="false"/>
+                <w:iCs w:val="false"/>
+                <w:color w:val="4A4A4A"/>
+                <w:sz w:val="17"/>
+                <w:szCs w:val="17"/>
+              </w:rPr>
+              <w:t xml:space="preserve">NCh Elec. 4/2003 + Reglamento SEC + OGUC. Siguiendo el estándar de un proyecto eléctrico real: instalación según proyecto de profesional competente e instalador autorizado SEC, conexión a malla o barra a tierra, y al menos un enchufe por recinto. El modelo clasifica cargas eléctricas pero no define tablero, puesta a tierra ni origen de la energía (red pública vs. solar aislado, dado el uso en ruta).</w:t>
+            </w:r>
+          </w:p>
+        </w:tc>
+      </w:tr>
+      <w:tr>
+        <w:tc>
+          <w:tcPr>
+            <w:tcW w:type="dxa" w:w="1980"/>
+            <w:shd w:fill="F5F2EC" w:color="auto" w:val="clear"/>
+            <w:tcMar>
+              <w:top w:type="dxa" w:w="70"/>
+              <w:left w:type="dxa" w:w="90"/>
+              <w:bottom w:type="dxa" w:w="70"/>
+              <w:right w:type="dxa" w:w="90"/>
+            </w:tcMar>
+          </w:tcPr>
+          <w:p>
+            <w:r>
+              <w:rPr>
+                <w:rFonts w:ascii="Arial" w:cs="Arial" w:eastAsia="Arial" w:hAnsi="Arial"/>
+                <w:b w:val="false"/>
+                <w:bCs w:val="false"/>
+                <w:i w:val="false"/>
+                <w:iCs w:val="false"/>
+                <w:color w:val="4A4A4A"/>
+                <w:sz w:val="17"/>
+                <w:szCs w:val="17"/>
+              </w:rPr>
+              <w:t xml:space="preserve">Impermeabilización de fundación</w:t>
+            </w:r>
+          </w:p>
+        </w:tc>
+        <w:tc>
+          <w:tcPr>
+            <w:tcW w:type="dxa" w:w="2160"/>
+            <w:shd w:fill="F5F2EC" w:color="auto" w:val="clear"/>
+            <w:tcMar>
+              <w:top w:type="dxa" w:w="70"/>
+              <w:left w:type="dxa" w:w="90"/>
+              <w:bottom w:type="dxa" w:w="70"/>
+              <w:right w:type="dxa" w:w="90"/>
+            </w:tcMar>
+          </w:tcPr>
+          <w:p>
+            <w:r>
+              <w:rPr>
+                <w:rFonts w:ascii="Arial" w:cs="Arial" w:eastAsia="Arial" w:hAnsi="Arial"/>
+                <w:b w:val="false"/>
+                <w:bCs w:val="false"/>
+                <w:i w:val="false"/>
+                <w:iCs w:val="false"/>
+                <w:color w:val="4A4A4A"/>
+                <w:sz w:val="17"/>
+                <w:szCs w:val="17"/>
+              </w:rPr>
+              <w:t xml:space="preserve">Pendiente</w:t>
+            </w:r>
+          </w:p>
+        </w:tc>
+        <w:tc>
+          <w:tcPr>
+            <w:tcW w:type="dxa" w:w="4760"/>
+            <w:shd w:fill="F5F2EC" w:color="auto" w:val="clear"/>
+            <w:tcMar>
+              <w:top w:type="dxa" w:w="70"/>
+              <w:left w:type="dxa" w:w="90"/>
+              <w:bottom w:type="dxa" w:w="70"/>
+              <w:right w:type="dxa" w:w="90"/>
+            </w:tcMar>
+          </w:tcPr>
+          <w:p>
+            <w:r>
+              <w:rPr>
+                <w:rFonts w:ascii="Arial" w:cs="Arial" w:eastAsia="Arial" w:hAnsi="Arial"/>
+                <w:b w:val="false"/>
+                <w:bCs w:val="false"/>
+                <w:i w:val="false"/>
+                <w:iCs w:val="false"/>
+                <w:color w:val="4A4A4A"/>
+                <w:sz w:val="17"/>
+                <w:szCs w:val="17"/>
+              </w:rPr>
+              <w:t xml:space="preserve">Sin barrera de vapor/humedad bajo el radier declarada — relevante en clima de la Región del Maule con lluvias invernales.</w:t>
+            </w:r>
+          </w:p>
+        </w:tc>
+      </w:tr>
+    </w:tbl>
+    <w:p>
+      <w:pPr>
+        <w:spacing w:after="140"/>
+      </w:pPr>
+      <w:r>
+        <w:rPr>
+          <w:rFonts w:ascii="Arial" w:cs="Arial" w:eastAsia="Arial" w:hAnsi="Arial"/>
+          <w:b w:val="false"/>
+          <w:bCs w:val="false"/>
+          <w:i/>
+          <w:iCs/>
+          <w:color w:val="4A4A4A"/>
+          <w:sz w:val="16"/>
+          <w:szCs w:val="16"/>
+        </w:rPr>
+        <w:t xml:space="preserve">Nota: esta sección es una autoevaluación de nivel anteproyecto (NDI2), no un estudio de cumplimiento normativo — no reemplaza la revisión de un arquitecto, calculista e instalador competentes antes de solicitar permiso de edificación.</w:t>
+      </w:r>
+    </w:p>
+    <w:p>
+      <w:pPr>
+        <w:spacing w:after="80" w:before="120"/>
+      </w:pPr>
+      <w:r>
+        <w:rPr>
+          <w:rFonts w:ascii="Arial" w:cs="Arial" w:eastAsia="Arial" w:hAnsi="Arial"/>
+          <w:b/>
+          <w:bCs/>
+          <w:i w:val="false"/>
+          <w:iCs w:val="false"/>
+          <w:color w:val="4A4A4A"/>
+          <w:sz w:val="16"/>
+          <w:szCs w:val="16"/>
+        </w:rPr>
+        <w:t xml:space="preserve">Tabla — Transmitancia térmica U (W/m²K) máxima y resistencia Rt (m²K/W) mínima por zona térmica (NCh1079, Art. 4.1.10 OGUC). Comuna de Talca = Zona D, resaltada.</w:t>
+      </w:r>
+    </w:p>
+    <w:tbl>
+      <w:tblPr>
+        <w:tblW w:type="dxa" w:w="9900"/>
+        <w:tblBorders>
+          <w:top w:val="single" w:color="auto" w:sz="4"/>
+          <w:left w:val="single" w:color="auto" w:sz="4"/>
+          <w:bottom w:val="single" w:color="auto" w:sz="4"/>
+          <w:right w:val="single" w:color="auto" w:sz="4"/>
+          <w:insideH w:val="single" w:color="auto" w:sz="4"/>
+          <w:insideV w:val="single" w:color="auto" w:sz="4"/>
+        </w:tblBorders>
+      </w:tblPr>
+      <w:tblGrid>
+        <w:gridCol w:w="1200"/>
+        <w:gridCol w:w="1300"/>
+        <w:gridCol w:w="1200"/>
+        <w:gridCol w:w="1300"/>
+        <w:gridCol w:w="1200"/>
+        <w:gridCol w:w="1300"/>
+        <w:gridCol w:w="1200"/>
+        <w:gridCol w:w="1200"/>
+      </w:tblGrid>
+      <w:tr>
+        <w:trPr>
+          <w:tblHeader/>
+        </w:trPr>
+        <w:tc>
+          <w:tcPr>
+            <w:tcW w:type="dxa" w:w="1200"/>
+            <w:shd w:fill="171717" w:color="auto" w:val="clear"/>
+            <w:tcMar>
+              <w:top w:type="dxa" w:w="40"/>
+              <w:left w:type="dxa" w:w="60"/>
+              <w:bottom w:type="dxa" w:w="40"/>
+              <w:right w:type="dxa" w:w="60"/>
+            </w:tcMar>
+          </w:tcPr>
+          <w:p>
+            <w:pPr>
+              <w:jc w:val="center"/>
+            </w:pPr>
+            <w:r>
+              <w:rPr>
+                <w:rFonts w:ascii="Arial" w:cs="Arial" w:eastAsia="Arial" w:hAnsi="Arial"/>
+                <w:b/>
+                <w:bCs/>
+                <w:i w:val="false"/>
+                <w:iCs w:val="false"/>
+                <w:color w:val="FFFFFF"/>
+                <w:sz w:val="14"/>
+                <w:szCs w:val="14"/>
+              </w:rPr>
+              <w:t xml:space="preserve">Zona</w:t>
+            </w:r>
+          </w:p>
+        </w:tc>
+        <w:tc>
+          <w:tcPr>
+            <w:tcW w:type="dxa" w:w="1300"/>
+            <w:shd w:fill="171717" w:color="auto" w:val="clear"/>
+            <w:tcMar>
+              <w:top w:type="dxa" w:w="40"/>
+              <w:left w:type="dxa" w:w="60"/>
+              <w:bottom w:type="dxa" w:w="40"/>
+              <w:right w:type="dxa" w:w="60"/>
+            </w:tcMar>
+          </w:tcPr>
+          <w:p>
+            <w:pPr>
+              <w:jc w:val="center"/>
+            </w:pPr>
+            <w:r>
+              <w:rPr>
+                <w:rFonts w:ascii="Arial" w:cs="Arial" w:eastAsia="Arial" w:hAnsi="Arial"/>
+                <w:b/>
+                <w:bCs/>
+                <w:i w:val="false"/>
+                <w:iCs w:val="false"/>
+                <w:color w:val="FFFFFF"/>
+                <w:sz w:val="14"/>
+                <w:szCs w:val="14"/>
+              </w:rPr>
+              <w:t xml:space="preserve">Techo U</w:t>
+            </w:r>
+          </w:p>
+        </w:tc>
+        <w:tc>
+          <w:tcPr>
+            <w:tcW w:type="dxa" w:w="1200"/>
+            <w:shd w:fill="171717" w:color="auto" w:val="clear"/>
+            <w:tcMar>
+              <w:top w:type="dxa" w:w="40"/>
+              <w:left w:type="dxa" w:w="60"/>
+              <w:bottom w:type="dxa" w:w="40"/>
+              <w:right w:type="dxa" w:w="60"/>
+            </w:tcMar>
+          </w:tcPr>
+          <w:p>
+            <w:pPr>
+              <w:jc w:val="center"/>
+            </w:pPr>
+            <w:r>
+              <w:rPr>
+                <w:rFonts w:ascii="Arial" w:cs="Arial" w:eastAsia="Arial" w:hAnsi="Arial"/>
+                <w:b/>
+                <w:bCs/>
+                <w:i w:val="false"/>
+                <w:iCs w:val="false"/>
+                <w:color w:val="FFFFFF"/>
+                <w:sz w:val="14"/>
+                <w:szCs w:val="14"/>
+              </w:rPr>
+              <w:t xml:space="preserve">Techo Rt</w:t>
+            </w:r>
+          </w:p>
+        </w:tc>
+        <w:tc>
+          <w:tcPr>
+            <w:tcW w:type="dxa" w:w="1300"/>
+            <w:shd w:fill="171717" w:color="auto" w:val="clear"/>
+            <w:tcMar>
+              <w:top w:type="dxa" w:w="40"/>
+              <w:left w:type="dxa" w:w="60"/>
+              <w:bottom w:type="dxa" w:w="40"/>
+              <w:right w:type="dxa" w:w="60"/>
+            </w:tcMar>
+          </w:tcPr>
+          <w:p>
+            <w:pPr>
+              <w:jc w:val="center"/>
+            </w:pPr>
+            <w:r>
+              <w:rPr>
+                <w:rFonts w:ascii="Arial" w:cs="Arial" w:eastAsia="Arial" w:hAnsi="Arial"/>
+                <w:b/>
+                <w:bCs/>
+                <w:i w:val="false"/>
+                <w:iCs w:val="false"/>
+                <w:color w:val="FFFFFF"/>
+                <w:sz w:val="14"/>
+                <w:szCs w:val="14"/>
+              </w:rPr>
+              <w:t xml:space="preserve">Muro U</w:t>
+            </w:r>
+          </w:p>
+        </w:tc>
+        <w:tc>
+          <w:tcPr>
+            <w:tcW w:type="dxa" w:w="1200"/>
+            <w:shd w:fill="171717" w:color="auto" w:val="clear"/>
+            <w:tcMar>
+              <w:top w:type="dxa" w:w="40"/>
+              <w:left w:type="dxa" w:w="60"/>
+              <w:bottom w:type="dxa" w:w="40"/>
+              <w:right w:type="dxa" w:w="60"/>
+            </w:tcMar>
+          </w:tcPr>
+          <w:p>
+            <w:pPr>
+              <w:jc w:val="center"/>
+            </w:pPr>
+            <w:r>
+              <w:rPr>
+                <w:rFonts w:ascii="Arial" w:cs="Arial" w:eastAsia="Arial" w:hAnsi="Arial"/>
+                <w:b/>
+                <w:bCs/>
+                <w:i w:val="false"/>
+                <w:iCs w:val="false"/>
+                <w:color w:val="FFFFFF"/>
+                <w:sz w:val="14"/>
+                <w:szCs w:val="14"/>
+              </w:rPr>
+              <w:t xml:space="preserve">Muro Rt</w:t>
+            </w:r>
+          </w:p>
+        </w:tc>
+        <w:tc>
+          <w:tcPr>
+            <w:tcW w:type="dxa" w:w="1300"/>
+            <w:shd w:fill="171717" w:color="auto" w:val="clear"/>
+            <w:tcMar>
+              <w:top w:type="dxa" w:w="40"/>
+              <w:left w:type="dxa" w:w="60"/>
+              <w:bottom w:type="dxa" w:w="40"/>
+              <w:right w:type="dxa" w:w="60"/>
+            </w:tcMar>
+          </w:tcPr>
+          <w:p>
+            <w:pPr>
+              <w:jc w:val="center"/>
+            </w:pPr>
+            <w:r>
+              <w:rPr>
+                <w:rFonts w:ascii="Arial" w:cs="Arial" w:eastAsia="Arial" w:hAnsi="Arial"/>
+                <w:b/>
+                <w:bCs/>
+                <w:i w:val="false"/>
+                <w:iCs w:val="false"/>
+                <w:color w:val="FFFFFF"/>
+                <w:sz w:val="14"/>
+                <w:szCs w:val="14"/>
+              </w:rPr>
+              <w:t xml:space="preserve">Piso U</w:t>
+            </w:r>
+          </w:p>
+        </w:tc>
+        <w:tc>
+          <w:tcPr>
+            <w:tcW w:type="dxa" w:w="1200"/>
+            <w:shd w:fill="171717" w:color="auto" w:val="clear"/>
+            <w:tcMar>
+              <w:top w:type="dxa" w:w="40"/>
+              <w:left w:type="dxa" w:w="60"/>
+              <w:bottom w:type="dxa" w:w="40"/>
+              <w:right w:type="dxa" w:w="60"/>
+            </w:tcMar>
+          </w:tcPr>
+          <w:p>
+            <w:pPr>
+              <w:jc w:val="center"/>
+            </w:pPr>
+            <w:r>
+              <w:rPr>
+                <w:rFonts w:ascii="Arial" w:cs="Arial" w:eastAsia="Arial" w:hAnsi="Arial"/>
+                <w:b/>
+                <w:bCs/>
+                <w:i w:val="false"/>
+                <w:iCs w:val="false"/>
+                <w:color w:val="FFFFFF"/>
+                <w:sz w:val="14"/>
+                <w:szCs w:val="14"/>
+              </w:rPr>
+              <w:t xml:space="preserve">Piso Rt</w:t>
+            </w:r>
+          </w:p>
+        </w:tc>
+        <w:tc>
+          <w:tcPr>
+            <w:tcW w:type="dxa" w:w="1200"/>
+            <w:shd w:fill="171717" w:color="auto" w:val="clear"/>
+            <w:tcMar>
+              <w:top w:type="dxa" w:w="40"/>
+              <w:left w:type="dxa" w:w="60"/>
+              <w:bottom w:type="dxa" w:w="40"/>
+              <w:right w:type="dxa" w:w="60"/>
+            </w:tcMar>
+          </w:tcPr>
+          <w:p>
+            <w:pPr>
+              <w:jc w:val="center"/>
+            </w:pPr>
+            <w:r>
+              <w:rPr>
+                <w:rFonts w:ascii="Arial" w:cs="Arial" w:eastAsia="Arial" w:hAnsi="Arial"/>
+                <w:b/>
+                <w:bCs/>
+                <w:i w:val="false"/>
+                <w:iCs w:val="false"/>
+                <w:color w:val="FFFFFF"/>
+                <w:sz w:val="14"/>
+                <w:szCs w:val="14"/>
+              </w:rPr>
+              <w:t xml:space="preserve">Puertas U/Rt</w:t>
+            </w:r>
+          </w:p>
+        </w:tc>
+      </w:tr>
+      <w:tr>
+        <w:tc>
+          <w:tcPr>
+            <w:tcW w:type="dxa" w:w="1200"/>
+            <w:shd w:fill="F5F2EC" w:color="auto" w:val="clear"/>
+            <w:tcMar>
+              <w:top w:type="dxa" w:w="40"/>
+              <w:left w:type="dxa" w:w="60"/>
+              <w:bottom w:type="dxa" w:w="40"/>
+              <w:right w:type="dxa" w:w="60"/>
+            </w:tcMar>
+          </w:tcPr>
+          <w:p>
+            <w:pPr>
+              <w:jc w:val="center"/>
+            </w:pPr>
+            <w:r>
+              <w:rPr>
+                <w:rFonts w:ascii="Arial" w:cs="Arial" w:eastAsia="Arial" w:hAnsi="Arial"/>
+                <w:b w:val="false"/>
+                <w:bCs w:val="false"/>
+                <w:i w:val="false"/>
+                <w:iCs w:val="false"/>
+                <w:color w:val="4A4A4A"/>
+                <w:sz w:val="14"/>
+                <w:szCs w:val="14"/>
+              </w:rPr>
+              <w:t xml:space="preserve">A</w:t>
+            </w:r>
+          </w:p>
+        </w:tc>
+        <w:tc>
+          <w:tcPr>
+            <w:tcW w:type="dxa" w:w="1300"/>
+            <w:shd w:fill="F5F2EC" w:color="auto" w:val="clear"/>
+            <w:tcMar>
+              <w:top w:type="dxa" w:w="40"/>
+              <w:left w:type="dxa" w:w="60"/>
+              <w:bottom w:type="dxa" w:w="40"/>
+              <w:right w:type="dxa" w:w="60"/>
+            </w:tcMar>
+          </w:tcPr>
+          <w:p>
+            <w:pPr>
+              <w:jc w:val="center"/>
+            </w:pPr>
+            <w:r>
+              <w:rPr>
+                <w:rFonts w:ascii="Arial" w:cs="Arial" w:eastAsia="Arial" w:hAnsi="Arial"/>
+                <w:b w:val="false"/>
+                <w:bCs w:val="false"/>
+                <w:i w:val="false"/>
+                <w:iCs w:val="false"/>
+                <w:color w:val="4A4A4A"/>
+                <w:sz w:val="14"/>
+                <w:szCs w:val="14"/>
+              </w:rPr>
+              <w:t xml:space="preserve">0,84</w:t>
+            </w:r>
+          </w:p>
+        </w:tc>
+        <w:tc>
+          <w:tcPr>
+            <w:tcW w:type="dxa" w:w="1200"/>
+            <w:shd w:fill="F5F2EC" w:color="auto" w:val="clear"/>
+            <w:tcMar>
+              <w:top w:type="dxa" w:w="40"/>
+              <w:left w:type="dxa" w:w="60"/>
+              <w:bottom w:type="dxa" w:w="40"/>
+              <w:right w:type="dxa" w:w="60"/>
+            </w:tcMar>
+          </w:tcPr>
+          <w:p>
+            <w:pPr>
+              <w:jc w:val="center"/>
+            </w:pPr>
+            <w:r>
+              <w:rPr>
+                <w:rFonts w:ascii="Arial" w:cs="Arial" w:eastAsia="Arial" w:hAnsi="Arial"/>
+                <w:b w:val="false"/>
+                <w:bCs w:val="false"/>
+                <w:i w:val="false"/>
+                <w:iCs w:val="false"/>
+                <w:color w:val="4A4A4A"/>
+                <w:sz w:val="14"/>
+                <w:szCs w:val="14"/>
+              </w:rPr>
+              <w:t xml:space="preserve">1,19</w:t>
+            </w:r>
+          </w:p>
+        </w:tc>
+        <w:tc>
+          <w:tcPr>
+            <w:tcW w:type="dxa" w:w="1300"/>
+            <w:shd w:fill="F5F2EC" w:color="auto" w:val="clear"/>
+            <w:tcMar>
+              <w:top w:type="dxa" w:w="40"/>
+              <w:left w:type="dxa" w:w="60"/>
+              <w:bottom w:type="dxa" w:w="40"/>
+              <w:right w:type="dxa" w:w="60"/>
+            </w:tcMar>
+          </w:tcPr>
+          <w:p>
+            <w:pPr>
+              <w:jc w:val="center"/>
+            </w:pPr>
+            <w:r>
+              <w:rPr>
+                <w:rFonts w:ascii="Arial" w:cs="Arial" w:eastAsia="Arial" w:hAnsi="Arial"/>
+                <w:b w:val="false"/>
+                <w:bCs w:val="false"/>
+                <w:i w:val="false"/>
+                <w:iCs w:val="false"/>
+                <w:color w:val="4A4A4A"/>
+                <w:sz w:val="14"/>
+                <w:szCs w:val="14"/>
+              </w:rPr>
+              <w:t xml:space="preserve">2,10</w:t>
+            </w:r>
+          </w:p>
+        </w:tc>
+        <w:tc>
+          <w:tcPr>
+            <w:tcW w:type="dxa" w:w="1200"/>
+            <w:shd w:fill="F5F2EC" w:color="auto" w:val="clear"/>
+            <w:tcMar>
+              <w:top w:type="dxa" w:w="40"/>
+              <w:left w:type="dxa" w:w="60"/>
+              <w:bottom w:type="dxa" w:w="40"/>
+              <w:right w:type="dxa" w:w="60"/>
+            </w:tcMar>
+          </w:tcPr>
+          <w:p>
+            <w:pPr>
+              <w:jc w:val="center"/>
+            </w:pPr>
+            <w:r>
+              <w:rPr>
+                <w:rFonts w:ascii="Arial" w:cs="Arial" w:eastAsia="Arial" w:hAnsi="Arial"/>
+                <w:b w:val="false"/>
+                <w:bCs w:val="false"/>
+                <w:i w:val="false"/>
+                <w:iCs w:val="false"/>
+                <w:color w:val="4A4A4A"/>
+                <w:sz w:val="14"/>
+                <w:szCs w:val="14"/>
+              </w:rPr>
+              <w:t xml:space="preserve">0,48</w:t>
+            </w:r>
+          </w:p>
+        </w:tc>
+        <w:tc>
+          <w:tcPr>
+            <w:tcW w:type="dxa" w:w="1300"/>
+            <w:shd w:fill="F5F2EC" w:color="auto" w:val="clear"/>
+            <w:tcMar>
+              <w:top w:type="dxa" w:w="40"/>
+              <w:left w:type="dxa" w:w="60"/>
+              <w:bottom w:type="dxa" w:w="40"/>
+              <w:right w:type="dxa" w:w="60"/>
+            </w:tcMar>
+          </w:tcPr>
+          <w:p>
+            <w:pPr>
+              <w:jc w:val="center"/>
+            </w:pPr>
+            <w:r>
+              <w:rPr>
+                <w:rFonts w:ascii="Arial" w:cs="Arial" w:eastAsia="Arial" w:hAnsi="Arial"/>
+                <w:b w:val="false"/>
+                <w:bCs w:val="false"/>
+                <w:i w:val="false"/>
+                <w:iCs w:val="false"/>
+                <w:color w:val="4A4A4A"/>
+                <w:sz w:val="14"/>
+                <w:szCs w:val="14"/>
+              </w:rPr>
+              <w:t xml:space="preserve">3,60</w:t>
+            </w:r>
+          </w:p>
+        </w:tc>
+        <w:tc>
+          <w:tcPr>
+            <w:tcW w:type="dxa" w:w="1200"/>
+            <w:shd w:fill="F5F2EC" w:color="auto" w:val="clear"/>
+            <w:tcMar>
+              <w:top w:type="dxa" w:w="40"/>
+              <w:left w:type="dxa" w:w="60"/>
+              <w:bottom w:type="dxa" w:w="40"/>
+              <w:right w:type="dxa" w:w="60"/>
+            </w:tcMar>
+          </w:tcPr>
+          <w:p>
+            <w:pPr>
+              <w:jc w:val="center"/>
+            </w:pPr>
+            <w:r>
+              <w:rPr>
+                <w:rFonts w:ascii="Arial" w:cs="Arial" w:eastAsia="Arial" w:hAnsi="Arial"/>
+                <w:b w:val="false"/>
+                <w:bCs w:val="false"/>
+                <w:i w:val="false"/>
+                <w:iCs w:val="false"/>
+                <w:color w:val="4A4A4A"/>
+                <w:sz w:val="14"/>
+                <w:szCs w:val="14"/>
+              </w:rPr>
+              <w:t xml:space="preserve">0,28</w:t>
+            </w:r>
+          </w:p>
+        </w:tc>
+        <w:tc>
+          <w:tcPr>
+            <w:tcW w:type="dxa" w:w="1200"/>
+            <w:shd w:fill="F5F2EC" w:color="auto" w:val="clear"/>
+            <w:tcMar>
+              <w:top w:type="dxa" w:w="40"/>
+              <w:left w:type="dxa" w:w="60"/>
+              <w:bottom w:type="dxa" w:w="40"/>
+              <w:right w:type="dxa" w:w="60"/>
+            </w:tcMar>
+          </w:tcPr>
+          <w:p>
+            <w:pPr>
+              <w:jc w:val="center"/>
+            </w:pPr>
+            <w:r>
+              <w:rPr>
+                <w:rFonts w:ascii="Arial" w:cs="Arial" w:eastAsia="Arial" w:hAnsi="Arial"/>
+                <w:b w:val="false"/>
+                <w:bCs w:val="false"/>
+                <w:i w:val="false"/>
+                <w:iCs w:val="false"/>
+                <w:color w:val="4A4A4A"/>
+                <w:sz w:val="14"/>
+                <w:szCs w:val="14"/>
+              </w:rPr>
+              <w:t xml:space="preserve">—</w:t>
+            </w:r>
+          </w:p>
+        </w:tc>
+      </w:tr>
+      <w:tr>
+        <w:tc>
+          <w:tcPr>
+            <w:tcW w:type="dxa" w:w="1200"/>
+            <w:shd w:fill="F5F2EC" w:color="auto" w:val="clear"/>
+            <w:tcMar>
+              <w:top w:type="dxa" w:w="40"/>
+              <w:left w:type="dxa" w:w="60"/>
+              <w:bottom w:type="dxa" w:w="40"/>
+              <w:right w:type="dxa" w:w="60"/>
+            </w:tcMar>
+          </w:tcPr>
+          <w:p>
+            <w:pPr>
+              <w:jc w:val="center"/>
+            </w:pPr>
+            <w:r>
+              <w:rPr>
+                <w:rFonts w:ascii="Arial" w:cs="Arial" w:eastAsia="Arial" w:hAnsi="Arial"/>
+                <w:b w:val="false"/>
+                <w:bCs w:val="false"/>
+                <w:i w:val="false"/>
+                <w:iCs w:val="false"/>
+                <w:color w:val="4A4A4A"/>
+                <w:sz w:val="14"/>
+                <w:szCs w:val="14"/>
+              </w:rPr>
+              <w:t xml:space="preserve">B</w:t>
+            </w:r>
+          </w:p>
+        </w:tc>
+        <w:tc>
+          <w:tcPr>
+            <w:tcW w:type="dxa" w:w="1300"/>
+            <w:shd w:fill="F5F2EC" w:color="auto" w:val="clear"/>
+            <w:tcMar>
+              <w:top w:type="dxa" w:w="40"/>
+              <w:left w:type="dxa" w:w="60"/>
+              <w:bottom w:type="dxa" w:w="40"/>
+              <w:right w:type="dxa" w:w="60"/>
+            </w:tcMar>
+          </w:tcPr>
+          <w:p>
+            <w:pPr>
+              <w:jc w:val="center"/>
+            </w:pPr>
+            <w:r>
+              <w:rPr>
+                <w:rFonts w:ascii="Arial" w:cs="Arial" w:eastAsia="Arial" w:hAnsi="Arial"/>
+                <w:b w:val="false"/>
+                <w:bCs w:val="false"/>
+                <w:i w:val="false"/>
+                <w:iCs w:val="false"/>
+                <w:color w:val="4A4A4A"/>
+                <w:sz w:val="14"/>
+                <w:szCs w:val="14"/>
+              </w:rPr>
+              <w:t xml:space="preserve">0,47</w:t>
+            </w:r>
+          </w:p>
+        </w:tc>
+        <w:tc>
+          <w:tcPr>
+            <w:tcW w:type="dxa" w:w="1200"/>
+            <w:shd w:fill="F5F2EC" w:color="auto" w:val="clear"/>
+            <w:tcMar>
+              <w:top w:type="dxa" w:w="40"/>
+              <w:left w:type="dxa" w:w="60"/>
+              <w:bottom w:type="dxa" w:w="40"/>
+              <w:right w:type="dxa" w:w="60"/>
+            </w:tcMar>
+          </w:tcPr>
+          <w:p>
+            <w:pPr>
+              <w:jc w:val="center"/>
+            </w:pPr>
+            <w:r>
+              <w:rPr>
+                <w:rFonts w:ascii="Arial" w:cs="Arial" w:eastAsia="Arial" w:hAnsi="Arial"/>
+                <w:b w:val="false"/>
+                <w:bCs w:val="false"/>
+                <w:i w:val="false"/>
+                <w:iCs w:val="false"/>
+                <w:color w:val="4A4A4A"/>
+                <w:sz w:val="14"/>
+                <w:szCs w:val="14"/>
+              </w:rPr>
+              <w:t xml:space="preserve">2,13</w:t>
+            </w:r>
+          </w:p>
+        </w:tc>
+        <w:tc>
+          <w:tcPr>
+            <w:tcW w:type="dxa" w:w="1300"/>
+            <w:shd w:fill="F5F2EC" w:color="auto" w:val="clear"/>
+            <w:tcMar>
+              <w:top w:type="dxa" w:w="40"/>
+              <w:left w:type="dxa" w:w="60"/>
+              <w:bottom w:type="dxa" w:w="40"/>
+              <w:right w:type="dxa" w:w="60"/>
+            </w:tcMar>
+          </w:tcPr>
+          <w:p>
+            <w:pPr>
+              <w:jc w:val="center"/>
+            </w:pPr>
+            <w:r>
+              <w:rPr>
+                <w:rFonts w:ascii="Arial" w:cs="Arial" w:eastAsia="Arial" w:hAnsi="Arial"/>
+                <w:b w:val="false"/>
+                <w:bCs w:val="false"/>
+                <w:i w:val="false"/>
+                <w:iCs w:val="false"/>
+                <w:color w:val="4A4A4A"/>
+                <w:sz w:val="14"/>
+                <w:szCs w:val="14"/>
+              </w:rPr>
+              <w:t xml:space="preserve">0,80</w:t>
+            </w:r>
+          </w:p>
+        </w:tc>
+        <w:tc>
+          <w:tcPr>
+            <w:tcW w:type="dxa" w:w="1200"/>
+            <w:shd w:fill="F5F2EC" w:color="auto" w:val="clear"/>
+            <w:tcMar>
+              <w:top w:type="dxa" w:w="40"/>
+              <w:left w:type="dxa" w:w="60"/>
+              <w:bottom w:type="dxa" w:w="40"/>
+              <w:right w:type="dxa" w:w="60"/>
+            </w:tcMar>
+          </w:tcPr>
+          <w:p>
+            <w:pPr>
+              <w:jc w:val="center"/>
+            </w:pPr>
+            <w:r>
+              <w:rPr>
+                <w:rFonts w:ascii="Arial" w:cs="Arial" w:eastAsia="Arial" w:hAnsi="Arial"/>
+                <w:b w:val="false"/>
+                <w:bCs w:val="false"/>
+                <w:i w:val="false"/>
+                <w:iCs w:val="false"/>
+                <w:color w:val="4A4A4A"/>
+                <w:sz w:val="14"/>
+                <w:szCs w:val="14"/>
+              </w:rPr>
+              <w:t xml:space="preserve">1,25</w:t>
+            </w:r>
+          </w:p>
+        </w:tc>
+        <w:tc>
+          <w:tcPr>
+            <w:tcW w:type="dxa" w:w="1300"/>
+            <w:shd w:fill="F5F2EC" w:color="auto" w:val="clear"/>
+            <w:tcMar>
+              <w:top w:type="dxa" w:w="40"/>
+              <w:left w:type="dxa" w:w="60"/>
+              <w:bottom w:type="dxa" w:w="40"/>
+              <w:right w:type="dxa" w:w="60"/>
+            </w:tcMar>
+          </w:tcPr>
+          <w:p>
+            <w:pPr>
+              <w:jc w:val="center"/>
+            </w:pPr>
+            <w:r>
+              <w:rPr>
+                <w:rFonts w:ascii="Arial" w:cs="Arial" w:eastAsia="Arial" w:hAnsi="Arial"/>
+                <w:b w:val="false"/>
+                <w:bCs w:val="false"/>
+                <w:i w:val="false"/>
+                <w:iCs w:val="false"/>
+                <w:color w:val="4A4A4A"/>
+                <w:sz w:val="14"/>
+                <w:szCs w:val="14"/>
+              </w:rPr>
+              <w:t xml:space="preserve">0,70</w:t>
+            </w:r>
+          </w:p>
+        </w:tc>
+        <w:tc>
+          <w:tcPr>
+            <w:tcW w:type="dxa" w:w="1200"/>
+            <w:shd w:fill="F5F2EC" w:color="auto" w:val="clear"/>
+            <w:tcMar>
+              <w:top w:type="dxa" w:w="40"/>
+              <w:left w:type="dxa" w:w="60"/>
+              <w:bottom w:type="dxa" w:w="40"/>
+              <w:right w:type="dxa" w:w="60"/>
+            </w:tcMar>
+          </w:tcPr>
+          <w:p>
+            <w:pPr>
+              <w:jc w:val="center"/>
+            </w:pPr>
+            <w:r>
+              <w:rPr>
+                <w:rFonts w:ascii="Arial" w:cs="Arial" w:eastAsia="Arial" w:hAnsi="Arial"/>
+                <w:b w:val="false"/>
+                <w:bCs w:val="false"/>
+                <w:i w:val="false"/>
+                <w:iCs w:val="false"/>
+                <w:color w:val="4A4A4A"/>
+                <w:sz w:val="14"/>
+                <w:szCs w:val="14"/>
+              </w:rPr>
+              <w:t xml:space="preserve">1,43</w:t>
+            </w:r>
+          </w:p>
+        </w:tc>
+        <w:tc>
+          <w:tcPr>
+            <w:tcW w:type="dxa" w:w="1200"/>
+            <w:shd w:fill="F5F2EC" w:color="auto" w:val="clear"/>
+            <w:tcMar>
+              <w:top w:type="dxa" w:w="40"/>
+              <w:left w:type="dxa" w:w="60"/>
+              <w:bottom w:type="dxa" w:w="40"/>
+              <w:right w:type="dxa" w:w="60"/>
+            </w:tcMar>
+          </w:tcPr>
+          <w:p>
+            <w:pPr>
+              <w:jc w:val="center"/>
+            </w:pPr>
+            <w:r>
+              <w:rPr>
+                <w:rFonts w:ascii="Arial" w:cs="Arial" w:eastAsia="Arial" w:hAnsi="Arial"/>
+                <w:b w:val="false"/>
+                <w:bCs w:val="false"/>
+                <w:i w:val="false"/>
+                <w:iCs w:val="false"/>
+                <w:color w:val="4A4A4A"/>
+                <w:sz w:val="14"/>
+                <w:szCs w:val="14"/>
+              </w:rPr>
+              <w:t xml:space="preserve">1,70 / 0,59</w:t>
+            </w:r>
+          </w:p>
+        </w:tc>
+      </w:tr>
+      <w:tr>
+        <w:tc>
+          <w:tcPr>
+            <w:tcW w:type="dxa" w:w="1200"/>
+            <w:shd w:fill="F5F2EC" w:color="auto" w:val="clear"/>
+            <w:tcMar>
+              <w:top w:type="dxa" w:w="40"/>
+              <w:left w:type="dxa" w:w="60"/>
+              <w:bottom w:type="dxa" w:w="40"/>
+              <w:right w:type="dxa" w:w="60"/>
+            </w:tcMar>
+          </w:tcPr>
+          <w:p>
+            <w:pPr>
+              <w:jc w:val="center"/>
+            </w:pPr>
+            <w:r>
+              <w:rPr>
+                <w:rFonts w:ascii="Arial" w:cs="Arial" w:eastAsia="Arial" w:hAnsi="Arial"/>
+                <w:b w:val="false"/>
+                <w:bCs w:val="false"/>
+                <w:i w:val="false"/>
+                <w:iCs w:val="false"/>
+                <w:color w:val="4A4A4A"/>
+                <w:sz w:val="14"/>
+                <w:szCs w:val="14"/>
+              </w:rPr>
+              <w:t xml:space="preserve">C</w:t>
+            </w:r>
+          </w:p>
+        </w:tc>
+        <w:tc>
+          <w:tcPr>
+            <w:tcW w:type="dxa" w:w="1300"/>
+            <w:shd w:fill="F5F2EC" w:color="auto" w:val="clear"/>
+            <w:tcMar>
+              <w:top w:type="dxa" w:w="40"/>
+              <w:left w:type="dxa" w:w="60"/>
+              <w:bottom w:type="dxa" w:w="40"/>
+              <w:right w:type="dxa" w:w="60"/>
+            </w:tcMar>
+          </w:tcPr>
+          <w:p>
+            <w:pPr>
+              <w:jc w:val="center"/>
+            </w:pPr>
+            <w:r>
+              <w:rPr>
+                <w:rFonts w:ascii="Arial" w:cs="Arial" w:eastAsia="Arial" w:hAnsi="Arial"/>
+                <w:b w:val="false"/>
+                <w:bCs w:val="false"/>
+                <w:i w:val="false"/>
+                <w:iCs w:val="false"/>
+                <w:color w:val="4A4A4A"/>
+                <w:sz w:val="14"/>
+                <w:szCs w:val="14"/>
+              </w:rPr>
+              <w:t xml:space="preserve">0,47</w:t>
+            </w:r>
+          </w:p>
+        </w:tc>
+        <w:tc>
+          <w:tcPr>
+            <w:tcW w:type="dxa" w:w="1200"/>
+            <w:shd w:fill="F5F2EC" w:color="auto" w:val="clear"/>
+            <w:tcMar>
+              <w:top w:type="dxa" w:w="40"/>
+              <w:left w:type="dxa" w:w="60"/>
+              <w:bottom w:type="dxa" w:w="40"/>
+              <w:right w:type="dxa" w:w="60"/>
+            </w:tcMar>
+          </w:tcPr>
+          <w:p>
+            <w:pPr>
+              <w:jc w:val="center"/>
+            </w:pPr>
+            <w:r>
+              <w:rPr>
+                <w:rFonts w:ascii="Arial" w:cs="Arial" w:eastAsia="Arial" w:hAnsi="Arial"/>
+                <w:b w:val="false"/>
+                <w:bCs w:val="false"/>
+                <w:i w:val="false"/>
+                <w:iCs w:val="false"/>
+                <w:color w:val="4A4A4A"/>
+                <w:sz w:val="14"/>
+                <w:szCs w:val="14"/>
+              </w:rPr>
+              <w:t xml:space="preserve">2,13</w:t>
+            </w:r>
+          </w:p>
+        </w:tc>
+        <w:tc>
+          <w:tcPr>
+            <w:tcW w:type="dxa" w:w="1300"/>
+            <w:shd w:fill="F5F2EC" w:color="auto" w:val="clear"/>
+            <w:tcMar>
+              <w:top w:type="dxa" w:w="40"/>
+              <w:left w:type="dxa" w:w="60"/>
+              <w:bottom w:type="dxa" w:w="40"/>
+              <w:right w:type="dxa" w:w="60"/>
+            </w:tcMar>
+          </w:tcPr>
+          <w:p>
+            <w:pPr>
+              <w:jc w:val="center"/>
+            </w:pPr>
+            <w:r>
+              <w:rPr>
+                <w:rFonts w:ascii="Arial" w:cs="Arial" w:eastAsia="Arial" w:hAnsi="Arial"/>
+                <w:b w:val="false"/>
+                <w:bCs w:val="false"/>
+                <w:i w:val="false"/>
+                <w:iCs w:val="false"/>
+                <w:color w:val="4A4A4A"/>
+                <w:sz w:val="14"/>
+                <w:szCs w:val="14"/>
+              </w:rPr>
+              <w:t xml:space="preserve">0,80</w:t>
+            </w:r>
+          </w:p>
+        </w:tc>
+        <w:tc>
+          <w:tcPr>
+            <w:tcW w:type="dxa" w:w="1200"/>
+            <w:shd w:fill="F5F2EC" w:color="auto" w:val="clear"/>
+            <w:tcMar>
+              <w:top w:type="dxa" w:w="40"/>
+              <w:left w:type="dxa" w:w="60"/>
+              <w:bottom w:type="dxa" w:w="40"/>
+              <w:right w:type="dxa" w:w="60"/>
+            </w:tcMar>
+          </w:tcPr>
+          <w:p>
+            <w:pPr>
+              <w:jc w:val="center"/>
+            </w:pPr>
+            <w:r>
+              <w:rPr>
+                <w:rFonts w:ascii="Arial" w:cs="Arial" w:eastAsia="Arial" w:hAnsi="Arial"/>
+                <w:b w:val="false"/>
+                <w:bCs w:val="false"/>
+                <w:i w:val="false"/>
+                <w:iCs w:val="false"/>
+                <w:color w:val="4A4A4A"/>
+                <w:sz w:val="14"/>
+                <w:szCs w:val="14"/>
+              </w:rPr>
+              <w:t xml:space="preserve">1,25</w:t>
+            </w:r>
+          </w:p>
+        </w:tc>
+        <w:tc>
+          <w:tcPr>
+            <w:tcW w:type="dxa" w:w="1300"/>
+            <w:shd w:fill="F5F2EC" w:color="auto" w:val="clear"/>
+            <w:tcMar>
+              <w:top w:type="dxa" w:w="40"/>
+              <w:left w:type="dxa" w:w="60"/>
+              <w:bottom w:type="dxa" w:w="40"/>
+              <w:right w:type="dxa" w:w="60"/>
+            </w:tcMar>
+          </w:tcPr>
+          <w:p>
+            <w:pPr>
+              <w:jc w:val="center"/>
+            </w:pPr>
+            <w:r>
+              <w:rPr>
+                <w:rFonts w:ascii="Arial" w:cs="Arial" w:eastAsia="Arial" w:hAnsi="Arial"/>
+                <w:b w:val="false"/>
+                <w:bCs w:val="false"/>
+                <w:i w:val="false"/>
+                <w:iCs w:val="false"/>
+                <w:color w:val="4A4A4A"/>
+                <w:sz w:val="14"/>
+                <w:szCs w:val="14"/>
+              </w:rPr>
+              <w:t xml:space="preserve">0,87</w:t>
+            </w:r>
+          </w:p>
+        </w:tc>
+        <w:tc>
+          <w:tcPr>
+            <w:tcW w:type="dxa" w:w="1200"/>
+            <w:shd w:fill="F5F2EC" w:color="auto" w:val="clear"/>
+            <w:tcMar>
+              <w:top w:type="dxa" w:w="40"/>
+              <w:left w:type="dxa" w:w="60"/>
+              <w:bottom w:type="dxa" w:w="40"/>
+              <w:right w:type="dxa" w:w="60"/>
+            </w:tcMar>
+          </w:tcPr>
+          <w:p>
+            <w:pPr>
+              <w:jc w:val="center"/>
+            </w:pPr>
+            <w:r>
+              <w:rPr>
+                <w:rFonts w:ascii="Arial" w:cs="Arial" w:eastAsia="Arial" w:hAnsi="Arial"/>
+                <w:b w:val="false"/>
+                <w:bCs w:val="false"/>
+                <w:i w:val="false"/>
+                <w:iCs w:val="false"/>
+                <w:color w:val="4A4A4A"/>
+                <w:sz w:val="14"/>
+                <w:szCs w:val="14"/>
+              </w:rPr>
+              <w:t xml:space="preserve">1,15</w:t>
+            </w:r>
+          </w:p>
+        </w:tc>
+        <w:tc>
+          <w:tcPr>
+            <w:tcW w:type="dxa" w:w="1200"/>
+            <w:shd w:fill="F5F2EC" w:color="auto" w:val="clear"/>
+            <w:tcMar>
+              <w:top w:type="dxa" w:w="40"/>
+              <w:left w:type="dxa" w:w="60"/>
+              <w:bottom w:type="dxa" w:w="40"/>
+              <w:right w:type="dxa" w:w="60"/>
+            </w:tcMar>
+          </w:tcPr>
+          <w:p>
+            <w:pPr>
+              <w:jc w:val="center"/>
+            </w:pPr>
+            <w:r>
+              <w:rPr>
+                <w:rFonts w:ascii="Arial" w:cs="Arial" w:eastAsia="Arial" w:hAnsi="Arial"/>
+                <w:b w:val="false"/>
+                <w:bCs w:val="false"/>
+                <w:i w:val="false"/>
+                <w:iCs w:val="false"/>
+                <w:color w:val="4A4A4A"/>
+                <w:sz w:val="14"/>
+                <w:szCs w:val="14"/>
+              </w:rPr>
+              <w:t xml:space="preserve">1,70 / 0,59</w:t>
+            </w:r>
+          </w:p>
+        </w:tc>
+      </w:tr>
+      <w:tr>
+        <w:tc>
+          <w:tcPr>
+            <w:tcW w:type="dxa" w:w="1200"/>
+            <w:shd w:fill="E8D9C3" w:color="auto" w:val="clear"/>
+            <w:tcMar>
+              <w:top w:type="dxa" w:w="40"/>
+              <w:left w:type="dxa" w:w="60"/>
+              <w:bottom w:type="dxa" w:w="40"/>
+              <w:right w:type="dxa" w:w="60"/>
+            </w:tcMar>
+          </w:tcPr>
+          <w:p>
+            <w:pPr>
+              <w:jc w:val="center"/>
+            </w:pPr>
+            <w:r>
+              <w:rPr>
+                <w:rFonts w:ascii="Arial" w:cs="Arial" w:eastAsia="Arial" w:hAnsi="Arial"/>
+                <w:b w:val="false"/>
+                <w:bCs w:val="false"/>
+                <w:i w:val="false"/>
+                <w:iCs w:val="false"/>
+                <w:color w:val="4A4A4A"/>
+                <w:sz w:val="14"/>
+                <w:szCs w:val="14"/>
+              </w:rPr>
+              <w:t xml:space="preserve">D</w:t>
+            </w:r>
+          </w:p>
+        </w:tc>
+        <w:tc>
+          <w:tcPr>
+            <w:tcW w:type="dxa" w:w="1300"/>
+            <w:shd w:fill="E8D9C3" w:color="auto" w:val="clear"/>
+            <w:tcMar>
+              <w:top w:type="dxa" w:w="40"/>
+              <w:left w:type="dxa" w:w="60"/>
+              <w:bottom w:type="dxa" w:w="40"/>
+              <w:right w:type="dxa" w:w="60"/>
+            </w:tcMar>
+          </w:tcPr>
+          <w:p>
+            <w:pPr>
+              <w:jc w:val="center"/>
+            </w:pPr>
+            <w:r>
+              <w:rPr>
+                <w:rFonts w:ascii="Arial" w:cs="Arial" w:eastAsia="Arial" w:hAnsi="Arial"/>
+                <w:b w:val="false"/>
+                <w:bCs w:val="false"/>
+                <w:i w:val="false"/>
+                <w:iCs w:val="false"/>
+                <w:color w:val="4A4A4A"/>
+                <w:sz w:val="14"/>
+                <w:szCs w:val="14"/>
+              </w:rPr>
+              <w:t xml:space="preserve">0,38</w:t>
+            </w:r>
+          </w:p>
+        </w:tc>
+        <w:tc>
+          <w:tcPr>
+            <w:tcW w:type="dxa" w:w="1200"/>
+            <w:shd w:fill="E8D9C3" w:color="auto" w:val="clear"/>
+            <w:tcMar>
+              <w:top w:type="dxa" w:w="40"/>
+              <w:left w:type="dxa" w:w="60"/>
+              <w:bottom w:type="dxa" w:w="40"/>
+              <w:right w:type="dxa" w:w="60"/>
+            </w:tcMar>
+          </w:tcPr>
+          <w:p>
+            <w:pPr>
+              <w:jc w:val="center"/>
+            </w:pPr>
+            <w:r>
+              <w:rPr>
+                <w:rFonts w:ascii="Arial" w:cs="Arial" w:eastAsia="Arial" w:hAnsi="Arial"/>
+                <w:b w:val="false"/>
+                <w:bCs w:val="false"/>
+                <w:i w:val="false"/>
+                <w:iCs w:val="false"/>
+                <w:color w:val="4A4A4A"/>
+                <w:sz w:val="14"/>
+                <w:szCs w:val="14"/>
+              </w:rPr>
+              <w:t xml:space="preserve">2,63</w:t>
+            </w:r>
+          </w:p>
+        </w:tc>
+        <w:tc>
+          <w:tcPr>
+            <w:tcW w:type="dxa" w:w="1300"/>
+            <w:shd w:fill="E8D9C3" w:color="auto" w:val="clear"/>
+            <w:tcMar>
+              <w:top w:type="dxa" w:w="40"/>
+              <w:left w:type="dxa" w:w="60"/>
+              <w:bottom w:type="dxa" w:w="40"/>
+              <w:right w:type="dxa" w:w="60"/>
+            </w:tcMar>
+          </w:tcPr>
+          <w:p>
+            <w:pPr>
+              <w:jc w:val="center"/>
+            </w:pPr>
+            <w:r>
+              <w:rPr>
+                <w:rFonts w:ascii="Arial" w:cs="Arial" w:eastAsia="Arial" w:hAnsi="Arial"/>
+                <w:b w:val="false"/>
+                <w:bCs w:val="false"/>
+                <w:i w:val="false"/>
+                <w:iCs w:val="false"/>
+                <w:color w:val="4A4A4A"/>
+                <w:sz w:val="14"/>
+                <w:szCs w:val="14"/>
+              </w:rPr>
+              <w:t xml:space="preserve">0,80</w:t>
+            </w:r>
+          </w:p>
+        </w:tc>
+        <w:tc>
+          <w:tcPr>
+            <w:tcW w:type="dxa" w:w="1200"/>
+            <w:shd w:fill="E8D9C3" w:color="auto" w:val="clear"/>
+            <w:tcMar>
+              <w:top w:type="dxa" w:w="40"/>
+              <w:left w:type="dxa" w:w="60"/>
+              <w:bottom w:type="dxa" w:w="40"/>
+              <w:right w:type="dxa" w:w="60"/>
+            </w:tcMar>
+          </w:tcPr>
+          <w:p>
+            <w:pPr>
+              <w:jc w:val="center"/>
+            </w:pPr>
+            <w:r>
+              <w:rPr>
+                <w:rFonts w:ascii="Arial" w:cs="Arial" w:eastAsia="Arial" w:hAnsi="Arial"/>
+                <w:b w:val="false"/>
+                <w:bCs w:val="false"/>
+                <w:i w:val="false"/>
+                <w:iCs w:val="false"/>
+                <w:color w:val="4A4A4A"/>
+                <w:sz w:val="14"/>
+                <w:szCs w:val="14"/>
+              </w:rPr>
+              <w:t xml:space="preserve">1,25</w:t>
+            </w:r>
+          </w:p>
+        </w:tc>
+        <w:tc>
+          <w:tcPr>
+            <w:tcW w:type="dxa" w:w="1300"/>
+            <w:shd w:fill="E8D9C3" w:color="auto" w:val="clear"/>
+            <w:tcMar>
+              <w:top w:type="dxa" w:w="40"/>
+              <w:left w:type="dxa" w:w="60"/>
+              <w:bottom w:type="dxa" w:w="40"/>
+              <w:right w:type="dxa" w:w="60"/>
+            </w:tcMar>
+          </w:tcPr>
+          <w:p>
+            <w:pPr>
+              <w:jc w:val="center"/>
+            </w:pPr>
+            <w:r>
+              <w:rPr>
+                <w:rFonts w:ascii="Arial" w:cs="Arial" w:eastAsia="Arial" w:hAnsi="Arial"/>
+                <w:b w:val="false"/>
+                <w:bCs w:val="false"/>
+                <w:i w:val="false"/>
+                <w:iCs w:val="false"/>
+                <w:color w:val="4A4A4A"/>
+                <w:sz w:val="14"/>
+                <w:szCs w:val="14"/>
+              </w:rPr>
+              <w:t xml:space="preserve">0,60</w:t>
+            </w:r>
+          </w:p>
+        </w:tc>
+        <w:tc>
+          <w:tcPr>
+            <w:tcW w:type="dxa" w:w="1200"/>
+            <w:shd w:fill="E8D9C3" w:color="auto" w:val="clear"/>
+            <w:tcMar>
+              <w:top w:type="dxa" w:w="40"/>
+              <w:left w:type="dxa" w:w="60"/>
+              <w:bottom w:type="dxa" w:w="40"/>
+              <w:right w:type="dxa" w:w="60"/>
+            </w:tcMar>
+          </w:tcPr>
+          <w:p>
+            <w:pPr>
+              <w:jc w:val="center"/>
+            </w:pPr>
+            <w:r>
+              <w:rPr>
+                <w:rFonts w:ascii="Arial" w:cs="Arial" w:eastAsia="Arial" w:hAnsi="Arial"/>
+                <w:b w:val="false"/>
+                <w:bCs w:val="false"/>
+                <w:i w:val="false"/>
+                <w:iCs w:val="false"/>
+                <w:color w:val="4A4A4A"/>
+                <w:sz w:val="14"/>
+                <w:szCs w:val="14"/>
+              </w:rPr>
+              <w:t xml:space="preserve">1,67</w:t>
+            </w:r>
+          </w:p>
+        </w:tc>
+        <w:tc>
+          <w:tcPr>
+            <w:tcW w:type="dxa" w:w="1200"/>
+            <w:shd w:fill="E8D9C3" w:color="auto" w:val="clear"/>
+            <w:tcMar>
+              <w:top w:type="dxa" w:w="40"/>
+              <w:left w:type="dxa" w:w="60"/>
+              <w:bottom w:type="dxa" w:w="40"/>
+              <w:right w:type="dxa" w:w="60"/>
+            </w:tcMar>
+          </w:tcPr>
+          <w:p>
+            <w:pPr>
+              <w:jc w:val="center"/>
+            </w:pPr>
+            <w:r>
+              <w:rPr>
+                <w:rFonts w:ascii="Arial" w:cs="Arial" w:eastAsia="Arial" w:hAnsi="Arial"/>
+                <w:b w:val="false"/>
+                <w:bCs w:val="false"/>
+                <w:i w:val="false"/>
+                <w:iCs w:val="false"/>
+                <w:color w:val="4A4A4A"/>
+                <w:sz w:val="14"/>
+                <w:szCs w:val="14"/>
+              </w:rPr>
+              <w:t xml:space="preserve">1,70 / 0,59</w:t>
+            </w:r>
+          </w:p>
+        </w:tc>
+      </w:tr>
+      <w:tr>
+        <w:tc>
+          <w:tcPr>
+            <w:tcW w:type="dxa" w:w="1200"/>
+            <w:shd w:fill="F5F2EC" w:color="auto" w:val="clear"/>
+            <w:tcMar>
+              <w:top w:type="dxa" w:w="40"/>
+              <w:left w:type="dxa" w:w="60"/>
+              <w:bottom w:type="dxa" w:w="40"/>
+              <w:right w:type="dxa" w:w="60"/>
+            </w:tcMar>
+          </w:tcPr>
+          <w:p>
+            <w:pPr>
+              <w:jc w:val="center"/>
+            </w:pPr>
+            <w:r>
+              <w:rPr>
+                <w:rFonts w:ascii="Arial" w:cs="Arial" w:eastAsia="Arial" w:hAnsi="Arial"/>
+                <w:b w:val="false"/>
+                <w:bCs w:val="false"/>
+                <w:i w:val="false"/>
+                <w:iCs w:val="false"/>
+                <w:color w:val="4A4A4A"/>
+                <w:sz w:val="14"/>
+                <w:szCs w:val="14"/>
+              </w:rPr>
+              <w:t xml:space="preserve">E</w:t>
+            </w:r>
+          </w:p>
+        </w:tc>
+        <w:tc>
+          <w:tcPr>
+            <w:tcW w:type="dxa" w:w="1300"/>
+            <w:shd w:fill="F5F2EC" w:color="auto" w:val="clear"/>
+            <w:tcMar>
+              <w:top w:type="dxa" w:w="40"/>
+              <w:left w:type="dxa" w:w="60"/>
+              <w:bottom w:type="dxa" w:w="40"/>
+              <w:right w:type="dxa" w:w="60"/>
+            </w:tcMar>
+          </w:tcPr>
+          <w:p>
+            <w:pPr>
+              <w:jc w:val="center"/>
+            </w:pPr>
+            <w:r>
+              <w:rPr>
+                <w:rFonts w:ascii="Arial" w:cs="Arial" w:eastAsia="Arial" w:hAnsi="Arial"/>
+                <w:b w:val="false"/>
+                <w:bCs w:val="false"/>
+                <w:i w:val="false"/>
+                <w:iCs w:val="false"/>
+                <w:color w:val="4A4A4A"/>
+                <w:sz w:val="14"/>
+                <w:szCs w:val="14"/>
+              </w:rPr>
+              <w:t xml:space="preserve">0,33</w:t>
+            </w:r>
+          </w:p>
+        </w:tc>
+        <w:tc>
+          <w:tcPr>
+            <w:tcW w:type="dxa" w:w="1200"/>
+            <w:shd w:fill="F5F2EC" w:color="auto" w:val="clear"/>
+            <w:tcMar>
+              <w:top w:type="dxa" w:w="40"/>
+              <w:left w:type="dxa" w:w="60"/>
+              <w:bottom w:type="dxa" w:w="40"/>
+              <w:right w:type="dxa" w:w="60"/>
+            </w:tcMar>
+          </w:tcPr>
+          <w:p>
+            <w:pPr>
+              <w:jc w:val="center"/>
+            </w:pPr>
+            <w:r>
+              <w:rPr>
+                <w:rFonts w:ascii="Arial" w:cs="Arial" w:eastAsia="Arial" w:hAnsi="Arial"/>
+                <w:b w:val="false"/>
+                <w:bCs w:val="false"/>
+                <w:i w:val="false"/>
+                <w:iCs w:val="false"/>
+                <w:color w:val="4A4A4A"/>
+                <w:sz w:val="14"/>
+                <w:szCs w:val="14"/>
+              </w:rPr>
+              <w:t xml:space="preserve">3,03</w:t>
+            </w:r>
+          </w:p>
+        </w:tc>
+        <w:tc>
+          <w:tcPr>
+            <w:tcW w:type="dxa" w:w="1300"/>
+            <w:shd w:fill="F5F2EC" w:color="auto" w:val="clear"/>
+            <w:tcMar>
+              <w:top w:type="dxa" w:w="40"/>
+              <w:left w:type="dxa" w:w="60"/>
+              <w:bottom w:type="dxa" w:w="40"/>
+              <w:right w:type="dxa" w:w="60"/>
+            </w:tcMar>
+          </w:tcPr>
+          <w:p>
+            <w:pPr>
+              <w:jc w:val="center"/>
+            </w:pPr>
+            <w:r>
+              <w:rPr>
+                <w:rFonts w:ascii="Arial" w:cs="Arial" w:eastAsia="Arial" w:hAnsi="Arial"/>
+                <w:b w:val="false"/>
+                <w:bCs w:val="false"/>
+                <w:i w:val="false"/>
+                <w:iCs w:val="false"/>
+                <w:color w:val="4A4A4A"/>
+                <w:sz w:val="14"/>
+                <w:szCs w:val="14"/>
+              </w:rPr>
+              <w:t xml:space="preserve">0,60</w:t>
+            </w:r>
+          </w:p>
+        </w:tc>
+        <w:tc>
+          <w:tcPr>
+            <w:tcW w:type="dxa" w:w="1200"/>
+            <w:shd w:fill="F5F2EC" w:color="auto" w:val="clear"/>
+            <w:tcMar>
+              <w:top w:type="dxa" w:w="40"/>
+              <w:left w:type="dxa" w:w="60"/>
+              <w:bottom w:type="dxa" w:w="40"/>
+              <w:right w:type="dxa" w:w="60"/>
+            </w:tcMar>
+          </w:tcPr>
+          <w:p>
+            <w:pPr>
+              <w:jc w:val="center"/>
+            </w:pPr>
+            <w:r>
+              <w:rPr>
+                <w:rFonts w:ascii="Arial" w:cs="Arial" w:eastAsia="Arial" w:hAnsi="Arial"/>
+                <w:b w:val="false"/>
+                <w:bCs w:val="false"/>
+                <w:i w:val="false"/>
+                <w:iCs w:val="false"/>
+                <w:color w:val="4A4A4A"/>
+                <w:sz w:val="14"/>
+                <w:szCs w:val="14"/>
+              </w:rPr>
+              <w:t xml:space="preserve">1,67</w:t>
+            </w:r>
+          </w:p>
+        </w:tc>
+        <w:tc>
+          <w:tcPr>
+            <w:tcW w:type="dxa" w:w="1300"/>
+            <w:shd w:fill="F5F2EC" w:color="auto" w:val="clear"/>
+            <w:tcMar>
+              <w:top w:type="dxa" w:w="40"/>
+              <w:left w:type="dxa" w:w="60"/>
+              <w:bottom w:type="dxa" w:w="40"/>
+              <w:right w:type="dxa" w:w="60"/>
+            </w:tcMar>
+          </w:tcPr>
+          <w:p>
+            <w:pPr>
+              <w:jc w:val="center"/>
+            </w:pPr>
+            <w:r>
+              <w:rPr>
+                <w:rFonts w:ascii="Arial" w:cs="Arial" w:eastAsia="Arial" w:hAnsi="Arial"/>
+                <w:b w:val="false"/>
+                <w:bCs w:val="false"/>
+                <w:i w:val="false"/>
+                <w:iCs w:val="false"/>
+                <w:color w:val="4A4A4A"/>
+                <w:sz w:val="14"/>
+                <w:szCs w:val="14"/>
+              </w:rPr>
+              <w:t xml:space="preserve">0,60</w:t>
+            </w:r>
+          </w:p>
+        </w:tc>
+        <w:tc>
+          <w:tcPr>
+            <w:tcW w:type="dxa" w:w="1200"/>
+            <w:shd w:fill="F5F2EC" w:color="auto" w:val="clear"/>
+            <w:tcMar>
+              <w:top w:type="dxa" w:w="40"/>
+              <w:left w:type="dxa" w:w="60"/>
+              <w:bottom w:type="dxa" w:w="40"/>
+              <w:right w:type="dxa" w:w="60"/>
+            </w:tcMar>
+          </w:tcPr>
+          <w:p>
+            <w:pPr>
+              <w:jc w:val="center"/>
+            </w:pPr>
+            <w:r>
+              <w:rPr>
+                <w:rFonts w:ascii="Arial" w:cs="Arial" w:eastAsia="Arial" w:hAnsi="Arial"/>
+                <w:b w:val="false"/>
+                <w:bCs w:val="false"/>
+                <w:i w:val="false"/>
+                <w:iCs w:val="false"/>
+                <w:color w:val="4A4A4A"/>
+                <w:sz w:val="14"/>
+                <w:szCs w:val="14"/>
+              </w:rPr>
+              <w:t xml:space="preserve">1,67</w:t>
+            </w:r>
+          </w:p>
+        </w:tc>
+        <w:tc>
+          <w:tcPr>
+            <w:tcW w:type="dxa" w:w="1200"/>
+            <w:shd w:fill="F5F2EC" w:color="auto" w:val="clear"/>
+            <w:tcMar>
+              <w:top w:type="dxa" w:w="40"/>
+              <w:left w:type="dxa" w:w="60"/>
+              <w:bottom w:type="dxa" w:w="40"/>
+              <w:right w:type="dxa" w:w="60"/>
+            </w:tcMar>
+          </w:tcPr>
+          <w:p>
+            <w:pPr>
+              <w:jc w:val="center"/>
+            </w:pPr>
+            <w:r>
+              <w:rPr>
+                <w:rFonts w:ascii="Arial" w:cs="Arial" w:eastAsia="Arial" w:hAnsi="Arial"/>
+                <w:b w:val="false"/>
+                <w:bCs w:val="false"/>
+                <w:i w:val="false"/>
+                <w:iCs w:val="false"/>
+                <w:color w:val="4A4A4A"/>
+                <w:sz w:val="14"/>
+                <w:szCs w:val="14"/>
+              </w:rPr>
+              <w:t xml:space="preserve">1,70 / 0,59</w:t>
+            </w:r>
+          </w:p>
+        </w:tc>
+      </w:tr>
+      <w:tr>
+        <w:tc>
+          <w:tcPr>
+            <w:tcW w:type="dxa" w:w="1200"/>
+            <w:shd w:fill="F5F2EC" w:color="auto" w:val="clear"/>
+            <w:tcMar>
+              <w:top w:type="dxa" w:w="40"/>
+              <w:left w:type="dxa" w:w="60"/>
+              <w:bottom w:type="dxa" w:w="40"/>
+              <w:right w:type="dxa" w:w="60"/>
+            </w:tcMar>
+          </w:tcPr>
+          <w:p>
+            <w:pPr>
+              <w:jc w:val="center"/>
+            </w:pPr>
+            <w:r>
+              <w:rPr>
+                <w:rFonts w:ascii="Arial" w:cs="Arial" w:eastAsia="Arial" w:hAnsi="Arial"/>
+                <w:b w:val="false"/>
+                <w:bCs w:val="false"/>
+                <w:i w:val="false"/>
+                <w:iCs w:val="false"/>
+                <w:color w:val="4A4A4A"/>
+                <w:sz w:val="14"/>
+                <w:szCs w:val="14"/>
+              </w:rPr>
+              <w:t xml:space="preserve">F</w:t>
+            </w:r>
+          </w:p>
+        </w:tc>
+        <w:tc>
+          <w:tcPr>
+            <w:tcW w:type="dxa" w:w="1300"/>
+            <w:shd w:fill="F5F2EC" w:color="auto" w:val="clear"/>
+            <w:tcMar>
+              <w:top w:type="dxa" w:w="40"/>
+              <w:left w:type="dxa" w:w="60"/>
+              <w:bottom w:type="dxa" w:w="40"/>
+              <w:right w:type="dxa" w:w="60"/>
+            </w:tcMar>
+          </w:tcPr>
+          <w:p>
+            <w:pPr>
+              <w:jc w:val="center"/>
+            </w:pPr>
+            <w:r>
+              <w:rPr>
+                <w:rFonts w:ascii="Arial" w:cs="Arial" w:eastAsia="Arial" w:hAnsi="Arial"/>
+                <w:b w:val="false"/>
+                <w:bCs w:val="false"/>
+                <w:i w:val="false"/>
+                <w:iCs w:val="false"/>
+                <w:color w:val="4A4A4A"/>
+                <w:sz w:val="14"/>
+                <w:szCs w:val="14"/>
+              </w:rPr>
+              <w:t xml:space="preserve">0,28</w:t>
+            </w:r>
+          </w:p>
+        </w:tc>
+        <w:tc>
+          <w:tcPr>
+            <w:tcW w:type="dxa" w:w="1200"/>
+            <w:shd w:fill="F5F2EC" w:color="auto" w:val="clear"/>
+            <w:tcMar>
+              <w:top w:type="dxa" w:w="40"/>
+              <w:left w:type="dxa" w:w="60"/>
+              <w:bottom w:type="dxa" w:w="40"/>
+              <w:right w:type="dxa" w:w="60"/>
+            </w:tcMar>
+          </w:tcPr>
+          <w:p>
+            <w:pPr>
+              <w:jc w:val="center"/>
+            </w:pPr>
+            <w:r>
+              <w:rPr>
+                <w:rFonts w:ascii="Arial" w:cs="Arial" w:eastAsia="Arial" w:hAnsi="Arial"/>
+                <w:b w:val="false"/>
+                <w:bCs w:val="false"/>
+                <w:i w:val="false"/>
+                <w:iCs w:val="false"/>
+                <w:color w:val="4A4A4A"/>
+                <w:sz w:val="14"/>
+                <w:szCs w:val="14"/>
+              </w:rPr>
+              <w:t xml:space="preserve">3,57</w:t>
+            </w:r>
+          </w:p>
+        </w:tc>
+        <w:tc>
+          <w:tcPr>
+            <w:tcW w:type="dxa" w:w="1300"/>
+            <w:shd w:fill="F5F2EC" w:color="auto" w:val="clear"/>
+            <w:tcMar>
+              <w:top w:type="dxa" w:w="40"/>
+              <w:left w:type="dxa" w:w="60"/>
+              <w:bottom w:type="dxa" w:w="40"/>
+              <w:right w:type="dxa" w:w="60"/>
+            </w:tcMar>
+          </w:tcPr>
+          <w:p>
+            <w:pPr>
+              <w:jc w:val="center"/>
+            </w:pPr>
+            <w:r>
+              <w:rPr>
+                <w:rFonts w:ascii="Arial" w:cs="Arial" w:eastAsia="Arial" w:hAnsi="Arial"/>
+                <w:b w:val="false"/>
+                <w:bCs w:val="false"/>
+                <w:i w:val="false"/>
+                <w:iCs w:val="false"/>
+                <w:color w:val="4A4A4A"/>
+                <w:sz w:val="14"/>
+                <w:szCs w:val="14"/>
+              </w:rPr>
+              <w:t xml:space="preserve">0,45</w:t>
+            </w:r>
+          </w:p>
+        </w:tc>
+        <w:tc>
+          <w:tcPr>
+            <w:tcW w:type="dxa" w:w="1200"/>
+            <w:shd w:fill="F5F2EC" w:color="auto" w:val="clear"/>
+            <w:tcMar>
+              <w:top w:type="dxa" w:w="40"/>
+              <w:left w:type="dxa" w:w="60"/>
+              <w:bottom w:type="dxa" w:w="40"/>
+              <w:right w:type="dxa" w:w="60"/>
+            </w:tcMar>
+          </w:tcPr>
+          <w:p>
+            <w:pPr>
+              <w:jc w:val="center"/>
+            </w:pPr>
+            <w:r>
+              <w:rPr>
+                <w:rFonts w:ascii="Arial" w:cs="Arial" w:eastAsia="Arial" w:hAnsi="Arial"/>
+                <w:b w:val="false"/>
+                <w:bCs w:val="false"/>
+                <w:i w:val="false"/>
+                <w:iCs w:val="false"/>
+                <w:color w:val="4A4A4A"/>
+                <w:sz w:val="14"/>
+                <w:szCs w:val="14"/>
+              </w:rPr>
+              <w:t xml:space="preserve">2,22</w:t>
+            </w:r>
+          </w:p>
+        </w:tc>
+        <w:tc>
+          <w:tcPr>
+            <w:tcW w:type="dxa" w:w="1300"/>
+            <w:shd w:fill="F5F2EC" w:color="auto" w:val="clear"/>
+            <w:tcMar>
+              <w:top w:type="dxa" w:w="40"/>
+              <w:left w:type="dxa" w:w="60"/>
+              <w:bottom w:type="dxa" w:w="40"/>
+              <w:right w:type="dxa" w:w="60"/>
+            </w:tcMar>
+          </w:tcPr>
+          <w:p>
+            <w:pPr>
+              <w:jc w:val="center"/>
+            </w:pPr>
+            <w:r>
+              <w:rPr>
+                <w:rFonts w:ascii="Arial" w:cs="Arial" w:eastAsia="Arial" w:hAnsi="Arial"/>
+                <w:b w:val="false"/>
+                <w:bCs w:val="false"/>
+                <w:i w:val="false"/>
+                <w:iCs w:val="false"/>
+                <w:color w:val="4A4A4A"/>
+                <w:sz w:val="14"/>
+                <w:szCs w:val="14"/>
+              </w:rPr>
+              <w:t xml:space="preserve">0,50</w:t>
+            </w:r>
+          </w:p>
+        </w:tc>
+        <w:tc>
+          <w:tcPr>
+            <w:tcW w:type="dxa" w:w="1200"/>
+            <w:shd w:fill="F5F2EC" w:color="auto" w:val="clear"/>
+            <w:tcMar>
+              <w:top w:type="dxa" w:w="40"/>
+              <w:left w:type="dxa" w:w="60"/>
+              <w:bottom w:type="dxa" w:w="40"/>
+              <w:right w:type="dxa" w:w="60"/>
+            </w:tcMar>
+          </w:tcPr>
+          <w:p>
+            <w:pPr>
+              <w:jc w:val="center"/>
+            </w:pPr>
+            <w:r>
+              <w:rPr>
+                <w:rFonts w:ascii="Arial" w:cs="Arial" w:eastAsia="Arial" w:hAnsi="Arial"/>
+                <w:b w:val="false"/>
+                <w:bCs w:val="false"/>
+                <w:i w:val="false"/>
+                <w:iCs w:val="false"/>
+                <w:color w:val="4A4A4A"/>
+                <w:sz w:val="14"/>
+                <w:szCs w:val="14"/>
+              </w:rPr>
+              <w:t xml:space="preserve">2,00</w:t>
+            </w:r>
+          </w:p>
+        </w:tc>
+        <w:tc>
+          <w:tcPr>
+            <w:tcW w:type="dxa" w:w="1200"/>
+            <w:shd w:fill="F5F2EC" w:color="auto" w:val="clear"/>
+            <w:tcMar>
+              <w:top w:type="dxa" w:w="40"/>
+              <w:left w:type="dxa" w:w="60"/>
+              <w:bottom w:type="dxa" w:w="40"/>
+              <w:right w:type="dxa" w:w="60"/>
+            </w:tcMar>
+          </w:tcPr>
+          <w:p>
+            <w:pPr>
+              <w:jc w:val="center"/>
+            </w:pPr>
+            <w:r>
+              <w:rPr>
+                <w:rFonts w:ascii="Arial" w:cs="Arial" w:eastAsia="Arial" w:hAnsi="Arial"/>
+                <w:b w:val="false"/>
+                <w:bCs w:val="false"/>
+                <w:i w:val="false"/>
+                <w:iCs w:val="false"/>
+                <w:color w:val="4A4A4A"/>
+                <w:sz w:val="14"/>
+                <w:szCs w:val="14"/>
+              </w:rPr>
+              <w:t xml:space="preserve">1,70 / 0,59</w:t>
+            </w:r>
+          </w:p>
+        </w:tc>
+      </w:tr>
+      <w:tr>
+        <w:tc>
+          <w:tcPr>
+            <w:tcW w:type="dxa" w:w="1200"/>
+            <w:shd w:fill="F5F2EC" w:color="auto" w:val="clear"/>
+            <w:tcMar>
+              <w:top w:type="dxa" w:w="40"/>
+              <w:left w:type="dxa" w:w="60"/>
+              <w:bottom w:type="dxa" w:w="40"/>
+              <w:right w:type="dxa" w:w="60"/>
+            </w:tcMar>
+          </w:tcPr>
+          <w:p>
+            <w:pPr>
+              <w:jc w:val="center"/>
+            </w:pPr>
+            <w:r>
+              <w:rPr>
+                <w:rFonts w:ascii="Arial" w:cs="Arial" w:eastAsia="Arial" w:hAnsi="Arial"/>
+                <w:b w:val="false"/>
+                <w:bCs w:val="false"/>
+                <w:i w:val="false"/>
+                <w:iCs w:val="false"/>
+                <w:color w:val="4A4A4A"/>
+                <w:sz w:val="14"/>
+                <w:szCs w:val="14"/>
+              </w:rPr>
+              <w:t xml:space="preserve">G</w:t>
+            </w:r>
+          </w:p>
+        </w:tc>
+        <w:tc>
+          <w:tcPr>
+            <w:tcW w:type="dxa" w:w="1300"/>
+            <w:shd w:fill="F5F2EC" w:color="auto" w:val="clear"/>
+            <w:tcMar>
+              <w:top w:type="dxa" w:w="40"/>
+              <w:left w:type="dxa" w:w="60"/>
+              <w:bottom w:type="dxa" w:w="40"/>
+              <w:right w:type="dxa" w:w="60"/>
+            </w:tcMar>
+          </w:tcPr>
+          <w:p>
+            <w:pPr>
+              <w:jc w:val="center"/>
+            </w:pPr>
+            <w:r>
+              <w:rPr>
+                <w:rFonts w:ascii="Arial" w:cs="Arial" w:eastAsia="Arial" w:hAnsi="Arial"/>
+                <w:b w:val="false"/>
+                <w:bCs w:val="false"/>
+                <w:i w:val="false"/>
+                <w:iCs w:val="false"/>
+                <w:color w:val="4A4A4A"/>
+                <w:sz w:val="14"/>
+                <w:szCs w:val="14"/>
+              </w:rPr>
+              <w:t xml:space="preserve">0,28</w:t>
+            </w:r>
+          </w:p>
+        </w:tc>
+        <w:tc>
+          <w:tcPr>
+            <w:tcW w:type="dxa" w:w="1200"/>
+            <w:shd w:fill="F5F2EC" w:color="auto" w:val="clear"/>
+            <w:tcMar>
+              <w:top w:type="dxa" w:w="40"/>
+              <w:left w:type="dxa" w:w="60"/>
+              <w:bottom w:type="dxa" w:w="40"/>
+              <w:right w:type="dxa" w:w="60"/>
+            </w:tcMar>
+          </w:tcPr>
+          <w:p>
+            <w:pPr>
+              <w:jc w:val="center"/>
+            </w:pPr>
+            <w:r>
+              <w:rPr>
+                <w:rFonts w:ascii="Arial" w:cs="Arial" w:eastAsia="Arial" w:hAnsi="Arial"/>
+                <w:b w:val="false"/>
+                <w:bCs w:val="false"/>
+                <w:i w:val="false"/>
+                <w:iCs w:val="false"/>
+                <w:color w:val="4A4A4A"/>
+                <w:sz w:val="14"/>
+                <w:szCs w:val="14"/>
+              </w:rPr>
+              <w:t xml:space="preserve">3,57</w:t>
+            </w:r>
+          </w:p>
+        </w:tc>
+        <w:tc>
+          <w:tcPr>
+            <w:tcW w:type="dxa" w:w="1300"/>
+            <w:shd w:fill="F5F2EC" w:color="auto" w:val="clear"/>
+            <w:tcMar>
+              <w:top w:type="dxa" w:w="40"/>
+              <w:left w:type="dxa" w:w="60"/>
+              <w:bottom w:type="dxa" w:w="40"/>
+              <w:right w:type="dxa" w:w="60"/>
+            </w:tcMar>
+          </w:tcPr>
+          <w:p>
+            <w:pPr>
+              <w:jc w:val="center"/>
+            </w:pPr>
+            <w:r>
+              <w:rPr>
+                <w:rFonts w:ascii="Arial" w:cs="Arial" w:eastAsia="Arial" w:hAnsi="Arial"/>
+                <w:b w:val="false"/>
+                <w:bCs w:val="false"/>
+                <w:i w:val="false"/>
+                <w:iCs w:val="false"/>
+                <w:color w:val="4A4A4A"/>
+                <w:sz w:val="14"/>
+                <w:szCs w:val="14"/>
+              </w:rPr>
+              <w:t xml:space="preserve">0,40</w:t>
+            </w:r>
+          </w:p>
+        </w:tc>
+        <w:tc>
+          <w:tcPr>
+            <w:tcW w:type="dxa" w:w="1200"/>
+            <w:shd w:fill="F5F2EC" w:color="auto" w:val="clear"/>
+            <w:tcMar>
+              <w:top w:type="dxa" w:w="40"/>
+              <w:left w:type="dxa" w:w="60"/>
+              <w:bottom w:type="dxa" w:w="40"/>
+              <w:right w:type="dxa" w:w="60"/>
+            </w:tcMar>
+          </w:tcPr>
+          <w:p>
+            <w:pPr>
+              <w:jc w:val="center"/>
+            </w:pPr>
+            <w:r>
+              <w:rPr>
+                <w:rFonts w:ascii="Arial" w:cs="Arial" w:eastAsia="Arial" w:hAnsi="Arial"/>
+                <w:b w:val="false"/>
+                <w:bCs w:val="false"/>
+                <w:i w:val="false"/>
+                <w:iCs w:val="false"/>
+                <w:color w:val="4A4A4A"/>
+                <w:sz w:val="14"/>
+                <w:szCs w:val="14"/>
+              </w:rPr>
+              <w:t xml:space="preserve">2,50</w:t>
+            </w:r>
+          </w:p>
+        </w:tc>
+        <w:tc>
+          <w:tcPr>
+            <w:tcW w:type="dxa" w:w="1300"/>
+            <w:shd w:fill="F5F2EC" w:color="auto" w:val="clear"/>
+            <w:tcMar>
+              <w:top w:type="dxa" w:w="40"/>
+              <w:left w:type="dxa" w:w="60"/>
+              <w:bottom w:type="dxa" w:w="40"/>
+              <w:right w:type="dxa" w:w="60"/>
+            </w:tcMar>
+          </w:tcPr>
+          <w:p>
+            <w:pPr>
+              <w:jc w:val="center"/>
+            </w:pPr>
+            <w:r>
+              <w:rPr>
+                <w:rFonts w:ascii="Arial" w:cs="Arial" w:eastAsia="Arial" w:hAnsi="Arial"/>
+                <w:b w:val="false"/>
+                <w:bCs w:val="false"/>
+                <w:i w:val="false"/>
+                <w:iCs w:val="false"/>
+                <w:color w:val="4A4A4A"/>
+                <w:sz w:val="14"/>
+                <w:szCs w:val="14"/>
+              </w:rPr>
+              <w:t xml:space="preserve">0,39</w:t>
+            </w:r>
+          </w:p>
+        </w:tc>
+        <w:tc>
+          <w:tcPr>
+            <w:tcW w:type="dxa" w:w="1200"/>
+            <w:shd w:fill="F5F2EC" w:color="auto" w:val="clear"/>
+            <w:tcMar>
+              <w:top w:type="dxa" w:w="40"/>
+              <w:left w:type="dxa" w:w="60"/>
+              <w:bottom w:type="dxa" w:w="40"/>
+              <w:right w:type="dxa" w:w="60"/>
+            </w:tcMar>
+          </w:tcPr>
+          <w:p>
+            <w:pPr>
+              <w:jc w:val="center"/>
+            </w:pPr>
+            <w:r>
+              <w:rPr>
+                <w:rFonts w:ascii="Arial" w:cs="Arial" w:eastAsia="Arial" w:hAnsi="Arial"/>
+                <w:b w:val="false"/>
+                <w:bCs w:val="false"/>
+                <w:i w:val="false"/>
+                <w:iCs w:val="false"/>
+                <w:color w:val="4A4A4A"/>
+                <w:sz w:val="14"/>
+                <w:szCs w:val="14"/>
+              </w:rPr>
+              <w:t xml:space="preserve">2,56</w:t>
+            </w:r>
+          </w:p>
+        </w:tc>
+        <w:tc>
+          <w:tcPr>
+            <w:tcW w:type="dxa" w:w="1200"/>
+            <w:shd w:fill="F5F2EC" w:color="auto" w:val="clear"/>
+            <w:tcMar>
+              <w:top w:type="dxa" w:w="40"/>
+              <w:left w:type="dxa" w:w="60"/>
+              <w:bottom w:type="dxa" w:w="40"/>
+              <w:right w:type="dxa" w:w="60"/>
+            </w:tcMar>
+          </w:tcPr>
+          <w:p>
+            <w:pPr>
+              <w:jc w:val="center"/>
+            </w:pPr>
+            <w:r>
+              <w:rPr>
+                <w:rFonts w:ascii="Arial" w:cs="Arial" w:eastAsia="Arial" w:hAnsi="Arial"/>
+                <w:b w:val="false"/>
+                <w:bCs w:val="false"/>
+                <w:i w:val="false"/>
+                <w:iCs w:val="false"/>
+                <w:color w:val="4A4A4A"/>
+                <w:sz w:val="14"/>
+                <w:szCs w:val="14"/>
+              </w:rPr>
+              <w:t xml:space="preserve">1,70 / 0,59</w:t>
+            </w:r>
+          </w:p>
+        </w:tc>
+      </w:tr>
+      <w:tr>
+        <w:tc>
+          <w:tcPr>
+            <w:tcW w:type="dxa" w:w="1200"/>
+            <w:shd w:fill="F5F2EC" w:color="auto" w:val="clear"/>
+            <w:tcMar>
+              <w:top w:type="dxa" w:w="40"/>
+              <w:left w:type="dxa" w:w="60"/>
+              <w:bottom w:type="dxa" w:w="40"/>
+              <w:right w:type="dxa" w:w="60"/>
+            </w:tcMar>
+          </w:tcPr>
+          <w:p>
+            <w:pPr>
+              <w:jc w:val="center"/>
+            </w:pPr>
+            <w:r>
+              <w:rPr>
+                <w:rFonts w:ascii="Arial" w:cs="Arial" w:eastAsia="Arial" w:hAnsi="Arial"/>
+                <w:b w:val="false"/>
+                <w:bCs w:val="false"/>
+                <w:i w:val="false"/>
+                <w:iCs w:val="false"/>
+                <w:color w:val="4A4A4A"/>
+                <w:sz w:val="14"/>
+                <w:szCs w:val="14"/>
+              </w:rPr>
+              <w:t xml:space="preserve">H</w:t>
+            </w:r>
+          </w:p>
+        </w:tc>
+        <w:tc>
+          <w:tcPr>
+            <w:tcW w:type="dxa" w:w="1300"/>
+            <w:shd w:fill="F5F2EC" w:color="auto" w:val="clear"/>
+            <w:tcMar>
+              <w:top w:type="dxa" w:w="40"/>
+              <w:left w:type="dxa" w:w="60"/>
+              <w:bottom w:type="dxa" w:w="40"/>
+              <w:right w:type="dxa" w:w="60"/>
+            </w:tcMar>
+          </w:tcPr>
+          <w:p>
+            <w:pPr>
+              <w:jc w:val="center"/>
+            </w:pPr>
+            <w:r>
+              <w:rPr>
+                <w:rFonts w:ascii="Arial" w:cs="Arial" w:eastAsia="Arial" w:hAnsi="Arial"/>
+                <w:b w:val="false"/>
+                <w:bCs w:val="false"/>
+                <w:i w:val="false"/>
+                <w:iCs w:val="false"/>
+                <w:color w:val="4A4A4A"/>
+                <w:sz w:val="14"/>
+                <w:szCs w:val="14"/>
+              </w:rPr>
+              <w:t xml:space="preserve">0,25</w:t>
+            </w:r>
+          </w:p>
+        </w:tc>
+        <w:tc>
+          <w:tcPr>
+            <w:tcW w:type="dxa" w:w="1200"/>
+            <w:shd w:fill="F5F2EC" w:color="auto" w:val="clear"/>
+            <w:tcMar>
+              <w:top w:type="dxa" w:w="40"/>
+              <w:left w:type="dxa" w:w="60"/>
+              <w:bottom w:type="dxa" w:w="40"/>
+              <w:right w:type="dxa" w:w="60"/>
+            </w:tcMar>
+          </w:tcPr>
+          <w:p>
+            <w:pPr>
+              <w:jc w:val="center"/>
+            </w:pPr>
+            <w:r>
+              <w:rPr>
+                <w:rFonts w:ascii="Arial" w:cs="Arial" w:eastAsia="Arial" w:hAnsi="Arial"/>
+                <w:b w:val="false"/>
+                <w:bCs w:val="false"/>
+                <w:i w:val="false"/>
+                <w:iCs w:val="false"/>
+                <w:color w:val="4A4A4A"/>
+                <w:sz w:val="14"/>
+                <w:szCs w:val="14"/>
+              </w:rPr>
+              <w:t xml:space="preserve">4,00</w:t>
+            </w:r>
+          </w:p>
+        </w:tc>
+        <w:tc>
+          <w:tcPr>
+            <w:tcW w:type="dxa" w:w="1300"/>
+            <w:shd w:fill="F5F2EC" w:color="auto" w:val="clear"/>
+            <w:tcMar>
+              <w:top w:type="dxa" w:w="40"/>
+              <w:left w:type="dxa" w:w="60"/>
+              <w:bottom w:type="dxa" w:w="40"/>
+              <w:right w:type="dxa" w:w="60"/>
+            </w:tcMar>
+          </w:tcPr>
+          <w:p>
+            <w:pPr>
+              <w:jc w:val="center"/>
+            </w:pPr>
+            <w:r>
+              <w:rPr>
+                <w:rFonts w:ascii="Arial" w:cs="Arial" w:eastAsia="Arial" w:hAnsi="Arial"/>
+                <w:b w:val="false"/>
+                <w:bCs w:val="false"/>
+                <w:i w:val="false"/>
+                <w:iCs w:val="false"/>
+                <w:color w:val="4A4A4A"/>
+                <w:sz w:val="14"/>
+                <w:szCs w:val="14"/>
+              </w:rPr>
+              <w:t xml:space="preserve">0,30</w:t>
+            </w:r>
+          </w:p>
+        </w:tc>
+        <w:tc>
+          <w:tcPr>
+            <w:tcW w:type="dxa" w:w="1200"/>
+            <w:shd w:fill="F5F2EC" w:color="auto" w:val="clear"/>
+            <w:tcMar>
+              <w:top w:type="dxa" w:w="40"/>
+              <w:left w:type="dxa" w:w="60"/>
+              <w:bottom w:type="dxa" w:w="40"/>
+              <w:right w:type="dxa" w:w="60"/>
+            </w:tcMar>
+          </w:tcPr>
+          <w:p>
+            <w:pPr>
+              <w:jc w:val="center"/>
+            </w:pPr>
+            <w:r>
+              <w:rPr>
+                <w:rFonts w:ascii="Arial" w:cs="Arial" w:eastAsia="Arial" w:hAnsi="Arial"/>
+                <w:b w:val="false"/>
+                <w:bCs w:val="false"/>
+                <w:i w:val="false"/>
+                <w:iCs w:val="false"/>
+                <w:color w:val="4A4A4A"/>
+                <w:sz w:val="14"/>
+                <w:szCs w:val="14"/>
+              </w:rPr>
+              <w:t xml:space="preserve">3,33</w:t>
+            </w:r>
+          </w:p>
+        </w:tc>
+        <w:tc>
+          <w:tcPr>
+            <w:tcW w:type="dxa" w:w="1300"/>
+            <w:shd w:fill="F5F2EC" w:color="auto" w:val="clear"/>
+            <w:tcMar>
+              <w:top w:type="dxa" w:w="40"/>
+              <w:left w:type="dxa" w:w="60"/>
+              <w:bottom w:type="dxa" w:w="40"/>
+              <w:right w:type="dxa" w:w="60"/>
+            </w:tcMar>
+          </w:tcPr>
+          <w:p>
+            <w:pPr>
+              <w:jc w:val="center"/>
+            </w:pPr>
+            <w:r>
+              <w:rPr>
+                <w:rFonts w:ascii="Arial" w:cs="Arial" w:eastAsia="Arial" w:hAnsi="Arial"/>
+                <w:b w:val="false"/>
+                <w:bCs w:val="false"/>
+                <w:i w:val="false"/>
+                <w:iCs w:val="false"/>
+                <w:color w:val="4A4A4A"/>
+                <w:sz w:val="14"/>
+                <w:szCs w:val="14"/>
+              </w:rPr>
+              <w:t xml:space="preserve">0,32</w:t>
+            </w:r>
+          </w:p>
+        </w:tc>
+        <w:tc>
+          <w:tcPr>
+            <w:tcW w:type="dxa" w:w="1200"/>
+            <w:shd w:fill="F5F2EC" w:color="auto" w:val="clear"/>
+            <w:tcMar>
+              <w:top w:type="dxa" w:w="40"/>
+              <w:left w:type="dxa" w:w="60"/>
+              <w:bottom w:type="dxa" w:w="40"/>
+              <w:right w:type="dxa" w:w="60"/>
+            </w:tcMar>
+          </w:tcPr>
+          <w:p>
+            <w:pPr>
+              <w:jc w:val="center"/>
+            </w:pPr>
+            <w:r>
+              <w:rPr>
+                <w:rFonts w:ascii="Arial" w:cs="Arial" w:eastAsia="Arial" w:hAnsi="Arial"/>
+                <w:b w:val="false"/>
+                <w:bCs w:val="false"/>
+                <w:i w:val="false"/>
+                <w:iCs w:val="false"/>
+                <w:color w:val="4A4A4A"/>
+                <w:sz w:val="14"/>
+                <w:szCs w:val="14"/>
+              </w:rPr>
+              <w:t xml:space="preserve">3,13</w:t>
+            </w:r>
+          </w:p>
+        </w:tc>
+        <w:tc>
+          <w:tcPr>
+            <w:tcW w:type="dxa" w:w="1200"/>
+            <w:shd w:fill="F5F2EC" w:color="auto" w:val="clear"/>
+            <w:tcMar>
+              <w:top w:type="dxa" w:w="40"/>
+              <w:left w:type="dxa" w:w="60"/>
+              <w:bottom w:type="dxa" w:w="40"/>
+              <w:right w:type="dxa" w:w="60"/>
+            </w:tcMar>
+          </w:tcPr>
+          <w:p>
+            <w:pPr>
+              <w:jc w:val="center"/>
+            </w:pPr>
+            <w:r>
+              <w:rPr>
+                <w:rFonts w:ascii="Arial" w:cs="Arial" w:eastAsia="Arial" w:hAnsi="Arial"/>
+                <w:b w:val="false"/>
+                <w:bCs w:val="false"/>
+                <w:i w:val="false"/>
+                <w:iCs w:val="false"/>
+                <w:color w:val="4A4A4A"/>
+                <w:sz w:val="14"/>
+                <w:szCs w:val="14"/>
+              </w:rPr>
+              <w:t xml:space="preserve">1,70 / 0,59</w:t>
+            </w:r>
+          </w:p>
+        </w:tc>
+      </w:tr>
+      <w:tr>
+        <w:tc>
+          <w:tcPr>
+            <w:tcW w:type="dxa" w:w="1200"/>
+            <w:shd w:fill="F5F2EC" w:color="auto" w:val="clear"/>
+            <w:tcMar>
+              <w:top w:type="dxa" w:w="40"/>
+              <w:left w:type="dxa" w:w="60"/>
+              <w:bottom w:type="dxa" w:w="40"/>
+              <w:right w:type="dxa" w:w="60"/>
+            </w:tcMar>
+          </w:tcPr>
+          <w:p>
+            <w:pPr>
+              <w:jc w:val="center"/>
+            </w:pPr>
+            <w:r>
+              <w:rPr>
+                <w:rFonts w:ascii="Arial" w:cs="Arial" w:eastAsia="Arial" w:hAnsi="Arial"/>
+                <w:b w:val="false"/>
+                <w:bCs w:val="false"/>
+                <w:i w:val="false"/>
+                <w:iCs w:val="false"/>
+                <w:color w:val="4A4A4A"/>
+                <w:sz w:val="14"/>
+                <w:szCs w:val="14"/>
+              </w:rPr>
+              <w:t xml:space="preserve">I</w:t>
+            </w:r>
+          </w:p>
+        </w:tc>
+        <w:tc>
+          <w:tcPr>
+            <w:tcW w:type="dxa" w:w="1300"/>
+            <w:shd w:fill="F5F2EC" w:color="auto" w:val="clear"/>
+            <w:tcMar>
+              <w:top w:type="dxa" w:w="40"/>
+              <w:left w:type="dxa" w:w="60"/>
+              <w:bottom w:type="dxa" w:w="40"/>
+              <w:right w:type="dxa" w:w="60"/>
+            </w:tcMar>
+          </w:tcPr>
+          <w:p>
+            <w:pPr>
+              <w:jc w:val="center"/>
+            </w:pPr>
+            <w:r>
+              <w:rPr>
+                <w:rFonts w:ascii="Arial" w:cs="Arial" w:eastAsia="Arial" w:hAnsi="Arial"/>
+                <w:b w:val="false"/>
+                <w:bCs w:val="false"/>
+                <w:i w:val="false"/>
+                <w:iCs w:val="false"/>
+                <w:color w:val="4A4A4A"/>
+                <w:sz w:val="14"/>
+                <w:szCs w:val="14"/>
+              </w:rPr>
+              <w:t xml:space="preserve">0,25</w:t>
+            </w:r>
+          </w:p>
+        </w:tc>
+        <w:tc>
+          <w:tcPr>
+            <w:tcW w:type="dxa" w:w="1200"/>
+            <w:shd w:fill="F5F2EC" w:color="auto" w:val="clear"/>
+            <w:tcMar>
+              <w:top w:type="dxa" w:w="40"/>
+              <w:left w:type="dxa" w:w="60"/>
+              <w:bottom w:type="dxa" w:w="40"/>
+              <w:right w:type="dxa" w:w="60"/>
+            </w:tcMar>
+          </w:tcPr>
+          <w:p>
+            <w:pPr>
+              <w:jc w:val="center"/>
+            </w:pPr>
+            <w:r>
+              <w:rPr>
+                <w:rFonts w:ascii="Arial" w:cs="Arial" w:eastAsia="Arial" w:hAnsi="Arial"/>
+                <w:b w:val="false"/>
+                <w:bCs w:val="false"/>
+                <w:i w:val="false"/>
+                <w:iCs w:val="false"/>
+                <w:color w:val="4A4A4A"/>
+                <w:sz w:val="14"/>
+                <w:szCs w:val="14"/>
+              </w:rPr>
+              <w:t xml:space="preserve">4,00</w:t>
+            </w:r>
+          </w:p>
+        </w:tc>
+        <w:tc>
+          <w:tcPr>
+            <w:tcW w:type="dxa" w:w="1300"/>
+            <w:shd w:fill="F5F2EC" w:color="auto" w:val="clear"/>
+            <w:tcMar>
+              <w:top w:type="dxa" w:w="40"/>
+              <w:left w:type="dxa" w:w="60"/>
+              <w:bottom w:type="dxa" w:w="40"/>
+              <w:right w:type="dxa" w:w="60"/>
+            </w:tcMar>
+          </w:tcPr>
+          <w:p>
+            <w:pPr>
+              <w:jc w:val="center"/>
+            </w:pPr>
+            <w:r>
+              <w:rPr>
+                <w:rFonts w:ascii="Arial" w:cs="Arial" w:eastAsia="Arial" w:hAnsi="Arial"/>
+                <w:b w:val="false"/>
+                <w:bCs w:val="false"/>
+                <w:i w:val="false"/>
+                <w:iCs w:val="false"/>
+                <w:color w:val="4A4A4A"/>
+                <w:sz w:val="14"/>
+                <w:szCs w:val="14"/>
+              </w:rPr>
+              <w:t xml:space="preserve">0,35</w:t>
+            </w:r>
+          </w:p>
+        </w:tc>
+        <w:tc>
+          <w:tcPr>
+            <w:tcW w:type="dxa" w:w="1200"/>
+            <w:shd w:fill="F5F2EC" w:color="auto" w:val="clear"/>
+            <w:tcMar>
+              <w:top w:type="dxa" w:w="40"/>
+              <w:left w:type="dxa" w:w="60"/>
+              <w:bottom w:type="dxa" w:w="40"/>
+              <w:right w:type="dxa" w:w="60"/>
+            </w:tcMar>
+          </w:tcPr>
+          <w:p>
+            <w:pPr>
+              <w:jc w:val="center"/>
+            </w:pPr>
+            <w:r>
+              <w:rPr>
+                <w:rFonts w:ascii="Arial" w:cs="Arial" w:eastAsia="Arial" w:hAnsi="Arial"/>
+                <w:b w:val="false"/>
+                <w:bCs w:val="false"/>
+                <w:i w:val="false"/>
+                <w:iCs w:val="false"/>
+                <w:color w:val="4A4A4A"/>
+                <w:sz w:val="14"/>
+                <w:szCs w:val="14"/>
+              </w:rPr>
+              <w:t xml:space="preserve">2,86</w:t>
+            </w:r>
+          </w:p>
+        </w:tc>
+        <w:tc>
+          <w:tcPr>
+            <w:tcW w:type="dxa" w:w="1300"/>
+            <w:shd w:fill="F5F2EC" w:color="auto" w:val="clear"/>
+            <w:tcMar>
+              <w:top w:type="dxa" w:w="40"/>
+              <w:left w:type="dxa" w:w="60"/>
+              <w:bottom w:type="dxa" w:w="40"/>
+              <w:right w:type="dxa" w:w="60"/>
+            </w:tcMar>
+          </w:tcPr>
+          <w:p>
+            <w:pPr>
+              <w:jc w:val="center"/>
+            </w:pPr>
+            <w:r>
+              <w:rPr>
+                <w:rFonts w:ascii="Arial" w:cs="Arial" w:eastAsia="Arial" w:hAnsi="Arial"/>
+                <w:b w:val="false"/>
+                <w:bCs w:val="false"/>
+                <w:i w:val="false"/>
+                <w:iCs w:val="false"/>
+                <w:color w:val="4A4A4A"/>
+                <w:sz w:val="14"/>
+                <w:szCs w:val="14"/>
+              </w:rPr>
+              <w:t xml:space="preserve">0,32</w:t>
+            </w:r>
+          </w:p>
+        </w:tc>
+        <w:tc>
+          <w:tcPr>
+            <w:tcW w:type="dxa" w:w="1200"/>
+            <w:shd w:fill="F5F2EC" w:color="auto" w:val="clear"/>
+            <w:tcMar>
+              <w:top w:type="dxa" w:w="40"/>
+              <w:left w:type="dxa" w:w="60"/>
+              <w:bottom w:type="dxa" w:w="40"/>
+              <w:right w:type="dxa" w:w="60"/>
+            </w:tcMar>
+          </w:tcPr>
+          <w:p>
+            <w:pPr>
+              <w:jc w:val="center"/>
+            </w:pPr>
+            <w:r>
+              <w:rPr>
+                <w:rFonts w:ascii="Arial" w:cs="Arial" w:eastAsia="Arial" w:hAnsi="Arial"/>
+                <w:b w:val="false"/>
+                <w:bCs w:val="false"/>
+                <w:i w:val="false"/>
+                <w:iCs w:val="false"/>
+                <w:color w:val="4A4A4A"/>
+                <w:sz w:val="14"/>
+                <w:szCs w:val="14"/>
+              </w:rPr>
+              <w:t xml:space="preserve">3,13</w:t>
+            </w:r>
+          </w:p>
+        </w:tc>
+        <w:tc>
+          <w:tcPr>
+            <w:tcW w:type="dxa" w:w="1200"/>
+            <w:shd w:fill="F5F2EC" w:color="auto" w:val="clear"/>
+            <w:tcMar>
+              <w:top w:type="dxa" w:w="40"/>
+              <w:left w:type="dxa" w:w="60"/>
+              <w:bottom w:type="dxa" w:w="40"/>
+              <w:right w:type="dxa" w:w="60"/>
+            </w:tcMar>
+          </w:tcPr>
+          <w:p>
+            <w:pPr>
+              <w:jc w:val="center"/>
+            </w:pPr>
+            <w:r>
+              <w:rPr>
+                <w:rFonts w:ascii="Arial" w:cs="Arial" w:eastAsia="Arial" w:hAnsi="Arial"/>
+                <w:b w:val="false"/>
+                <w:bCs w:val="false"/>
+                <w:i w:val="false"/>
+                <w:iCs w:val="false"/>
+                <w:color w:val="4A4A4A"/>
+                <w:sz w:val="14"/>
+                <w:szCs w:val="14"/>
+              </w:rPr>
+              <w:t xml:space="preserve">1,70 / 0,59</w:t>
+            </w:r>
+          </w:p>
+        </w:tc>
+      </w:tr>
+    </w:tbl>
+    <w:p>
+      <w:pPr>
+        <w:spacing w:after="160"/>
+      </w:pPr>
+      <w:r>
+        <w:rPr>
+          <w:rFonts w:ascii="Arial" w:cs="Arial" w:eastAsia="Arial" w:hAnsi="Arial"/>
+          <w:b w:val="false"/>
+          <w:bCs w:val="false"/>
+          <w:i/>
+          <w:iCs/>
+          <w:color w:val="4A4A4A"/>
+          <w:sz w:val="16"/>
+          <w:szCs w:val="16"/>
+        </w:rPr>
+        <w:t xml:space="preserve">Fuente: NCh1079 y Art. 4.1.10 OGUC (tabla de zonificación térmica vigente).</w:t>
+      </w:r>
+    </w:p>
+    <w:p>
+      <w:pPr>
+        <w:pStyle w:val="Heading1"/>
+        <w:keepNext/>
+        <w:pBdr>
+          <w:bottom w:val="single" w:color="171717" w:sz="6" w:space="4"/>
+        </w:pBdr>
+        <w:spacing w:after="100" w:before="160"/>
+      </w:pPr>
+      <w:r>
+        <w:rPr>
+          <w:rFonts w:ascii="Arial" w:cs="Arial" w:eastAsia="Arial" w:hAnsi="Arial"/>
+          <w:b/>
+          <w:bCs/>
           <w:color w:val="171717"/>
           <w:sz w:val="24"/>
           <w:szCs w:val="24"/>
@@ -112,7 +3402,7 @@
     </w:p>
     <w:tbl>
       <w:tblPr>
-        <w:tblW w:type="dxa" w:w="9020"/>
+        <w:tblW w:type="dxa" w:w="8900"/>
         <w:tblBorders>
           <w:top w:val="single" w:color="auto" w:sz="4"/>
           <w:left w:val="single" w:color="auto" w:sz="4"/>
@@ -123,9 +3413,9 @@
         </w:tblBorders>
       </w:tblPr>
       <w:tblGrid>
-        <w:gridCol w:w="2600"/>
-        <w:gridCol w:w="4400"/>
-        <w:gridCol w:w="2020"/>
+        <w:gridCol w:w="2560"/>
+        <w:gridCol w:w="4340"/>
+        <w:gridCol w:w="2000"/>
       </w:tblGrid>
       <w:tr>
         <w:trPr>
@@ -133,7 +3423,7 @@
         </w:trPr>
         <w:tc>
           <w:tcPr>
-            <w:tcW w:type="dxa" w:w="2600"/>
+            <w:tcW w:type="dxa" w:w="2560"/>
             <w:shd w:fill="171717" w:color="auto" w:val="clear"/>
             <w:tcMar>
               <w:top w:type="dxa" w:w="70"/>
@@ -160,7 +3450,7 @@
         </w:tc>
         <w:tc>
           <w:tcPr>
-            <w:tcW w:type="dxa" w:w="4400"/>
+            <w:tcW w:type="dxa" w:w="4340"/>
             <w:shd w:fill="171717" w:color="auto" w:val="clear"/>
             <w:tcMar>
               <w:top w:type="dxa" w:w="70"/>
@@ -187,7 +3477,7 @@
         </w:tc>
         <w:tc>
           <w:tcPr>
-            <w:tcW w:type="dxa" w:w="2020"/>
+            <w:tcW w:type="dxa" w:w="2000"/>
             <w:shd w:fill="171717" w:color="auto" w:val="clear"/>
             <w:tcMar>
               <w:top w:type="dxa" w:w="70"/>
@@ -216,7 +3506,7 @@
       <w:tr>
         <w:tc>
           <w:tcPr>
-            <w:tcW w:type="dxa" w:w="2600"/>
+            <w:tcW w:type="dxa" w:w="2560"/>
             <w:shd w:fill="F5F2EC" w:color="auto" w:val="clear"/>
             <w:tcMar>
               <w:top w:type="dxa" w:w="70"/>
@@ -243,7 +3533,7 @@
         </w:tc>
         <w:tc>
           <w:tcPr>
-            <w:tcW w:type="dxa" w:w="4400"/>
+            <w:tcW w:type="dxa" w:w="4340"/>
             <w:shd w:fill="F5F2EC" w:color="auto" w:val="clear"/>
             <w:tcMar>
               <w:top w:type="dxa" w:w="70"/>
@@ -270,7 +3560,7 @@
         </w:tc>
         <w:tc>
           <w:tcPr>
-            <w:tcW w:type="dxa" w:w="2020"/>
+            <w:tcW w:type="dxa" w:w="2000"/>
             <w:shd w:fill="F5F2EC" w:color="auto" w:val="clear"/>
             <w:tcMar>
               <w:top w:type="dxa" w:w="70"/>
@@ -299,7 +3589,7 @@
       <w:tr>
         <w:tc>
           <w:tcPr>
-            <w:tcW w:type="dxa" w:w="2600"/>
+            <w:tcW w:type="dxa" w:w="2560"/>
             <w:shd w:fill="F5F2EC" w:color="auto" w:val="clear"/>
             <w:tcMar>
               <w:top w:type="dxa" w:w="70"/>
@@ -326,7 +3616,7 @@
         </w:tc>
         <w:tc>
           <w:tcPr>
-            <w:tcW w:type="dxa" w:w="4400"/>
+            <w:tcW w:type="dxa" w:w="4340"/>
             <w:shd w:fill="F5F2EC" w:color="auto" w:val="clear"/>
             <w:tcMar>
               <w:top w:type="dxa" w:w="70"/>
@@ -353,7 +3643,7 @@
         </w:tc>
         <w:tc>
           <w:tcPr>
-            <w:tcW w:type="dxa" w:w="2020"/>
+            <w:tcW w:type="dxa" w:w="2000"/>
             <w:shd w:fill="F5F2EC" w:color="auto" w:val="clear"/>
             <w:tcMar>
               <w:top w:type="dxa" w:w="70"/>
@@ -382,7 +3672,7 @@
       <w:tr>
         <w:tc>
           <w:tcPr>
-            <w:tcW w:type="dxa" w:w="2600"/>
+            <w:tcW w:type="dxa" w:w="2560"/>
             <w:shd w:fill="F5F2EC" w:color="auto" w:val="clear"/>
             <w:tcMar>
               <w:top w:type="dxa" w:w="70"/>
@@ -409,7 +3699,7 @@
         </w:tc>
         <w:tc>
           <w:tcPr>
-            <w:tcW w:type="dxa" w:w="4400"/>
+            <w:tcW w:type="dxa" w:w="4340"/>
             <w:shd w:fill="F5F2EC" w:color="auto" w:val="clear"/>
             <w:tcMar>
               <w:top w:type="dxa" w:w="70"/>
@@ -436,7 +3726,7 @@
         </w:tc>
         <w:tc>
           <w:tcPr>
-            <w:tcW w:type="dxa" w:w="2020"/>
+            <w:tcW w:type="dxa" w:w="2000"/>
             <w:shd w:fill="F5F2EC" w:color="auto" w:val="clear"/>
             <w:tcMar>
               <w:top w:type="dxa" w:w="70"/>
@@ -465,7 +3755,7 @@
       <w:tr>
         <w:tc>
           <w:tcPr>
-            <w:tcW w:type="dxa" w:w="2600"/>
+            <w:tcW w:type="dxa" w:w="2560"/>
             <w:shd w:fill="F5F2EC" w:color="auto" w:val="clear"/>
             <w:tcMar>
               <w:top w:type="dxa" w:w="70"/>
@@ -492,7 +3782,7 @@
         </w:tc>
         <w:tc>
           <w:tcPr>
-            <w:tcW w:type="dxa" w:w="4400"/>
+            <w:tcW w:type="dxa" w:w="4340"/>
             <w:shd w:fill="F5F2EC" w:color="auto" w:val="clear"/>
             <w:tcMar>
               <w:top w:type="dxa" w:w="70"/>
@@ -519,7 +3809,7 @@
         </w:tc>
         <w:tc>
           <w:tcPr>
-            <w:tcW w:type="dxa" w:w="2020"/>
+            <w:tcW w:type="dxa" w:w="2000"/>
             <w:shd w:fill="F5F2EC" w:color="auto" w:val="clear"/>
             <w:tcMar>
               <w:top w:type="dxa" w:w="70"/>
@@ -548,7 +3838,7 @@
       <w:tr>
         <w:tc>
           <w:tcPr>
-            <w:tcW w:type="dxa" w:w="2600"/>
+            <w:tcW w:type="dxa" w:w="2560"/>
             <w:shd w:fill="F5F2EC" w:color="auto" w:val="clear"/>
             <w:tcMar>
               <w:top w:type="dxa" w:w="70"/>
@@ -575,7 +3865,7 @@
         </w:tc>
         <w:tc>
           <w:tcPr>
-            <w:tcW w:type="dxa" w:w="4400"/>
+            <w:tcW w:type="dxa" w:w="4340"/>
             <w:shd w:fill="F5F2EC" w:color="auto" w:val="clear"/>
             <w:tcMar>
               <w:top w:type="dxa" w:w="70"/>
@@ -602,7 +3892,7 @@
         </w:tc>
         <w:tc>
           <w:tcPr>
-            <w:tcW w:type="dxa" w:w="2020"/>
+            <w:tcW w:type="dxa" w:w="2000"/>
             <w:shd w:fill="F5F2EC" w:color="auto" w:val="clear"/>
             <w:tcMar>
               <w:top w:type="dxa" w:w="70"/>
@@ -688,7 +3978,7 @@
     </w:p>
     <w:tbl>
       <w:tblPr>
-        <w:tblW w:type="dxa" w:w="9020"/>
+        <w:tblW w:type="dxa" w:w="8900"/>
         <w:tblBorders>
           <w:top w:val="single" w:color="auto" w:sz="4"/>
           <w:left w:val="single" w:color="auto" w:sz="4"/>
@@ -699,9 +3989,9 @@
         </w:tblBorders>
       </w:tblPr>
       <w:tblGrid>
-        <w:gridCol w:w="2600"/>
-        <w:gridCol w:w="4400"/>
-        <w:gridCol w:w="2020"/>
+        <w:gridCol w:w="2560"/>
+        <w:gridCol w:w="4340"/>
+        <w:gridCol w:w="2000"/>
       </w:tblGrid>
       <w:tr>
         <w:trPr>
@@ -709,7 +3999,7 @@
         </w:trPr>
         <w:tc>
           <w:tcPr>
-            <w:tcW w:type="dxa" w:w="2600"/>
+            <w:tcW w:type="dxa" w:w="2560"/>
             <w:shd w:fill="171717" w:color="auto" w:val="clear"/>
             <w:tcMar>
               <w:top w:type="dxa" w:w="70"/>
@@ -736,7 +4026,7 @@
         </w:tc>
         <w:tc>
           <w:tcPr>
-            <w:tcW w:type="dxa" w:w="4400"/>
+            <w:tcW w:type="dxa" w:w="4340"/>
             <w:shd w:fill="171717" w:color="auto" w:val="clear"/>
             <w:tcMar>
               <w:top w:type="dxa" w:w="70"/>
@@ -763,7 +4053,7 @@
         </w:tc>
         <w:tc>
           <w:tcPr>
-            <w:tcW w:type="dxa" w:w="2020"/>
+            <w:tcW w:type="dxa" w:w="2000"/>
             <w:shd w:fill="171717" w:color="auto" w:val="clear"/>
             <w:tcMar>
               <w:top w:type="dxa" w:w="70"/>
@@ -792,7 +4082,7 @@
       <w:tr>
         <w:tc>
           <w:tcPr>
-            <w:tcW w:type="dxa" w:w="2600"/>
+            <w:tcW w:type="dxa" w:w="2560"/>
             <w:shd w:fill="F5F2EC" w:color="auto" w:val="clear"/>
             <w:tcMar>
               <w:top w:type="dxa" w:w="70"/>
@@ -819,7 +4109,7 @@
         </w:tc>
         <w:tc>
           <w:tcPr>
-            <w:tcW w:type="dxa" w:w="4400"/>
+            <w:tcW w:type="dxa" w:w="4340"/>
             <w:shd w:fill="F5F2EC" w:color="auto" w:val="clear"/>
             <w:tcMar>
               <w:top w:type="dxa" w:w="70"/>
@@ -846,7 +4136,7 @@
         </w:tc>
         <w:tc>
           <w:tcPr>
-            <w:tcW w:type="dxa" w:w="2020"/>
+            <w:tcW w:type="dxa" w:w="2000"/>
             <w:shd w:fill="F5F2EC" w:color="auto" w:val="clear"/>
             <w:tcMar>
               <w:top w:type="dxa" w:w="70"/>
@@ -875,7 +4165,7 @@
       <w:tr>
         <w:tc>
           <w:tcPr>
-            <w:tcW w:type="dxa" w:w="2600"/>
+            <w:tcW w:type="dxa" w:w="2560"/>
             <w:shd w:fill="F5F2EC" w:color="auto" w:val="clear"/>
             <w:tcMar>
               <w:top w:type="dxa" w:w="70"/>
@@ -902,7 +4192,7 @@
         </w:tc>
         <w:tc>
           <w:tcPr>
-            <w:tcW w:type="dxa" w:w="4400"/>
+            <w:tcW w:type="dxa" w:w="4340"/>
             <w:shd w:fill="F5F2EC" w:color="auto" w:val="clear"/>
             <w:tcMar>
               <w:top w:type="dxa" w:w="70"/>
@@ -929,7 +4219,7 @@
         </w:tc>
         <w:tc>
           <w:tcPr>
-            <w:tcW w:type="dxa" w:w="2020"/>
+            <w:tcW w:type="dxa" w:w="2000"/>
             <w:shd w:fill="F5F2EC" w:color="auto" w:val="clear"/>
             <w:tcMar>
               <w:top w:type="dxa" w:w="70"/>
@@ -958,7 +4248,7 @@
       <w:tr>
         <w:tc>
           <w:tcPr>
-            <w:tcW w:type="dxa" w:w="2600"/>
+            <w:tcW w:type="dxa" w:w="2560"/>
             <w:shd w:fill="F5F2EC" w:color="auto" w:val="clear"/>
             <w:tcMar>
               <w:top w:type="dxa" w:w="70"/>
@@ -985,7 +4275,7 @@
         </w:tc>
         <w:tc>
           <w:tcPr>
-            <w:tcW w:type="dxa" w:w="4400"/>
+            <w:tcW w:type="dxa" w:w="4340"/>
             <w:shd w:fill="F5F2EC" w:color="auto" w:val="clear"/>
             <w:tcMar>
               <w:top w:type="dxa" w:w="70"/>
@@ -1012,7 +4302,7 @@
         </w:tc>
         <w:tc>
           <w:tcPr>
-            <w:tcW w:type="dxa" w:w="2020"/>
+            <w:tcW w:type="dxa" w:w="2000"/>
             <w:shd w:fill="F5F2EC" w:color="auto" w:val="clear"/>
             <w:tcMar>
               <w:top w:type="dxa" w:w="70"/>
@@ -1041,7 +4331,7 @@
       <w:tr>
         <w:tc>
           <w:tcPr>
-            <w:tcW w:type="dxa" w:w="2600"/>
+            <w:tcW w:type="dxa" w:w="2560"/>
             <w:shd w:fill="F5F2EC" w:color="auto" w:val="clear"/>
             <w:tcMar>
               <w:top w:type="dxa" w:w="70"/>
@@ -1068,7 +4358,7 @@
         </w:tc>
         <w:tc>
           <w:tcPr>
-            <w:tcW w:type="dxa" w:w="4400"/>
+            <w:tcW w:type="dxa" w:w="4340"/>
             <w:shd w:fill="F5F2EC" w:color="auto" w:val="clear"/>
             <w:tcMar>
               <w:top w:type="dxa" w:w="70"/>
@@ -1095,7 +4385,7 @@
         </w:tc>
         <w:tc>
           <w:tcPr>
-            <w:tcW w:type="dxa" w:w="2020"/>
+            <w:tcW w:type="dxa" w:w="2000"/>
             <w:shd w:fill="F5F2EC" w:color="auto" w:val="clear"/>
             <w:tcMar>
               <w:top w:type="dxa" w:w="70"/>
@@ -1163,7 +4453,7 @@
     </w:p>
     <w:tbl>
       <w:tblPr>
-        <w:tblW w:type="dxa" w:w="9020"/>
+        <w:tblW w:type="dxa" w:w="8900"/>
         <w:tblBorders>
           <w:top w:val="single" w:color="auto" w:sz="4"/>
           <w:left w:val="single" w:color="auto" w:sz="4"/>
@@ -1174,9 +4464,9 @@
         </w:tblBorders>
       </w:tblPr>
       <w:tblGrid>
-        <w:gridCol w:w="2600"/>
-        <w:gridCol w:w="4400"/>
-        <w:gridCol w:w="2020"/>
+        <w:gridCol w:w="2560"/>
+        <w:gridCol w:w="4340"/>
+        <w:gridCol w:w="2000"/>
       </w:tblGrid>
       <w:tr>
         <w:trPr>
@@ -1184,7 +4474,7 @@
         </w:trPr>
         <w:tc>
           <w:tcPr>
-            <w:tcW w:type="dxa" w:w="2600"/>
+            <w:tcW w:type="dxa" w:w="2560"/>
             <w:shd w:fill="171717" w:color="auto" w:val="clear"/>
             <w:tcMar>
               <w:top w:type="dxa" w:w="70"/>
@@ -1211,7 +4501,7 @@
         </w:tc>
         <w:tc>
           <w:tcPr>
-            <w:tcW w:type="dxa" w:w="4400"/>
+            <w:tcW w:type="dxa" w:w="4340"/>
             <w:shd w:fill="171717" w:color="auto" w:val="clear"/>
             <w:tcMar>
               <w:top w:type="dxa" w:w="70"/>
@@ -1238,7 +4528,7 @@
         </w:tc>
         <w:tc>
           <w:tcPr>
-            <w:tcW w:type="dxa" w:w="2020"/>
+            <w:tcW w:type="dxa" w:w="2000"/>
             <w:shd w:fill="171717" w:color="auto" w:val="clear"/>
             <w:tcMar>
               <w:top w:type="dxa" w:w="70"/>
@@ -1267,7 +4557,7 @@
       <w:tr>
         <w:tc>
           <w:tcPr>
-            <w:tcW w:type="dxa" w:w="2600"/>
+            <w:tcW w:type="dxa" w:w="2560"/>
             <w:shd w:fill="F5F2EC" w:color="auto" w:val="clear"/>
             <w:tcMar>
               <w:top w:type="dxa" w:w="70"/>
@@ -1294,7 +4584,7 @@
         </w:tc>
         <w:tc>
           <w:tcPr>
-            <w:tcW w:type="dxa" w:w="4400"/>
+            <w:tcW w:type="dxa" w:w="4340"/>
             <w:shd w:fill="F5F2EC" w:color="auto" w:val="clear"/>
             <w:tcMar>
               <w:top w:type="dxa" w:w="70"/>
@@ -1321,7 +4611,7 @@
         </w:tc>
         <w:tc>
           <w:tcPr>
-            <w:tcW w:type="dxa" w:w="2020"/>
+            <w:tcW w:type="dxa" w:w="2000"/>
             <w:shd w:fill="F5F2EC" w:color="auto" w:val="clear"/>
             <w:tcMar>
               <w:top w:type="dxa" w:w="70"/>
@@ -1350,7 +4640,7 @@
       <w:tr>
         <w:tc>
           <w:tcPr>
-            <w:tcW w:type="dxa" w:w="2600"/>
+            <w:tcW w:type="dxa" w:w="2560"/>
             <w:shd w:fill="F5F2EC" w:color="auto" w:val="clear"/>
             <w:tcMar>
               <w:top w:type="dxa" w:w="70"/>
@@ -1377,7 +4667,7 @@
         </w:tc>
         <w:tc>
           <w:tcPr>
-            <w:tcW w:type="dxa" w:w="4400"/>
+            <w:tcW w:type="dxa" w:w="4340"/>
             <w:shd w:fill="F5F2EC" w:color="auto" w:val="clear"/>
             <w:tcMar>
               <w:top w:type="dxa" w:w="70"/>
@@ -1404,7 +4694,7 @@
         </w:tc>
         <w:tc>
           <w:tcPr>
-            <w:tcW w:type="dxa" w:w="2020"/>
+            <w:tcW w:type="dxa" w:w="2000"/>
             <w:shd w:fill="F5F2EC" w:color="auto" w:val="clear"/>
             <w:tcMar>
               <w:top w:type="dxa" w:w="70"/>
@@ -1433,7 +4723,7 @@
       <w:tr>
         <w:tc>
           <w:tcPr>
-            <w:tcW w:type="dxa" w:w="2600"/>
+            <w:tcW w:type="dxa" w:w="2560"/>
             <w:shd w:fill="F5F2EC" w:color="auto" w:val="clear"/>
             <w:tcMar>
               <w:top w:type="dxa" w:w="70"/>
@@ -1460,7 +4750,7 @@
         </w:tc>
         <w:tc>
           <w:tcPr>
-            <w:tcW w:type="dxa" w:w="4400"/>
+            <w:tcW w:type="dxa" w:w="4340"/>
             <w:shd w:fill="F5F2EC" w:color="auto" w:val="clear"/>
             <w:tcMar>
               <w:top w:type="dxa" w:w="70"/>
@@ -1487,7 +4777,7 @@
         </w:tc>
         <w:tc>
           <w:tcPr>
-            <w:tcW w:type="dxa" w:w="2020"/>
+            <w:tcW w:type="dxa" w:w="2000"/>
             <w:shd w:fill="F5F2EC" w:color="auto" w:val="clear"/>
             <w:tcMar>
               <w:top w:type="dxa" w:w="70"/>
@@ -1516,7 +4806,7 @@
       <w:tr>
         <w:tc>
           <w:tcPr>
-            <w:tcW w:type="dxa" w:w="2600"/>
+            <w:tcW w:type="dxa" w:w="2560"/>
             <w:shd w:fill="F5F2EC" w:color="auto" w:val="clear"/>
             <w:tcMar>
               <w:top w:type="dxa" w:w="70"/>
@@ -1543,7 +4833,7 @@
         </w:tc>
         <w:tc>
           <w:tcPr>
-            <w:tcW w:type="dxa" w:w="4400"/>
+            <w:tcW w:type="dxa" w:w="4340"/>
             <w:shd w:fill="F5F2EC" w:color="auto" w:val="clear"/>
             <w:tcMar>
               <w:top w:type="dxa" w:w="70"/>
@@ -1570,7 +4860,7 @@
         </w:tc>
         <w:tc>
           <w:tcPr>
-            <w:tcW w:type="dxa" w:w="2020"/>
+            <w:tcW w:type="dxa" w:w="2000"/>
             <w:shd w:fill="F5F2EC" w:color="auto" w:val="clear"/>
             <w:tcMar>
               <w:top w:type="dxa" w:w="70"/>
@@ -1599,7 +4889,7 @@
       <w:tr>
         <w:tc>
           <w:tcPr>
-            <w:tcW w:type="dxa" w:w="2600"/>
+            <w:tcW w:type="dxa" w:w="2560"/>
             <w:shd w:fill="F5F2EC" w:color="auto" w:val="clear"/>
             <w:tcMar>
               <w:top w:type="dxa" w:w="70"/>
@@ -1626,7 +4916,7 @@
         </w:tc>
         <w:tc>
           <w:tcPr>
-            <w:tcW w:type="dxa" w:w="4400"/>
+            <w:tcW w:type="dxa" w:w="4340"/>
             <w:shd w:fill="F5F2EC" w:color="auto" w:val="clear"/>
             <w:tcMar>
               <w:top w:type="dxa" w:w="70"/>
@@ -1653,7 +4943,7 @@
         </w:tc>
         <w:tc>
           <w:tcPr>
-            <w:tcW w:type="dxa" w:w="2020"/>
+            <w:tcW w:type="dxa" w:w="2000"/>
             <w:shd w:fill="F5F2EC" w:color="auto" w:val="clear"/>
             <w:tcMar>
               <w:top w:type="dxa" w:w="70"/>
@@ -1682,7 +4972,7 @@
       <w:tr>
         <w:tc>
           <w:tcPr>
-            <w:tcW w:type="dxa" w:w="2600"/>
+            <w:tcW w:type="dxa" w:w="2560"/>
             <w:shd w:fill="F5F2EC" w:color="auto" w:val="clear"/>
             <w:tcMar>
               <w:top w:type="dxa" w:w="70"/>
@@ -1709,7 +4999,7 @@
         </w:tc>
         <w:tc>
           <w:tcPr>
-            <w:tcW w:type="dxa" w:w="4400"/>
+            <w:tcW w:type="dxa" w:w="4340"/>
             <w:shd w:fill="F5F2EC" w:color="auto" w:val="clear"/>
             <w:tcMar>
               <w:top w:type="dxa" w:w="70"/>
@@ -1736,7 +5026,7 @@
         </w:tc>
         <w:tc>
           <w:tcPr>
-            <w:tcW w:type="dxa" w:w="2020"/>
+            <w:tcW w:type="dxa" w:w="2000"/>
             <w:shd w:fill="F5F2EC" w:color="auto" w:val="clear"/>
             <w:tcMar>
               <w:top w:type="dxa" w:w="70"/>
@@ -1804,7 +5094,7 @@
     </w:p>
     <w:tbl>
       <w:tblPr>
-        <w:tblW w:type="dxa" w:w="9020"/>
+        <w:tblW w:type="dxa" w:w="8900"/>
         <w:tblBorders>
           <w:top w:val="single" w:color="auto" w:sz="4"/>
           <w:left w:val="single" w:color="auto" w:sz="4"/>
@@ -2196,7 +5486,7 @@
     </w:p>
     <w:tbl>
       <w:tblPr>
-        <w:tblW w:type="dxa" w:w="9020"/>
+        <w:tblW w:type="dxa" w:w="8900"/>
         <w:tblBorders>
           <w:top w:val="single" w:color="auto" w:sz="4"/>
           <w:left w:val="single" w:color="auto" w:sz="4"/>
@@ -2207,8 +5497,8 @@
         </w:tblBorders>
       </w:tblPr>
       <w:tblGrid>
-        <w:gridCol w:w="2600"/>
-        <w:gridCol w:w="6420"/>
+        <w:gridCol w:w="3300"/>
+        <w:gridCol w:w="5600"/>
       </w:tblGrid>
       <w:tr>
         <w:trPr>
@@ -2216,7 +5506,7 @@
         </w:trPr>
         <w:tc>
           <w:tcPr>
-            <w:tcW w:type="dxa" w:w="2600"/>
+            <w:tcW w:type="dxa" w:w="3300"/>
             <w:shd w:fill="171717" w:color="auto" w:val="clear"/>
             <w:tcMar>
               <w:top w:type="dxa" w:w="70"/>
@@ -2243,7 +5533,7 @@
         </w:tc>
         <w:tc>
           <w:tcPr>
-            <w:tcW w:type="dxa" w:w="6420"/>
+            <w:tcW w:type="dxa" w:w="5600"/>
             <w:shd w:fill="171717" w:color="auto" w:val="clear"/>
             <w:tcMar>
               <w:top w:type="dxa" w:w="70"/>
@@ -2272,7 +5562,7 @@
       <w:tr>
         <w:tc>
           <w:tcPr>
-            <w:tcW w:type="dxa" w:w="2600"/>
+            <w:tcW w:type="dxa" w:w="3300"/>
             <w:shd w:fill="F5F2EC" w:color="auto" w:val="clear"/>
             <w:tcMar>
               <w:top w:type="dxa" w:w="70"/>
@@ -2299,28 +5589,28 @@
         </w:tc>
         <w:tc>
           <w:tcPr>
-            <w:tcW w:type="dxa" w:w="6420"/>
-            <w:shd w:fill="F5F2EC" w:color="auto" w:val="clear"/>
-            <w:tcMar>
-              <w:top w:type="dxa" w:w="70"/>
-              <w:left w:type="dxa" w:w="90"/>
-              <w:bottom w:type="dxa" w:w="70"/>
-              <w:right w:type="dxa" w:w="90"/>
-            </w:tcMar>
-          </w:tcPr>
-          <w:p>
-            <w:r>
-              <w:rPr>
-                <w:rFonts w:ascii="Arial" w:cs="Arial" w:eastAsia="Arial" w:hAnsi="Arial"/>
-                <w:b w:val="false"/>
-                <w:bCs w:val="false"/>
-                <w:i w:val="false"/>
-                <w:iCs w:val="false"/>
-                <w:color w:val="4A4A4A"/>
-                <w:sz w:val="17"/>
-                <w:szCs w:val="17"/>
-              </w:rPr>
-              <w:t>Moldupanel, Puerta Pino Radiata Italia 80x210cm (coincide exacto con la dimensión real). Material: TBC_Madera.</w:t>
+            <w:tcW w:type="dxa" w:w="5600"/>
+            <w:shd w:fill="F5F2EC" w:color="auto" w:val="clear"/>
+            <w:tcMar>
+              <w:top w:type="dxa" w:w="70"/>
+              <w:left w:type="dxa" w:w="90"/>
+              <w:bottom w:type="dxa" w:w="70"/>
+              <w:right w:type="dxa" w:w="90"/>
+            </w:tcMar>
+          </w:tcPr>
+          <w:p>
+            <w:r>
+              <w:rPr>
+                <w:rFonts w:ascii="Arial" w:cs="Arial" w:eastAsia="Arial" w:hAnsi="Arial"/>
+                <w:b w:val="false"/>
+                <w:bCs w:val="false"/>
+                <w:i w:val="false"/>
+                <w:iCs w:val="false"/>
+                <w:color w:val="4A4A4A"/>
+                <w:sz w:val="17"/>
+                <w:szCs w:val="17"/>
+              </w:rPr>
+              <w:t>Moldupanel, Puerta Pino Radiata Italia 80x210cm (coincide exacto con la dimensión real). Material: TBC_Madera. Referencia de instalación (estándar de obra): altura mínima de hoja 2,1 m en puertas interiores (la de Pausa Maule, 2,10 m, cumple), separación de 5 mm respecto del nivel de piso terminado, fijación con tres bisagras.</w:t>
             </w:r>
           </w:p>
         </w:tc>
@@ -2328,7 +5618,7 @@
       <w:tr>
         <w:tc>
           <w:tcPr>
-            <w:tcW w:type="dxa" w:w="2600"/>
+            <w:tcW w:type="dxa" w:w="3300"/>
             <w:shd w:fill="F5F2EC" w:color="auto" w:val="clear"/>
             <w:tcMar>
               <w:top w:type="dxa" w:w="70"/>
@@ -2355,7 +5645,7 @@
         </w:tc>
         <w:tc>
           <w:tcPr>
-            <w:tcW w:type="dxa" w:w="6420"/>
+            <w:tcW w:type="dxa" w:w="5600"/>
             <w:shd w:fill="F5F2EC" w:color="auto" w:val="clear"/>
             <w:tcMar>
               <w:top w:type="dxa" w:w="70"/>
@@ -2384,7 +5674,7 @@
       <w:tr>
         <w:tc>
           <w:tcPr>
-            <w:tcW w:type="dxa" w:w="2600"/>
+            <w:tcW w:type="dxa" w:w="3300"/>
             <w:shd w:fill="F5F2EC" w:color="auto" w:val="clear"/>
             <w:tcMar>
               <w:top w:type="dxa" w:w="70"/>
@@ -2411,7 +5701,7 @@
         </w:tc>
         <w:tc>
           <w:tcPr>
-            <w:tcW w:type="dxa" w:w="6420"/>
+            <w:tcW w:type="dxa" w:w="5600"/>
             <w:shd w:fill="F5F2EC" w:color="auto" w:val="clear"/>
             <w:tcMar>
               <w:top w:type="dxa" w:w="70"/>
@@ -2440,7 +5730,7 @@
       <w:tr>
         <w:tc>
           <w:tcPr>
-            <w:tcW w:type="dxa" w:w="2600"/>
+            <w:tcW w:type="dxa" w:w="3300"/>
             <w:shd w:fill="F5F2EC" w:color="auto" w:val="clear"/>
             <w:tcMar>
               <w:top w:type="dxa" w:w="70"/>
@@ -2467,7 +5757,7 @@
         </w:tc>
         <w:tc>
           <w:tcPr>
-            <w:tcW w:type="dxa" w:w="6420"/>
+            <w:tcW w:type="dxa" w:w="5600"/>
             <w:shd w:fill="F5F2EC" w:color="auto" w:val="clear"/>
             <w:tcMar>
               <w:top w:type="dxa" w:w="70"/>
@@ -2496,7 +5786,63 @@
       <w:tr>
         <w:tc>
           <w:tcPr>
-            <w:tcW w:type="dxa" w:w="2600"/>
+            <w:tcW w:type="dxa" w:w="3300"/>
+            <w:shd w:fill="F5F2EC" w:color="auto" w:val="clear"/>
+            <w:tcMar>
+              <w:top w:type="dxa" w:w="70"/>
+              <w:left w:type="dxa" w:w="90"/>
+              <w:bottom w:type="dxa" w:w="70"/>
+              <w:right w:type="dxa" w:w="90"/>
+            </w:tcMar>
+          </w:tcPr>
+          <w:p>
+            <w:r>
+              <w:rPr>
+                <w:rFonts w:ascii="Arial" w:cs="Arial" w:eastAsia="Arial" w:hAnsi="Arial"/>
+                <w:b w:val="false"/>
+                <w:bCs w:val="false"/>
+                <w:i w:val="false"/>
+                <w:iCs w:val="false"/>
+                <w:color w:val="4A4A4A"/>
+                <w:sz w:val="17"/>
+                <w:szCs w:val="17"/>
+              </w:rPr>
+              <w:t xml:space="preserve">Ventanas / ventilación natural</w:t>
+            </w:r>
+          </w:p>
+        </w:tc>
+        <w:tc>
+          <w:tcPr>
+            <w:tcW w:type="dxa" w:w="5600"/>
+            <w:shd w:fill="F5F2EC" w:color="auto" w:val="clear"/>
+            <w:tcMar>
+              <w:top w:type="dxa" w:w="70"/>
+              <w:left w:type="dxa" w:w="90"/>
+              <w:bottom w:type="dxa" w:w="70"/>
+              <w:right w:type="dxa" w:w="90"/>
+            </w:tcMar>
+          </w:tcPr>
+          <w:p>
+            <w:r>
+              <w:rPr>
+                <w:rFonts w:ascii="Arial" w:cs="Arial" w:eastAsia="Arial" w:hAnsi="Arial"/>
+                <w:b w:val="false"/>
+                <w:bCs w:val="false"/>
+                <w:i w:val="false"/>
+                <w:iCs w:val="false"/>
+                <w:color w:val="4A4A4A"/>
+                <w:sz w:val="17"/>
+                <w:szCs w:val="17"/>
+              </w:rPr>
+              <w:t xml:space="preserve">El modelo no registra ventanas como categoría independiente (el cerramiento vidriado es vía muro cortina). Regla de referencia (OGUC): en recintos habitables, al menos una hoja practicable; en no habitables, superficie no menor al 8% del recinto y ancho mínimo 0,45 m — pendiente verificar contra los paneles "Empty" del muro cortina, que hoy no tienen hoja operable definida.</w:t>
+            </w:r>
+          </w:p>
+        </w:tc>
+      </w:tr>
+      <w:tr>
+        <w:tc>
+          <w:tcPr>
+            <w:tcW w:type="dxa" w:w="3300"/>
             <w:shd w:fill="F5F2EC" w:color="auto" w:val="clear"/>
             <w:tcMar>
               <w:top w:type="dxa" w:w="70"/>
@@ -2523,7 +5869,7 @@
         </w:tc>
         <w:tc>
           <w:tcPr>
-            <w:tcW w:type="dxa" w:w="6420"/>
+            <w:tcW w:type="dxa" w:w="5600"/>
             <w:shd w:fill="F5F2EC" w:color="auto" w:val="clear"/>
             <w:tcMar>
               <w:top w:type="dxa" w:w="70"/>
@@ -2550,6 +5896,706 @@
         </w:tc>
       </w:tr>
     </w:tbl>
+    <w:p>
+      <w:pPr>
+        <w:pStyle w:val="Heading1"/>
+        <w:keepNext/>
+        <w:pBdr>
+          <w:bottom w:val="single" w:color="171717" w:sz="6" w:space="4"/>
+        </w:pBdr>
+        <w:spacing w:after="100" w:before="160"/>
+      </w:pPr>
+      <w:r>
+        <w:rPr>
+          <w:rFonts w:ascii="Arial" w:cs="Arial" w:eastAsia="Arial" w:hAnsi="Arial"/>
+          <w:b/>
+          <w:bCs/>
+          <w:i w:val="false"/>
+          <w:iCs w:val="false"/>
+          <w:color w:val="171717"/>
+          <w:sz w:val="24"/>
+          <w:szCs w:val="24"/>
+        </w:rPr>
+        <w:t xml:space="preserve">06 · Cimentación · Zapatas aisladas HA</w:t>
+      </w:r>
+    </w:p>
+    <w:p>
+      <w:pPr>
+        <w:spacing w:after="160"/>
+      </w:pPr>
+      <w:r>
+        <w:rPr>
+          <w:rFonts w:ascii="Arial" w:cs="Arial" w:eastAsia="Arial" w:hAnsi="Arial"/>
+          <w:b w:val="false"/>
+          <w:bCs w:val="false"/>
+          <w:i w:val="false"/>
+          <w:iCs w:val="false"/>
+          <w:color w:val="4A4A4A"/>
+          <w:sz w:val="17"/>
+          <w:szCs w:val="17"/>
+        </w:rPr>
+        <w:t xml:space="preserve">Agregado tras incorporar la cimentación al modelo: 16 zapatas aisladas, una bajo cada pilar estructural, en el nivel NOG_FUNDACIONES. Material reasignado de "Concrete, Cast-in-Place gray" (genérico de Revit) a MT_HORMIGON ARMADO para mantener la convención de nomenclatura y trazabilidad del resto del documento.</w:t>
+      </w:r>
+    </w:p>
+    <w:tbl>
+      <w:tblPr>
+        <w:tblW w:type="dxa" w:w="8900"/>
+        <w:tblBorders>
+          <w:top w:val="single" w:color="auto" w:sz="4"/>
+          <w:left w:val="single" w:color="auto" w:sz="4"/>
+          <w:bottom w:val="single" w:color="auto" w:sz="4"/>
+          <w:right w:val="single" w:color="auto" w:sz="4"/>
+          <w:insideH w:val="single" w:color="auto" w:sz="4"/>
+          <w:insideV w:val="single" w:color="auto" w:sz="4"/>
+        </w:tblBorders>
+      </w:tblPr>
+      <w:tblGrid>
+        <w:gridCol w:w="2560"/>
+        <w:gridCol w:w="4340"/>
+        <w:gridCol w:w="2000"/>
+      </w:tblGrid>
+      <w:tr>
+        <w:trPr>
+          <w:tblHeader/>
+        </w:trPr>
+        <w:tc>
+          <w:tcPr>
+            <w:tcW w:type="dxa" w:w="2560"/>
+            <w:shd w:fill="171717" w:color="auto" w:val="clear"/>
+            <w:tcMar>
+              <w:top w:type="dxa" w:w="70"/>
+              <w:left w:type="dxa" w:w="90"/>
+              <w:bottom w:type="dxa" w:w="70"/>
+              <w:right w:type="dxa" w:w="90"/>
+            </w:tcMar>
+          </w:tcPr>
+          <w:p>
+            <w:r>
+              <w:rPr>
+                <w:rFonts w:ascii="Arial" w:cs="Arial" w:eastAsia="Arial" w:hAnsi="Arial"/>
+                <w:b/>
+                <w:bCs/>
+                <w:i w:val="false"/>
+                <w:iCs w:val="false"/>
+                <w:color w:val="FFFFFF"/>
+                <w:sz w:val="16"/>
+                <w:szCs w:val="16"/>
+              </w:rPr>
+              <w:t xml:space="preserve">Propiedad</w:t>
+            </w:r>
+          </w:p>
+        </w:tc>
+        <w:tc>
+          <w:tcPr>
+            <w:tcW w:type="dxa" w:w="4340"/>
+            <w:shd w:fill="171717" w:color="auto" w:val="clear"/>
+            <w:tcMar>
+              <w:top w:type="dxa" w:w="70"/>
+              <w:left w:type="dxa" w:w="90"/>
+              <w:bottom w:type="dxa" w:w="70"/>
+              <w:right w:type="dxa" w:w="90"/>
+            </w:tcMar>
+          </w:tcPr>
+          <w:p>
+            <w:r>
+              <w:rPr>
+                <w:rFonts w:ascii="Arial" w:cs="Arial" w:eastAsia="Arial" w:hAnsi="Arial"/>
+                <w:b/>
+                <w:bCs/>
+                <w:i w:val="false"/>
+                <w:iCs w:val="false"/>
+                <w:color w:val="FFFFFF"/>
+                <w:sz w:val="16"/>
+                <w:szCs w:val="16"/>
+              </w:rPr>
+              <w:t xml:space="preserve">Valor</w:t>
+            </w:r>
+          </w:p>
+        </w:tc>
+        <w:tc>
+          <w:tcPr>
+            <w:tcW w:type="dxa" w:w="2000"/>
+            <w:shd w:fill="171717" w:color="auto" w:val="clear"/>
+            <w:tcMar>
+              <w:top w:type="dxa" w:w="70"/>
+              <w:left w:type="dxa" w:w="90"/>
+              <w:bottom w:type="dxa" w:w="70"/>
+              <w:right w:type="dxa" w:w="90"/>
+            </w:tcMar>
+          </w:tcPr>
+          <w:p>
+            <w:r>
+              <w:rPr>
+                <w:rFonts w:ascii="Arial" w:cs="Arial" w:eastAsia="Arial" w:hAnsi="Arial"/>
+                <w:b/>
+                <w:bCs/>
+                <w:i w:val="false"/>
+                <w:iCs w:val="false"/>
+                <w:color w:val="FFFFFF"/>
+                <w:sz w:val="16"/>
+                <w:szCs w:val="16"/>
+              </w:rPr>
+              <w:t xml:space="preserve">Fuente / Estado</w:t>
+            </w:r>
+          </w:p>
+        </w:tc>
+      </w:tr>
+      <w:tr>
+        <w:tc>
+          <w:tcPr>
+            <w:tcW w:type="dxa" w:w="2560"/>
+            <w:shd w:fill="F5F2EC" w:color="auto" w:val="clear"/>
+            <w:tcMar>
+              <w:top w:type="dxa" w:w="70"/>
+              <w:left w:type="dxa" w:w="90"/>
+              <w:bottom w:type="dxa" w:w="70"/>
+              <w:right w:type="dxa" w:w="90"/>
+            </w:tcMar>
+          </w:tcPr>
+          <w:p>
+            <w:r>
+              <w:rPr>
+                <w:rFonts w:ascii="Arial" w:cs="Arial" w:eastAsia="Arial" w:hAnsi="Arial"/>
+                <w:b w:val="false"/>
+                <w:bCs w:val="false"/>
+                <w:i w:val="false"/>
+                <w:iCs w:val="false"/>
+                <w:color w:val="4A4A4A"/>
+                <w:sz w:val="17"/>
+                <w:szCs w:val="17"/>
+              </w:rPr>
+              <w:t xml:space="preserve">Tipo / familia</w:t>
+            </w:r>
+          </w:p>
+        </w:tc>
+        <w:tc>
+          <w:tcPr>
+            <w:tcW w:type="dxa" w:w="4340"/>
+            <w:shd w:fill="F5F2EC" w:color="auto" w:val="clear"/>
+            <w:tcMar>
+              <w:top w:type="dxa" w:w="70"/>
+              <w:left w:type="dxa" w:w="90"/>
+              <w:bottom w:type="dxa" w:w="70"/>
+              <w:right w:type="dxa" w:w="90"/>
+            </w:tcMar>
+          </w:tcPr>
+          <w:p>
+            <w:r>
+              <w:rPr>
+                <w:rFonts w:ascii="Arial" w:cs="Arial" w:eastAsia="Arial" w:hAnsi="Arial"/>
+                <w:b w:val="false"/>
+                <w:bCs w:val="false"/>
+                <w:i w:val="false"/>
+                <w:iCs w:val="false"/>
+                <w:color w:val="4A4A4A"/>
+                <w:sz w:val="17"/>
+                <w:szCs w:val="17"/>
+              </w:rPr>
+              <w:t xml:space="preserve">ZAPATA_Hormigon Armado_Aislada (familia "Zapata", tipo "60x60x50cm")</w:t>
+            </w:r>
+          </w:p>
+        </w:tc>
+        <w:tc>
+          <w:tcPr>
+            <w:tcW w:type="dxa" w:w="2000"/>
+            <w:shd w:fill="F5F2EC" w:color="auto" w:val="clear"/>
+            <w:tcMar>
+              <w:top w:type="dxa" w:w="70"/>
+              <w:left w:type="dxa" w:w="90"/>
+              <w:bottom w:type="dxa" w:w="70"/>
+              <w:right w:type="dxa" w:w="90"/>
+            </w:tcMar>
+          </w:tcPr>
+          <w:p>
+            <w:r>
+              <w:rPr>
+                <w:rFonts w:ascii="Arial" w:cs="Arial" w:eastAsia="Arial" w:hAnsi="Arial"/>
+                <w:b w:val="false"/>
+                <w:bCs w:val="false"/>
+                <w:i w:val="false"/>
+                <w:iCs w:val="false"/>
+                <w:color w:val="4A4A4A"/>
+                <w:sz w:val="17"/>
+                <w:szCs w:val="17"/>
+              </w:rPr>
+              <w:t xml:space="preserve">Verificado en Revit</w:t>
+            </w:r>
+          </w:p>
+        </w:tc>
+      </w:tr>
+      <w:tr>
+        <w:tc>
+          <w:tcPr>
+            <w:tcW w:type="dxa" w:w="2560"/>
+            <w:shd w:fill="F5F2EC" w:color="auto" w:val="clear"/>
+            <w:tcMar>
+              <w:top w:type="dxa" w:w="70"/>
+              <w:left w:type="dxa" w:w="90"/>
+              <w:bottom w:type="dxa" w:w="70"/>
+              <w:right w:type="dxa" w:w="90"/>
+            </w:tcMar>
+          </w:tcPr>
+          <w:p>
+            <w:r>
+              <w:rPr>
+                <w:rFonts w:ascii="Arial" w:cs="Arial" w:eastAsia="Arial" w:hAnsi="Arial"/>
+                <w:b w:val="false"/>
+                <w:bCs w:val="false"/>
+                <w:i w:val="false"/>
+                <w:iCs w:val="false"/>
+                <w:color w:val="4A4A4A"/>
+                <w:sz w:val="17"/>
+                <w:szCs w:val="17"/>
+              </w:rPr>
+              <w:t xml:space="preserve">Dimensiones</w:t>
+            </w:r>
+          </w:p>
+        </w:tc>
+        <w:tc>
+          <w:tcPr>
+            <w:tcW w:type="dxa" w:w="4340"/>
+            <w:shd w:fill="F5F2EC" w:color="auto" w:val="clear"/>
+            <w:tcMar>
+              <w:top w:type="dxa" w:w="70"/>
+              <w:left w:type="dxa" w:w="90"/>
+              <w:bottom w:type="dxa" w:w="70"/>
+              <w:right w:type="dxa" w:w="90"/>
+            </w:tcMar>
+          </w:tcPr>
+          <w:p>
+            <w:r>
+              <w:rPr>
+                <w:rFonts w:ascii="Arial" w:cs="Arial" w:eastAsia="Arial" w:hAnsi="Arial"/>
+                <w:b w:val="false"/>
+                <w:bCs w:val="false"/>
+                <w:i w:val="false"/>
+                <w:iCs w:val="false"/>
+                <w:color w:val="4A4A4A"/>
+                <w:sz w:val="17"/>
+                <w:szCs w:val="17"/>
+              </w:rPr>
+              <w:t xml:space="preserve">60 × 60 cm en planta, 50 cm de altura (parámetro de altura total 80,48 cm incluye desplante)</w:t>
+            </w:r>
+          </w:p>
+        </w:tc>
+        <w:tc>
+          <w:tcPr>
+            <w:tcW w:type="dxa" w:w="2000"/>
+            <w:shd w:fill="F5F2EC" w:color="auto" w:val="clear"/>
+            <w:tcMar>
+              <w:top w:type="dxa" w:w="70"/>
+              <w:left w:type="dxa" w:w="90"/>
+              <w:bottom w:type="dxa" w:w="70"/>
+              <w:right w:type="dxa" w:w="90"/>
+            </w:tcMar>
+          </w:tcPr>
+          <w:p>
+            <w:r>
+              <w:rPr>
+                <w:rFonts w:ascii="Arial" w:cs="Arial" w:eastAsia="Arial" w:hAnsi="Arial"/>
+                <w:b w:val="false"/>
+                <w:bCs w:val="false"/>
+                <w:i w:val="false"/>
+                <w:iCs w:val="false"/>
+                <w:color w:val="4A4A4A"/>
+                <w:sz w:val="17"/>
+                <w:szCs w:val="17"/>
+              </w:rPr>
+              <w:t xml:space="preserve">Verificado en Revit</w:t>
+            </w:r>
+          </w:p>
+        </w:tc>
+      </w:tr>
+      <w:tr>
+        <w:tc>
+          <w:tcPr>
+            <w:tcW w:type="dxa" w:w="2560"/>
+            <w:shd w:fill="F5F2EC" w:color="auto" w:val="clear"/>
+            <w:tcMar>
+              <w:top w:type="dxa" w:w="70"/>
+              <w:left w:type="dxa" w:w="90"/>
+              <w:bottom w:type="dxa" w:w="70"/>
+              <w:right w:type="dxa" w:w="90"/>
+            </w:tcMar>
+          </w:tcPr>
+          <w:p>
+            <w:r>
+              <w:rPr>
+                <w:rFonts w:ascii="Arial" w:cs="Arial" w:eastAsia="Arial" w:hAnsi="Arial"/>
+                <w:b w:val="false"/>
+                <w:bCs w:val="false"/>
+                <w:i w:val="false"/>
+                <w:iCs w:val="false"/>
+                <w:color w:val="4A4A4A"/>
+                <w:sz w:val="17"/>
+                <w:szCs w:val="17"/>
+              </w:rPr>
+              <w:t xml:space="preserve">Cantidad</w:t>
+            </w:r>
+          </w:p>
+        </w:tc>
+        <w:tc>
+          <w:tcPr>
+            <w:tcW w:type="dxa" w:w="4340"/>
+            <w:shd w:fill="F5F2EC" w:color="auto" w:val="clear"/>
+            <w:tcMar>
+              <w:top w:type="dxa" w:w="70"/>
+              <w:left w:type="dxa" w:w="90"/>
+              <w:bottom w:type="dxa" w:w="70"/>
+              <w:right w:type="dxa" w:w="90"/>
+            </w:tcMar>
+          </w:tcPr>
+          <w:p>
+            <w:r>
+              <w:rPr>
+                <w:rFonts w:ascii="Arial" w:cs="Arial" w:eastAsia="Arial" w:hAnsi="Arial"/>
+                <w:b w:val="false"/>
+                <w:bCs w:val="false"/>
+                <w:i w:val="false"/>
+                <w:iCs w:val="false"/>
+                <w:color w:val="4A4A4A"/>
+                <w:sz w:val="17"/>
+                <w:szCs w:val="17"/>
+              </w:rPr>
+              <w:t xml:space="preserve">16 unidades, una bajo cada pilar estructural (130×130mm)</w:t>
+            </w:r>
+          </w:p>
+        </w:tc>
+        <w:tc>
+          <w:tcPr>
+            <w:tcW w:type="dxa" w:w="2000"/>
+            <w:shd w:fill="F5F2EC" w:color="auto" w:val="clear"/>
+            <w:tcMar>
+              <w:top w:type="dxa" w:w="70"/>
+              <w:left w:type="dxa" w:w="90"/>
+              <w:bottom w:type="dxa" w:w="70"/>
+              <w:right w:type="dxa" w:w="90"/>
+            </w:tcMar>
+          </w:tcPr>
+          <w:p>
+            <w:r>
+              <w:rPr>
+                <w:rFonts w:ascii="Arial" w:cs="Arial" w:eastAsia="Arial" w:hAnsi="Arial"/>
+                <w:b w:val="false"/>
+                <w:bCs w:val="false"/>
+                <w:i w:val="false"/>
+                <w:iCs w:val="false"/>
+                <w:color w:val="4A4A4A"/>
+                <w:sz w:val="17"/>
+                <w:szCs w:val="17"/>
+              </w:rPr>
+              <w:t xml:space="preserve">Verificado en Revit</w:t>
+            </w:r>
+          </w:p>
+        </w:tc>
+      </w:tr>
+      <w:tr>
+        <w:tc>
+          <w:tcPr>
+            <w:tcW w:type="dxa" w:w="2560"/>
+            <w:shd w:fill="F5F2EC" w:color="auto" w:val="clear"/>
+            <w:tcMar>
+              <w:top w:type="dxa" w:w="70"/>
+              <w:left w:type="dxa" w:w="90"/>
+              <w:bottom w:type="dxa" w:w="70"/>
+              <w:right w:type="dxa" w:w="90"/>
+            </w:tcMar>
+          </w:tcPr>
+          <w:p>
+            <w:r>
+              <w:rPr>
+                <w:rFonts w:ascii="Arial" w:cs="Arial" w:eastAsia="Arial" w:hAnsi="Arial"/>
+                <w:b w:val="false"/>
+                <w:bCs w:val="false"/>
+                <w:i w:val="false"/>
+                <w:iCs w:val="false"/>
+                <w:color w:val="4A4A4A"/>
+                <w:sz w:val="17"/>
+                <w:szCs w:val="17"/>
+              </w:rPr>
+              <w:t xml:space="preserve">Material</w:t>
+            </w:r>
+          </w:p>
+        </w:tc>
+        <w:tc>
+          <w:tcPr>
+            <w:tcW w:type="dxa" w:w="4340"/>
+            <w:shd w:fill="F5F2EC" w:color="auto" w:val="clear"/>
+            <w:tcMar>
+              <w:top w:type="dxa" w:w="70"/>
+              <w:left w:type="dxa" w:w="90"/>
+              <w:bottom w:type="dxa" w:w="70"/>
+              <w:right w:type="dxa" w:w="90"/>
+            </w:tcMar>
+          </w:tcPr>
+          <w:p>
+            <w:r>
+              <w:rPr>
+                <w:rFonts w:ascii="Arial" w:cs="Arial" w:eastAsia="Arial" w:hAnsi="Arial"/>
+                <w:b w:val="false"/>
+                <w:bCs w:val="false"/>
+                <w:i w:val="false"/>
+                <w:iCs w:val="false"/>
+                <w:color w:val="4A4A4A"/>
+                <w:sz w:val="17"/>
+                <w:szCs w:val="17"/>
+              </w:rPr>
+              <w:t xml:space="preserve">MT_HORMIGON ARMADO — misma familia de material que el radier estructural (Ficha-Hormigon-con-Fibra_CC.pdf, Melón). Resistencia 20/25/30 MPa: rango de ficha, pendiente definir valor único de proyecto.</w:t>
+            </w:r>
+          </w:p>
+        </w:tc>
+        <w:tc>
+          <w:tcPr>
+            <w:tcW w:type="dxa" w:w="2000"/>
+            <w:shd w:fill="F5F2EC" w:color="auto" w:val="clear"/>
+            <w:tcMar>
+              <w:top w:type="dxa" w:w="70"/>
+              <w:left w:type="dxa" w:w="90"/>
+              <w:bottom w:type="dxa" w:w="70"/>
+              <w:right w:type="dxa" w:w="90"/>
+            </w:tcMar>
+          </w:tcPr>
+          <w:p>
+            <w:r>
+              <w:rPr>
+                <w:rFonts w:ascii="Arial" w:cs="Arial" w:eastAsia="Arial" w:hAnsi="Arial"/>
+                <w:b w:val="false"/>
+                <w:bCs w:val="false"/>
+                <w:i w:val="false"/>
+                <w:iCs w:val="false"/>
+                <w:color w:val="4A4A4A"/>
+                <w:sz w:val="17"/>
+                <w:szCs w:val="17"/>
+              </w:rPr>
+              <w:t xml:space="preserve">Melón, octubre 2022</w:t>
+            </w:r>
+          </w:p>
+        </w:tc>
+      </w:tr>
+      <w:tr>
+        <w:tc>
+          <w:tcPr>
+            <w:tcW w:type="dxa" w:w="2560"/>
+            <w:shd w:fill="F5F2EC" w:color="auto" w:val="clear"/>
+            <w:tcMar>
+              <w:top w:type="dxa" w:w="70"/>
+              <w:left w:type="dxa" w:w="90"/>
+              <w:bottom w:type="dxa" w:w="70"/>
+              <w:right w:type="dxa" w:w="90"/>
+            </w:tcMar>
+          </w:tcPr>
+          <w:p>
+            <w:r>
+              <w:rPr>
+                <w:rFonts w:ascii="Arial" w:cs="Arial" w:eastAsia="Arial" w:hAnsi="Arial"/>
+                <w:b w:val="false"/>
+                <w:bCs w:val="false"/>
+                <w:i w:val="false"/>
+                <w:iCs w:val="false"/>
+                <w:color w:val="4A4A4A"/>
+                <w:sz w:val="17"/>
+                <w:szCs w:val="17"/>
+              </w:rPr>
+              <w:t xml:space="preserve">Nivel</w:t>
+            </w:r>
+          </w:p>
+        </w:tc>
+        <w:tc>
+          <w:tcPr>
+            <w:tcW w:type="dxa" w:w="4340"/>
+            <w:shd w:fill="F5F2EC" w:color="auto" w:val="clear"/>
+            <w:tcMar>
+              <w:top w:type="dxa" w:w="70"/>
+              <w:left w:type="dxa" w:w="90"/>
+              <w:bottom w:type="dxa" w:w="70"/>
+              <w:right w:type="dxa" w:w="90"/>
+            </w:tcMar>
+          </w:tcPr>
+          <w:p>
+            <w:r>
+              <w:rPr>
+                <w:rFonts w:ascii="Arial" w:cs="Arial" w:eastAsia="Arial" w:hAnsi="Arial"/>
+                <w:b w:val="false"/>
+                <w:bCs w:val="false"/>
+                <w:i w:val="false"/>
+                <w:iCs w:val="false"/>
+                <w:color w:val="4A4A4A"/>
+                <w:sz w:val="17"/>
+                <w:szCs w:val="17"/>
+              </w:rPr>
+              <w:t xml:space="preserve">NOG_FUNDACIONES, cota -0,20 m aprox. respecto de N1</w:t>
+            </w:r>
+          </w:p>
+        </w:tc>
+        <w:tc>
+          <w:tcPr>
+            <w:tcW w:type="dxa" w:w="2000"/>
+            <w:shd w:fill="F5F2EC" w:color="auto" w:val="clear"/>
+            <w:tcMar>
+              <w:top w:type="dxa" w:w="70"/>
+              <w:left w:type="dxa" w:w="90"/>
+              <w:bottom w:type="dxa" w:w="70"/>
+              <w:right w:type="dxa" w:w="90"/>
+            </w:tcMar>
+          </w:tcPr>
+          <w:p>
+            <w:r>
+              <w:rPr>
+                <w:rFonts w:ascii="Arial" w:cs="Arial" w:eastAsia="Arial" w:hAnsi="Arial"/>
+                <w:b w:val="false"/>
+                <w:bCs w:val="false"/>
+                <w:i w:val="false"/>
+                <w:iCs w:val="false"/>
+                <w:color w:val="4A4A4A"/>
+                <w:sz w:val="17"/>
+                <w:szCs w:val="17"/>
+              </w:rPr>
+              <w:t xml:space="preserve">Verificado en Revit</w:t>
+            </w:r>
+          </w:p>
+        </w:tc>
+      </w:tr>
+      <w:tr>
+        <w:tc>
+          <w:tcPr>
+            <w:tcW w:type="dxa" w:w="2560"/>
+            <w:shd w:fill="F5F2EC" w:color="auto" w:val="clear"/>
+            <w:tcMar>
+              <w:top w:type="dxa" w:w="70"/>
+              <w:left w:type="dxa" w:w="90"/>
+              <w:bottom w:type="dxa" w:w="70"/>
+              <w:right w:type="dxa" w:w="90"/>
+            </w:tcMar>
+          </w:tcPr>
+          <w:p>
+            <w:r>
+              <w:rPr>
+                <w:rFonts w:ascii="Arial" w:cs="Arial" w:eastAsia="Arial" w:hAnsi="Arial"/>
+                <w:b w:val="false"/>
+                <w:bCs w:val="false"/>
+                <w:i w:val="false"/>
+                <w:iCs w:val="false"/>
+                <w:color w:val="4A4A4A"/>
+                <w:sz w:val="17"/>
+                <w:szCs w:val="17"/>
+              </w:rPr>
+              <w:t xml:space="preserve">Diseño geotécnico</w:t>
+            </w:r>
+          </w:p>
+        </w:tc>
+        <w:tc>
+          <w:tcPr>
+            <w:tcW w:type="dxa" w:w="4340"/>
+            <w:shd w:fill="F5F2EC" w:color="auto" w:val="clear"/>
+            <w:tcMar>
+              <w:top w:type="dxa" w:w="70"/>
+              <w:left w:type="dxa" w:w="90"/>
+              <w:bottom w:type="dxa" w:w="70"/>
+              <w:right w:type="dxa" w:w="90"/>
+            </w:tcMar>
+          </w:tcPr>
+          <w:p>
+            <w:r>
+              <w:rPr>
+                <w:rFonts w:ascii="Arial" w:cs="Arial" w:eastAsia="Arial" w:hAnsi="Arial"/>
+                <w:b w:val="false"/>
+                <w:bCs w:val="false"/>
+                <w:i w:val="false"/>
+                <w:iCs w:val="false"/>
+                <w:color w:val="4A4A4A"/>
+                <w:sz w:val="17"/>
+                <w:szCs w:val="17"/>
+              </w:rPr>
+              <w:t xml:space="preserve">Sin estudio de mecánica de suelos ni memoria de cálculo de fundaciones — dimensión 60x60x50cm es un valor de anteproyecto, no dimensionado por especialista. Falta además el emplantillado (capa de nivelación bajo la zapata) — en fundaciones reales se especifica típicamente 10 cm de bolones sellados bajo la zapata; el modelo actual no lo incluye.</w:t>
+            </w:r>
+          </w:p>
+        </w:tc>
+        <w:tc>
+          <w:tcPr>
+            <w:tcW w:type="dxa" w:w="2000"/>
+            <w:shd w:fill="F5F2EC" w:color="auto" w:val="clear"/>
+            <w:tcMar>
+              <w:top w:type="dxa" w:w="70"/>
+              <w:left w:type="dxa" w:w="90"/>
+              <w:bottom w:type="dxa" w:w="70"/>
+              <w:right w:type="dxa" w:w="90"/>
+            </w:tcMar>
+          </w:tcPr>
+          <w:p>
+            <w:r>
+              <w:rPr>
+                <w:rFonts w:ascii="Arial" w:cs="Arial" w:eastAsia="Arial" w:hAnsi="Arial"/>
+                <w:b w:val="false"/>
+                <w:bCs w:val="false"/>
+                <w:i w:val="false"/>
+                <w:iCs w:val="false"/>
+                <w:color w:val="4A4A4A"/>
+                <w:sz w:val="17"/>
+                <w:szCs w:val="17"/>
+              </w:rPr>
+              <w:t xml:space="preserve">Pendiente de especialista</w:t>
+            </w:r>
+          </w:p>
+        </w:tc>
+      </w:tr>
+    </w:tbl>
+    <w:p>
+      <w:pPr>
+        <w:spacing w:after="140"/>
+      </w:pPr>
+      <w:r>
+        <w:rPr>
+          <w:rFonts w:ascii="Arial" w:cs="Arial" w:eastAsia="Arial" w:hAnsi="Arial"/>
+          <w:b w:val="false"/>
+          <w:bCs w:val="false"/>
+          <w:i/>
+          <w:iCs/>
+          <w:color w:val="4A4A4A"/>
+          <w:sz w:val="16"/>
+          <w:szCs w:val="16"/>
+        </w:rPr>
+        <w:t xml:space="preserve">Nota: la geometría de la zapata (60x60x50cm) es un valor de anteproyecto tomado de familia de catálogo, no el resultado de un cálculo geotécnico — no corresponde tratarla como dimensión definitiva de obra.</w:t>
+      </w:r>
+    </w:p>
+    <w:p>
+      <w:pPr>
+        <w:spacing w:before="400" w:after="80"/>
+        <w:pBdr>
+          <w:top w:val="single" w:color="171717" w:sz="6" w:space="8"/>
+        </w:pBdr>
+      </w:pPr>
+      <w:r>
+        <w:rPr>
+          <w:rFonts w:ascii="Arial" w:cs="Arial" w:eastAsia="Arial" w:hAnsi="Arial"/>
+          <w:b/>
+          <w:bCs/>
+          <w:i w:val="false"/>
+          <w:iCs w:val="false"/>
+          <w:color w:val="171717"/>
+          <w:sz w:val="18"/>
+          <w:szCs w:val="18"/>
+        </w:rPr>
+        <w:t xml:space="preserve">Matías Álvarez C.</w:t>
+      </w:r>
+    </w:p>
+    <w:p>
+      <w:pPr>
+        <w:spacing w:after="200"/>
+      </w:pPr>
+      <w:r>
+        <w:rPr>
+          <w:rFonts w:ascii="Arial" w:cs="Arial" w:eastAsia="Arial" w:hAnsi="Arial"/>
+          <w:b w:val="false"/>
+          <w:bCs w:val="false"/>
+          <w:i/>
+          <w:iCs/>
+          <w:color w:val="4A4A4A"/>
+          <w:sz w:val="16"/>
+          <w:szCs w:val="16"/>
+        </w:rPr>
+        <w:t xml:space="preserve">Responsable BIM / elaboración — Workshop BIM + IA, Método TBC. Documento de autoevaluación de anteproyecto; no constituye una especificación técnica firmada para permiso de edificación.</w:t>
+      </w:r>
+    </w:p>
     <w:sectPr>
       <w:pgSz w:w="11906" w:h="16838" w:orient="portrait"/>
       <w:pgMar w:top="900" w:right="1446" w:bottom="900" w:left="1446" w:header="708" w:footer="708" w:gutter="0"/>
@@ -2560,11 +6606,7 @@
 </w:document>
 </file>
 
-<file path=word/comments.xml><?xml version="1.0" encoding="utf-8"?>
-<w:comments xmlns:cx="http://schemas.microsoft.com/office/drawing/2014/chartex" xmlns:cx1="http://schemas.microsoft.com/office/drawing/2015/9/8/chartex" xmlns:cx2="http://schemas.microsoft.com/office/drawing/2015/10/21/chartex" xmlns:cx3="http://schemas.microsoft.com/office/drawing/2016/5/9/chartex" xmlns:cx4="http://schemas.microsoft.com/office/drawing/2016/5/10/chartex" xmlns:cx5="http://schemas.microsoft.com/office/drawing/2016/5/11/chartex" xmlns:cx6="http://schemas.microsoft.com/office/drawing/2016/5/12/chartex" xmlns:cx7="http://schemas.microsoft.com/office/drawing/2016/5/13/chartex" xmlns:cx8="http://schemas.microsoft.com/office/drawing/2016/5/14/chartex" xmlns:mc="http://schemas.openxmlformats.org/markup-compatibility/2006" xmlns:aink="http://schemas.microsoft.com/office/drawing/2016/ink" xmlns:am3d="http://schemas.microsoft.com/office/drawing/2017/model3d" xmlns:o="urn:schemas-microsoft-com:office:office" xmlns:r="http://schemas.openxmlformats.org/officeDocument/2006/relationships" xmlns:m="http://schemas.openxmlformats.org/officeDocument/2006/math" xmlns:v="urn:schemas-microsoft-com:vml" xmlns:wp14="http://schemas.microsoft.com/office/word/2010/wordprocessingDrawing" xmlns:wp="http://schemas.openxmlformats.org/drawingml/2006/wordprocessingDrawing" xmlns:w10="urn:schemas-microsoft-com:office:word" xmlns:w="http://schemas.openxmlformats.org/wordprocessingml/2006/main" xmlns:w14="http://schemas.microsoft.com/office/word/2010/wordml" xmlns:w15="http://schemas.microsoft.com/office/word/2012/wordml" xmlns:w16cex="http://schemas.microsoft.com/office/word/2018/wordml/cex" xmlns:w16cid="http://schemas.microsoft.com/office/word/2016/wordml/cid" xmlns:w16="http://schemas.microsoft.com/office/word/2018/wordml" xmlns:w16sdtdh="http://schemas.microsoft.com/office/word/2020/wordml/sdtdatahash" xmlns:w16se="http://schemas.microsoft.com/office/word/2015/wordml/symex" xmlns:wpg="http://schemas.microsoft.com/office/word/2010/wordprocessingGroup" xmlns:wpi="http://schemas.microsoft.com/office/word/2010/wordprocessingInk" xmlns:wne="http://schemas.microsoft.com/office/word/2006/wordml" xmlns:wps="http://schemas.microsoft.com/office/word/2010/wordprocessingShape"/>
-</file>
-
-<file path=word/endnotes.xml><?xml version="1.0" encoding="utf-8"?>
+<file path=word\endnotes.xml><?xml version="1.0" encoding="utf-8"?>
 <w:endnotes xmlns:wpc="http://schemas.microsoft.com/office/word/2010/wordprocessingCanvas" xmlns:mc="http://schemas.openxmlformats.org/markup-compatibility/2006" xmlns:o="urn:schemas-microsoft-com:office:office" xmlns:r="http://schemas.openxmlformats.org/officeDocument/2006/relationships" xmlns:m="http://schemas.openxmlformats.org/officeDocument/2006/math" xmlns:v="urn:schemas-microsoft-com:vml" xmlns:wp14="http://schemas.microsoft.com/office/word/2010/wordprocessingDrawing" xmlns:wp="http://schemas.openxmlformats.org/drawingml/2006/wordprocessingDrawing" xmlns:w10="urn:schemas-microsoft-com:office:word" xmlns:w="http://schemas.openxmlformats.org/wordprocessingml/2006/main" xmlns:w14="http://schemas.microsoft.com/office/word/2010/wordml" xmlns:w15="http://schemas.microsoft.com/office/word/2012/wordml" xmlns:wpg="http://schemas.microsoft.com/office/word/2010/wordprocessingGroup" xmlns:wpi="http://schemas.microsoft.com/office/word/2010/wordprocessingInk" xmlns:wne="http://schemas.microsoft.com/office/word/2006/wordml" xmlns:wps="http://schemas.microsoft.com/office/word/2010/wordprocessingShape" mc:Ignorable="w14 w15 wp14">
   <w:endnote w:type="separator" w:id="-1">
     <w:p>
@@ -2601,7 +6643,11 @@
 </w:endnotes>
 </file>
 
-<file path=word/footnotes.xml><?xml version="1.0" encoding="utf-8"?>
+<file path=word\fontTable.xml><?xml version="1.0" encoding="utf-8"?>
+<w:fonts xmlns:mc="http://schemas.openxmlformats.org/markup-compatibility/2006" xmlns:r="http://schemas.openxmlformats.org/officeDocument/2006/relationships" xmlns:w="http://schemas.openxmlformats.org/wordprocessingml/2006/main" xmlns:w14="http://schemas.microsoft.com/office/word/2010/wordml" xmlns:w15="http://schemas.microsoft.com/office/word/2012/wordml" xmlns:w16cex="http://schemas.microsoft.com/office/word/2018/wordml/cex" xmlns:w16cid="http://schemas.microsoft.com/office/word/2016/wordml/cid" xmlns:w16="http://schemas.microsoft.com/office/word/2018/wordml" xmlns:w16sdtdh="http://schemas.microsoft.com/office/word/2020/wordml/sdtdatahash" xmlns:w16se="http://schemas.microsoft.com/office/word/2015/wordml/symex" mc:Ignorable="w14 w15 w16se w16cid w16 w16cex w16sdtdh"/>
+</file>
+
+<file path=word\footnotes.xml><?xml version="1.0" encoding="utf-8"?>
 <w:footnotes xmlns:wpc="http://schemas.microsoft.com/office/word/2010/wordprocessingCanvas" xmlns:mc="http://schemas.openxmlformats.org/markup-compatibility/2006" xmlns:o="urn:schemas-microsoft-com:office:office" xmlns:r="http://schemas.openxmlformats.org/officeDocument/2006/relationships" xmlns:m="http://schemas.openxmlformats.org/officeDocument/2006/math" xmlns:v="urn:schemas-microsoft-com:vml" xmlns:wp14="http://schemas.microsoft.com/office/word/2010/wordprocessingDrawing" xmlns:wp="http://schemas.openxmlformats.org/drawingml/2006/wordprocessingDrawing" xmlns:w10="urn:schemas-microsoft-com:office:word" xmlns:w="http://schemas.openxmlformats.org/wordprocessingml/2006/main" xmlns:w14="http://schemas.microsoft.com/office/word/2010/wordml" xmlns:w15="http://schemas.microsoft.com/office/word/2012/wordml" xmlns:wpg="http://schemas.microsoft.com/office/word/2010/wordprocessingGroup" xmlns:wpi="http://schemas.microsoft.com/office/word/2010/wordprocessingInk" xmlns:wne="http://schemas.microsoft.com/office/word/2006/wordml" xmlns:wps="http://schemas.microsoft.com/office/word/2010/wordprocessingShape" mc:Ignorable="w14 w15 wp14">
   <w:footnote w:type="separator" w:id="-1">
     <w:p>
@@ -2638,7 +6684,7 @@
 </w:footnotes>
 </file>
 
-<file path=word/numbering.xml><?xml version="1.0" encoding="utf-8"?>
+<file path=word\numbering.xml><?xml version="1.0" encoding="utf-8"?>
 <w:numbering xmlns:wpc="http://schemas.microsoft.com/office/word/2010/wordprocessingCanvas" xmlns:mc="http://schemas.openxmlformats.org/markup-compatibility/2006" xmlns:o="urn:schemas-microsoft-com:office:office" xmlns:r="http://schemas.openxmlformats.org/officeDocument/2006/relationships" xmlns:m="http://schemas.openxmlformats.org/officeDocument/2006/math" xmlns:v="urn:schemas-microsoft-com:vml" xmlns:wp14="http://schemas.microsoft.com/office/word/2010/wordprocessingDrawing" xmlns:wp="http://schemas.openxmlformats.org/drawingml/2006/wordprocessingDrawing" xmlns:w10="urn:schemas-microsoft-com:office:word" xmlns:w="http://schemas.openxmlformats.org/wordprocessingml/2006/main" xmlns:w14="http://schemas.microsoft.com/office/word/2010/wordml" xmlns:w15="http://schemas.microsoft.com/office/word/2012/wordml" xmlns:wpg="http://schemas.microsoft.com/office/word/2010/wordprocessingGroup" xmlns:wpi="http://schemas.microsoft.com/office/word/2010/wordprocessingInk" xmlns:wne="http://schemas.microsoft.com/office/word/2006/wordml" xmlns:wps="http://schemas.microsoft.com/office/word/2010/wordprocessingShape" mc:Ignorable="w14 w15 wp14">
   <w:abstractNum w:abstractNumId="1" w15:restartNumberingAfterBreak="0">
     <w:multiLevelType w:val="hybridMultilevel"/>
@@ -2733,7 +6779,17 @@
 </w:numbering>
 </file>
 
-<file path=word/styles.xml><?xml version="1.0" encoding="utf-8"?>
+<file path=word\settings.xml><?xml version="1.0" encoding="utf-8"?>
+<w:settings xmlns:wpc="http://schemas.microsoft.com/office/word/2010/wordprocessingCanvas" xmlns:mc="http://schemas.openxmlformats.org/markup-compatibility/2006" xmlns:o="urn:schemas-microsoft-com:office:office" xmlns:r="http://schemas.openxmlformats.org/officeDocument/2006/relationships" xmlns:m="http://schemas.openxmlformats.org/officeDocument/2006/math" xmlns:v="urn:schemas-microsoft-com:vml" xmlns:wp14="http://schemas.microsoft.com/office/word/2010/wordprocessingDrawing" xmlns:wp="http://schemas.openxmlformats.org/drawingml/2006/wordprocessingDrawing" xmlns:w10="urn:schemas-microsoft-com:office:word" xmlns:w="http://schemas.openxmlformats.org/wordprocessingml/2006/main" xmlns:w14="http://schemas.microsoft.com/office/word/2010/wordml" xmlns:w15="http://schemas.microsoft.com/office/word/2012/wordml" xmlns:wpg="http://schemas.microsoft.com/office/word/2010/wordprocessingGroup" xmlns:wpi="http://schemas.microsoft.com/office/word/2010/wordprocessingInk" xmlns:wne="http://schemas.microsoft.com/office/word/2006/wordml" xmlns:wps="http://schemas.microsoft.com/office/word/2010/wordprocessingShape" mc:Ignorable="w14 w15 wp14">
+  <w:displayBackgroundShape/>
+  <w:evenAndOddHeaders w:val="false"/>
+  <w:compat>
+    <w:compatSetting w:val="15" w:name="compatibilityMode" w:uri="http://schemas.microsoft.com/office/word"/>
+  </w:compat>
+</w:settings>
+</file>
+
+<file path=word\styles.xml><?xml version="1.0" encoding="utf-8"?>
 <w:styles xmlns:mc="http://schemas.openxmlformats.org/markup-compatibility/2006" xmlns:r="http://schemas.openxmlformats.org/officeDocument/2006/relationships" xmlns:w="http://schemas.openxmlformats.org/wordprocessingml/2006/main" xmlns:w14="http://schemas.microsoft.com/office/word/2010/wordml" xmlns:w15="http://schemas.microsoft.com/office/word/2012/wordml" mc:Ignorable="w14 w15">
   <w:docDefaults>
     <w:rPrDefault/>

</xml_diff>

<commit_message>
Sincronizar web y documentos con el modelo del 30-09 (cimentacion)
- IFC4X3_ADD2 re-exportado: ahora incluye las 16 zapatas (IfcFooting).
- Cifras de la seccion 08 al dia: 7 262 elementos, 56 familias, 71 categorias.
- Especificacion Tecnica: material del pilar (MT_PINO RADIATA) y paneles de
  muro cortina como "Empty" sin material.
- Tabla NDI v7 (reemplaza v6): agrega Cimentacion estructural, armazon 2X4 x16,
  material del pilar, paneles Empty, nivel/departamento de habitaciones.
- PEB completado (xlsx/pdf): mismas correcciones, nueva fila de cimentacion.
- Texto de paneles en tarjeta de materialidad y proveedores alineado al modelo.

Co-Authored-By: Claude Sonnet 5.5 <noreply@anthropic.com>
</commit_message>
<xml_diff>
--- a/03_Documentos_Tecnicos/Especificacion_Tecnica_Pausa_Maule.docx
+++ b/03_Documentos_Tecnicos/Especificacion_Tecnica_Pausa_Maule.docx
@@ -5273,7 +5273,7 @@
                 <w:sz w:val="17"/>
                 <w:szCs w:val="17"/>
               </w:rPr>
-              <w:t>Ficha Hilam MLE (MLE_FICHA-TECNICA_VIGAS-DIMENSIONADAS-ESTANDAR.pdf): glulam Pino Radiata MLE 20c, NCh2148/NCh2165. El ancho 130mm existe en catálogo (130×270, 130×420); la sección cuadrada 130×130 no es estándar de catálogo — ver nota abajo. Material: MT_MADERA LAMINADA DIMENSIONADA.</w:t>
+              <w:t>Ficha Hilam MLE (MLE_FICHA-TECNICA_VIGAS-DIMENSIONADAS-ESTANDAR.pdf): glulam Pino Radiata MLE 20c, NCh2148/NCh2165. El ancho 130mm existe en catálogo (130×270, 130×420); la sección cuadrada 130×130 no es estándar de catálogo — ver nota abajo. Material en el modelo: MT_PINO RADIATA (unificado con el armazón el 30-09-2026; la ficha Hilam MLE corresponde a un producto glulam).</w:t>
             </w:r>
           </w:p>
         </w:tc>
@@ -5460,7 +5460,7 @@
           <w:sz w:val="16"/>
           <w:szCs w:val="16"/>
         </w:rPr>
-        <w:t>El ancho de 130mm es un módulo estándar del catálogo Hilam MLE (secciones 130×270 y 130×420 en la ficha MLE_FICHA-TECNICA_VIGAS-DIMENSIONADAS-ESTANDAR.pdf); la sección cuadrada 130×130 no figura como opción de catálogo estándar. Material y línea de producto: glulam Pino Radiata MLE 20c, NCh2148/NCh2165, consistente con MT_MADERA LAMINADA DIMENSIONADA. Recomendación: confirmar con el proveedor si 130×130 es una sección especial de pedido o ajustar el modelo a 130×270/130×420 de catálogo.</w:t>
+        <w:t>El ancho de 130mm es un módulo estándar del catálogo Hilam MLE (secciones 130×270 y 130×420 en la ficha MLE_FICHA-TECNICA_VIGAS-DIMENSIONADAS-ESTANDAR.pdf); la sección cuadrada 130×130 no figura como opción de catálogo estándar. Línea de producto de referencia: glulam Pino Radiata MLE 20c, NCh2148/NCh2165. El modelo asigna MT_PINO RADIATA al pilar (decisión de proyecto del 30-09-2026), por lo que el material del modelo ya no distingue glulam de madera aserrada. Recomendación: confirmar con el proveedor si 130×130 es una sección especial de pedido o ajustar el modelo a 130×270/130×420 de catálogo.</w:t>
       </w:r>
     </w:p>
     <w:p>
@@ -5666,7 +5666,7 @@
                 <w:sz w:val="17"/>
                 <w:szCs w:val="17"/>
               </w:rPr>
-              <w:t>Arauco, MSD Revestimiento Machihembrado: perfil de Pino Radiata cepillado, madera seca en camara (~15% humedad), para revestimiento de muros. Material: MT_PINO RADIATA.</w:t>
+              <w:t>Tipo "Empty" (familia de sistema Empty System Panel), 192 unidades, sin material: espacio libre intencional (celosía) entre los montantes de madera, por lo que no aplica ficha de material. Ficha de referencia, no asignada: Arauco, MSD Revestimiento Machihembrado.</w:t>
             </w:r>
           </w:p>
         </w:tc>

</xml_diff>